<commit_message>
Update to metamodel version 17.1
</commit_message>
<xml_diff>
--- a/src/reference.docx
+++ b/src/reference.docx
@@ -1,10 +1,10 @@
 
 <file path=word/document.xml><?xml version="1.0" encoding="utf-8"?>
-<w:document xmlns:wpc="http://schemas.microsoft.com/office/word/2010/wordprocessingCanvas" xmlns:cx="http://schemas.microsoft.com/office/drawing/2014/chartex" xmlns:cx1="http://schemas.microsoft.com/office/drawing/2015/9/8/chartex" xmlns:cx2="http://schemas.microsoft.com/office/drawing/2015/10/21/chartex" xmlns:cx3="http://schemas.microsoft.com/office/drawing/2016/5/9/chartex" xmlns:cx4="http://schemas.microsoft.com/office/drawing/2016/5/10/chartex" xmlns:cx5="http://schemas.microsoft.com/office/drawing/2016/5/11/chartex" xmlns:cx6="http://schemas.microsoft.com/office/drawing/2016/5/12/chartex" xmlns:cx7="http://schemas.microsoft.com/office/drawing/2016/5/13/chartex" xmlns:cx8="http://schemas.microsoft.com/office/drawing/2016/5/14/chartex" xmlns:mc="http://schemas.openxmlformats.org/markup-compatibility/2006" xmlns:aink="http://schemas.microsoft.com/office/drawing/2016/ink" xmlns:am3d="http://schemas.microsoft.com/office/drawing/2017/model3d" xmlns:o="urn:schemas-microsoft-com:office:office" xmlns:r="http://schemas.openxmlformats.org/officeDocument/2006/relationships" xmlns:m="http://schemas.openxmlformats.org/officeDocument/2006/math" xmlns:v="urn:schemas-microsoft-com:vml" xmlns:wp14="http://schemas.microsoft.com/office/word/2010/wordprocessingDrawing" xmlns:wp="http://schemas.openxmlformats.org/drawingml/2006/wordprocessingDrawing" xmlns:w10="urn:schemas-microsoft-com:office:word" xmlns:w="http://schemas.openxmlformats.org/wordprocessingml/2006/main" xmlns:w14="http://schemas.microsoft.com/office/word/2010/wordml" xmlns:w15="http://schemas.microsoft.com/office/word/2012/wordml" xmlns:w16cex="http://schemas.microsoft.com/office/word/2018/wordml/cex" xmlns:w16cid="http://schemas.microsoft.com/office/word/2016/wordml/cid" xmlns:w16="http://schemas.microsoft.com/office/word/2018/wordml" xmlns:w16se="http://schemas.microsoft.com/office/word/2015/wordml/symex" xmlns:wpg="http://schemas.microsoft.com/office/word/2010/wordprocessingGroup" xmlns:wpi="http://schemas.microsoft.com/office/word/2010/wordprocessingInk" xmlns:wne="http://schemas.microsoft.com/office/word/2006/wordml" xmlns:wps="http://schemas.microsoft.com/office/word/2010/wordprocessingShape" mc:Ignorable="w14 w15 w16se w16cid w16 w16cex wp14">
+<w:document xmlns:wpc="http://schemas.microsoft.com/office/word/2010/wordprocessingCanvas" xmlns:cx="http://schemas.microsoft.com/office/drawing/2014/chartex" xmlns:cx1="http://schemas.microsoft.com/office/drawing/2015/9/8/chartex" xmlns:cx2="http://schemas.microsoft.com/office/drawing/2015/10/21/chartex" xmlns:cx3="http://schemas.microsoft.com/office/drawing/2016/5/9/chartex" xmlns:cx4="http://schemas.microsoft.com/office/drawing/2016/5/10/chartex" xmlns:cx5="http://schemas.microsoft.com/office/drawing/2016/5/11/chartex" xmlns:cx6="http://schemas.microsoft.com/office/drawing/2016/5/12/chartex" xmlns:cx7="http://schemas.microsoft.com/office/drawing/2016/5/13/chartex" xmlns:cx8="http://schemas.microsoft.com/office/drawing/2016/5/14/chartex" xmlns:mc="http://schemas.openxmlformats.org/markup-compatibility/2006" xmlns:aink="http://schemas.microsoft.com/office/drawing/2016/ink" xmlns:am3d="http://schemas.microsoft.com/office/drawing/2017/model3d" xmlns:o="urn:schemas-microsoft-com:office:office" xmlns:oel="http://schemas.microsoft.com/office/2019/extlst" xmlns:r="http://schemas.openxmlformats.org/officeDocument/2006/relationships" xmlns:m="http://schemas.openxmlformats.org/officeDocument/2006/math" xmlns:v="urn:schemas-microsoft-com:vml" xmlns:wp14="http://schemas.microsoft.com/office/word/2010/wordprocessingDrawing" xmlns:wp="http://schemas.openxmlformats.org/drawingml/2006/wordprocessingDrawing" xmlns:w10="urn:schemas-microsoft-com:office:word" xmlns:w="http://schemas.openxmlformats.org/wordprocessingml/2006/main" xmlns:w14="http://schemas.microsoft.com/office/word/2010/wordml" xmlns:w15="http://schemas.microsoft.com/office/word/2012/wordml" xmlns:w16cex="http://schemas.microsoft.com/office/word/2018/wordml/cex" xmlns:w16cid="http://schemas.microsoft.com/office/word/2016/wordml/cid" xmlns:w16="http://schemas.microsoft.com/office/word/2018/wordml" xmlns:w16du="http://schemas.microsoft.com/office/word/2023/wordml/word16du" xmlns:w16sdtdh="http://schemas.microsoft.com/office/word/2020/wordml/sdtdatahash" xmlns:w16sdtfl="http://schemas.microsoft.com/office/word/2024/wordml/sdtformatlock" xmlns:w16se="http://schemas.microsoft.com/office/word/2015/wordml/symex" xmlns:wpg="http://schemas.microsoft.com/office/word/2010/wordprocessingGroup" xmlns:wpi="http://schemas.microsoft.com/office/word/2010/wordprocessingInk" xmlns:wne="http://schemas.microsoft.com/office/word/2006/wordml" xmlns:wps="http://schemas.microsoft.com/office/word/2010/wordprocessingShape" mc:Ignorable="w14 w15 w16se w16cid w16 w16cex w16sdtdh w16sdtfl w16du wp14">
   <w:body>
     <w:p>
       <w:pPr>
-        <w:pStyle w:val="Nzev"/>
+        <w:pStyle w:val="Title"/>
       </w:pPr>
       <w:r>
         <w:t>Project name</w:t>
@@ -73,10 +73,10 @@
             <w:r>
               <w:t>Albert Einstein (</w:t>
             </w:r>
-            <w:hyperlink r:id="rId7">
+            <w:hyperlink r:id="rId8">
               <w:r>
                 <w:rPr>
-                  <w:rStyle w:val="Hypertextovodkaz"/>
+                  <w:rStyle w:val="Hyperlink"/>
                 </w:rPr>
                 <w:t>albert.einstein@example.com</w:t>
               </w:r>
@@ -188,7 +188,7 @@
     </w:p>
     <w:p>
       <w:pPr>
-        <w:pStyle w:val="Nadpis3"/>
+        <w:pStyle w:val="Heading3"/>
       </w:pPr>
       <w:bookmarkStart w:id="0" w:name="summary"/>
       <w:r>
@@ -198,7 +198,7 @@
     </w:p>
     <w:p>
       <w:pPr>
-        <w:pStyle w:val="Nadpis4"/>
+        <w:pStyle w:val="Heading4"/>
       </w:pPr>
       <w:bookmarkStart w:id="1" w:name="answered-indication"/>
       <w:r>
@@ -301,7 +301,7 @@
     </w:tbl>
     <w:p>
       <w:pPr>
-        <w:pStyle w:val="Nadpis4"/>
+        <w:pStyle w:val="Heading4"/>
       </w:pPr>
       <w:bookmarkStart w:id="2" w:name="metrics"/>
       <w:bookmarkEnd w:id="1"/>
@@ -529,7 +529,7 @@
     </w:p>
     <w:p>
       <w:pPr>
-        <w:pStyle w:val="Nadpis1"/>
+        <w:pStyle w:val="Heading1"/>
       </w:pPr>
       <w:bookmarkStart w:id="3" w:name="i.-administrative-information"/>
       <w:r>
@@ -539,7 +539,7 @@
     </w:p>
     <w:p>
       <w:pPr>
-        <w:pStyle w:val="Nadpis3"/>
+        <w:pStyle w:val="Heading3"/>
       </w:pPr>
       <w:bookmarkStart w:id="4" w:name="summary-1"/>
       <w:r>
@@ -548,7 +548,7 @@
     </w:p>
     <w:p>
       <w:pPr>
-        <w:pStyle w:val="Nadpis4"/>
+        <w:pStyle w:val="Heading4"/>
       </w:pPr>
       <w:bookmarkStart w:id="5" w:name="answered-indication-1"/>
       <w:r>
@@ -651,7 +651,7 @@
     </w:tbl>
     <w:p>
       <w:pPr>
-        <w:pStyle w:val="Nadpis4"/>
+        <w:pStyle w:val="Heading4"/>
       </w:pPr>
       <w:bookmarkStart w:id="6" w:name="contributors"/>
       <w:bookmarkEnd w:id="4"/>
@@ -707,7 +707,7 @@
     </w:p>
     <w:p>
       <w:pPr>
-        <w:pStyle w:val="Zkladntext"/>
+        <w:pStyle w:val="BodyText"/>
       </w:pPr>
       <w:r>
         <w:t>Each person contributing to creating or executing the data management plan should be added as a contributor. A project probably should have a Contact Person, and a Data Curator.</w:t>
@@ -715,7 +715,7 @@
     </w:p>
     <w:p>
       <w:pPr>
-        <w:pStyle w:val="Nadpis4"/>
+        <w:pStyle w:val="Heading4"/>
       </w:pPr>
       <w:bookmarkStart w:id="7" w:name="answers-1-items"/>
       <w:bookmarkEnd w:id="6"/>
@@ -725,7 +725,7 @@
     </w:p>
     <w:p>
       <w:pPr>
-        <w:pStyle w:val="Nadpis4"/>
+        <w:pStyle w:val="Heading4"/>
       </w:pPr>
       <w:bookmarkStart w:id="8" w:name="a.1.-name"/>
       <w:bookmarkStart w:id="9" w:name="Xc16d4597e430a2ddbe2787ed419925ec83f4c3c"/>
@@ -781,7 +781,7 @@
     </w:p>
     <w:p>
       <w:pPr>
-        <w:pStyle w:val="Zkladntext"/>
+        <w:pStyle w:val="BodyText"/>
       </w:pPr>
       <w:r>
         <w:t>✔️ Marek Suchánek</w:t>
@@ -789,7 +789,7 @@
     </w:p>
     <w:p>
       <w:pPr>
-        <w:pStyle w:val="Nadpis4"/>
+        <w:pStyle w:val="Heading4"/>
       </w:pPr>
       <w:bookmarkStart w:id="10" w:name="a.2.-e-mail-address"/>
       <w:bookmarkEnd w:id="8"/>
@@ -844,7 +844,7 @@
     </w:p>
     <w:p>
       <w:pPr>
-        <w:pStyle w:val="Zkladntext"/>
+        <w:pStyle w:val="BodyText"/>
       </w:pPr>
       <w:r>
         <w:t>✔️ marek.suchanek@ds-wizard.org</w:t>
@@ -852,7 +852,7 @@
     </w:p>
     <w:p>
       <w:pPr>
-        <w:pStyle w:val="Nadpis4"/>
+        <w:pStyle w:val="Heading4"/>
       </w:pPr>
       <w:bookmarkStart w:id="11" w:name="a.3.-orcid-identifier"/>
       <w:bookmarkEnd w:id="10"/>
@@ -907,7 +907,7 @@
     </w:p>
     <w:p>
       <w:pPr>
-        <w:pStyle w:val="Zkladntext"/>
+        <w:pStyle w:val="BodyText"/>
       </w:pPr>
       <w:r>
         <w:t xml:space="preserve">❗ </w:t>
@@ -922,7 +922,7 @@
     </w:p>
     <w:p>
       <w:pPr>
-        <w:pStyle w:val="Nadpis4"/>
+        <w:pStyle w:val="Heading4"/>
       </w:pPr>
       <w:bookmarkStart w:id="12" w:name="a.5.-role"/>
       <w:bookmarkEnd w:id="11"/>
@@ -977,15 +977,15 @@
     </w:p>
     <w:p>
       <w:pPr>
-        <w:pStyle w:val="Zkladntext"/>
+        <w:pStyle w:val="BodyText"/>
       </w:pPr>
       <w:r>
         <w:t xml:space="preserve">Roles in a project should be given as they are defined by </w:t>
       </w:r>
-      <w:hyperlink r:id="rId8">
+      <w:hyperlink r:id="rId9">
         <w:r>
           <w:rPr>
-            <w:rStyle w:val="Hypertextovodkaz"/>
+            <w:rStyle w:val="Hyperlink"/>
           </w:rPr>
           <w:t>datacite</w:t>
         </w:r>
@@ -996,7 +996,7 @@
     </w:p>
     <w:p>
       <w:pPr>
-        <w:pStyle w:val="Zkladntext"/>
+        <w:pStyle w:val="BodyText"/>
       </w:pPr>
       <w:r>
         <w:t>You should specify at least one "Contact Person". If your project has a work package for data management, identify the leader of that work package as "Data Curator".</w:t>
@@ -1004,7 +1004,7 @@
     </w:p>
     <w:p>
       <w:pPr>
-        <w:pStyle w:val="Zkladntext"/>
+        <w:pStyle w:val="BodyText"/>
       </w:pPr>
       <w:r>
         <w:rPr>
@@ -1024,7 +1024,7 @@
     </w:p>
     <w:p>
       <w:pPr>
-        <w:pStyle w:val="Nadpis1"/>
+        <w:pStyle w:val="Heading1"/>
       </w:pPr>
       <w:bookmarkStart w:id="13" w:name="ii.-re-using-data"/>
       <w:r>
@@ -1042,7 +1042,7 @@
     </w:p>
     <w:p>
       <w:pPr>
-        <w:pStyle w:val="Zkladntext"/>
+        <w:pStyle w:val="BodyText"/>
       </w:pPr>
       <w:r>
         <w:t>It is not because we can generate massive amounts of data that we always need to do so. Creating data with public money is bringing with it the responsibility to treat those data well and (if potentially useful) make them available for re-use by others. And the circle is only complete if such data is actually re-used.</w:t>
@@ -1050,7 +1050,7 @@
     </w:p>
     <w:p>
       <w:pPr>
-        <w:pStyle w:val="Nadpis3"/>
+        <w:pStyle w:val="Heading3"/>
       </w:pPr>
       <w:bookmarkStart w:id="14" w:name="summary-2"/>
       <w:r>
@@ -1059,7 +1059,7 @@
     </w:p>
     <w:p>
       <w:pPr>
-        <w:pStyle w:val="Nadpis4"/>
+        <w:pStyle w:val="Heading4"/>
       </w:pPr>
       <w:bookmarkStart w:id="15" w:name="answered-indication-2"/>
       <w:r>
@@ -1162,7 +1162,7 @@
     </w:tbl>
     <w:p>
       <w:pPr>
-        <w:pStyle w:val="Nadpis4"/>
+        <w:pStyle w:val="Heading4"/>
       </w:pPr>
       <w:bookmarkStart w:id="16" w:name="is-there-any-pre-existing-data"/>
       <w:bookmarkEnd w:id="14"/>
@@ -1218,7 +1218,7 @@
     </w:p>
     <w:p>
       <w:pPr>
-        <w:pStyle w:val="Zkladntext"/>
+        <w:pStyle w:val="BodyText"/>
       </w:pPr>
       <w:r>
         <w:t xml:space="preserve">📖 </w:t>
@@ -1233,10 +1233,10 @@
       <w:r>
         <w:t xml:space="preserve"> </w:t>
       </w:r>
-      <w:hyperlink r:id="rId9">
+      <w:hyperlink r:id="rId10">
         <w:r>
           <w:rPr>
-            <w:rStyle w:val="Hypertextovodkaz"/>
+            <w:rStyle w:val="Hyperlink"/>
             <w:i/>
             <w:iCs/>
           </w:rPr>
@@ -1246,7 +1246,7 @@
     </w:p>
     <w:p>
       <w:pPr>
-        <w:pStyle w:val="Zkladntext"/>
+        <w:pStyle w:val="BodyText"/>
       </w:pPr>
       <w:r>
         <w:t xml:space="preserve">🔗 </w:t>
@@ -1261,10 +1261,10 @@
       <w:r>
         <w:t xml:space="preserve"> </w:t>
       </w:r>
-      <w:hyperlink r:id="rId10">
+      <w:hyperlink r:id="rId11">
         <w:r>
           <w:rPr>
-            <w:rStyle w:val="Hypertextovodkaz"/>
+            <w:rStyle w:val="Hyperlink"/>
             <w:i/>
             <w:iCs/>
           </w:rPr>
@@ -1274,10 +1274,10 @@
       <w:r>
         <w:t xml:space="preserve">, </w:t>
       </w:r>
-      <w:hyperlink r:id="rId11">
+      <w:hyperlink r:id="rId12">
         <w:r>
           <w:rPr>
-            <w:rStyle w:val="Hypertextovodkaz"/>
+            <w:rStyle w:val="Hyperlink"/>
             <w:i/>
             <w:iCs/>
           </w:rPr>
@@ -1287,7 +1287,7 @@
     </w:p>
     <w:p>
       <w:pPr>
-        <w:pStyle w:val="Zkladntext"/>
+        <w:pStyle w:val="BodyText"/>
       </w:pPr>
       <w:r>
         <w:t>Are there any data sets available in the world that are relevant to your planned research?</w:t>
@@ -1295,7 +1295,7 @@
     </w:p>
     <w:p>
       <w:pPr>
-        <w:pStyle w:val="Zkladntext"/>
+        <w:pStyle w:val="BodyText"/>
       </w:pPr>
       <w:r>
         <w:t>✔️ b. Yes</w:t>
@@ -1303,7 +1303,7 @@
     </w:p>
     <w:p>
       <w:pPr>
-        <w:pStyle w:val="Nadpis4"/>
+        <w:pStyle w:val="Heading4"/>
       </w:pPr>
       <w:bookmarkStart w:id="17" w:name="X584b10d6c8a4d0b4c4067a6aa4bd5b8ae80fae4"/>
       <w:r>
@@ -1357,7 +1357,7 @@
     </w:p>
     <w:p>
       <w:pPr>
-        <w:pStyle w:val="Zkladntext"/>
+        <w:pStyle w:val="BodyText"/>
       </w:pPr>
       <w:r>
         <w:t xml:space="preserve">📖 </w:t>
@@ -1372,10 +1372,10 @@
       <w:r>
         <w:t xml:space="preserve"> </w:t>
       </w:r>
-      <w:hyperlink r:id="rId12">
+      <w:hyperlink r:id="rId13">
         <w:r>
           <w:rPr>
-            <w:rStyle w:val="Hypertextovodkaz"/>
+            <w:rStyle w:val="Hyperlink"/>
             <w:i/>
             <w:iCs/>
           </w:rPr>
@@ -1385,7 +1385,7 @@
     </w:p>
     <w:p>
       <w:pPr>
-        <w:pStyle w:val="Zkladntext"/>
+        <w:pStyle w:val="BodyText"/>
       </w:pPr>
       <w:r>
         <w:t>Will you be referring to any earlier measured data, reference data, or data that should be mined from existing literature? Your own data as well as data from others?</w:t>
@@ -1393,7 +1393,7 @@
     </w:p>
     <w:p>
       <w:pPr>
-        <w:pStyle w:val="Zkladntext"/>
+        <w:pStyle w:val="BodyText"/>
       </w:pPr>
       <w:r>
         <w:t>✔️ b. Yes</w:t>
@@ -1401,7 +1401,7 @@
     </w:p>
     <w:p>
       <w:pPr>
-        <w:pStyle w:val="Nadpis4"/>
+        <w:pStyle w:val="Heading4"/>
       </w:pPr>
       <w:bookmarkStart w:id="18" w:name="X375fd2279f5b9d536cf7822822a27bfb06b6447"/>
       <w:r>
@@ -1445,7 +1445,7 @@
     </w:p>
     <w:p>
       <w:pPr>
-        <w:pStyle w:val="Zkladntext"/>
+        <w:pStyle w:val="BodyText"/>
       </w:pPr>
       <w:r>
         <w:t xml:space="preserve">📖 </w:t>
@@ -1460,10 +1460,10 @@
       <w:r>
         <w:t xml:space="preserve"> </w:t>
       </w:r>
-      <w:hyperlink r:id="rId13">
+      <w:hyperlink r:id="rId14">
         <w:r>
           <w:rPr>
-            <w:rStyle w:val="Hypertextovodkaz"/>
+            <w:rStyle w:val="Hyperlink"/>
             <w:i/>
             <w:iCs/>
           </w:rPr>
@@ -1473,7 +1473,7 @@
     </w:p>
     <w:p>
       <w:pPr>
-        <w:pStyle w:val="Zkladntext"/>
+        <w:pStyle w:val="BodyText"/>
       </w:pPr>
       <w:r>
         <w:lastRenderedPageBreak/>
@@ -1482,7 +1482,7 @@
     </w:p>
     <w:p>
       <w:pPr>
-        <w:pStyle w:val="Nadpis4"/>
+        <w:pStyle w:val="Heading4"/>
       </w:pPr>
       <w:bookmarkStart w:id="19" w:name="answers-1-items-1"/>
       <w:bookmarkEnd w:id="18"/>
@@ -1492,7 +1492,7 @@
     </w:p>
     <w:p>
       <w:pPr>
-        <w:pStyle w:val="Nadpis4"/>
+        <w:pStyle w:val="Heading4"/>
       </w:pPr>
       <w:bookmarkStart w:id="20" w:name="Xc0e9de7ed320e207238cf337c8e7c9d1b6f74c9"/>
       <w:bookmarkStart w:id="21" w:name="X301d1ea611557b4ca204af8a206a0f12d110edb"/>
@@ -1538,7 +1538,7 @@
     </w:p>
     <w:p>
       <w:pPr>
-        <w:pStyle w:val="Zkladntext"/>
+        <w:pStyle w:val="BodyText"/>
       </w:pPr>
       <w:r>
         <w:t>Give the name of the database or dataset. You will be shown suggestions of data bases from FAIRSharing, but you can also type the name of a dataset that is not in FAIRsharing</w:t>
@@ -1546,7 +1546,7 @@
     </w:p>
     <w:p>
       <w:pPr>
-        <w:pStyle w:val="Zkladntext"/>
+        <w:pStyle w:val="BodyText"/>
       </w:pPr>
       <w:r>
         <w:t>✔️ Very interesting dataset</w:t>
@@ -1554,7 +1554,7 @@
     </w:p>
     <w:p>
       <w:pPr>
-        <w:pStyle w:val="Nadpis4"/>
+        <w:pStyle w:val="Heading4"/>
       </w:pPr>
       <w:bookmarkStart w:id="22" w:name="X8e29a106a187eb0642fe8d5279bb8cf9b22fb57"/>
       <w:bookmarkEnd w:id="20"/>
@@ -1599,7 +1599,7 @@
     </w:p>
     <w:p>
       <w:pPr>
-        <w:pStyle w:val="Zkladntext"/>
+        <w:pStyle w:val="BodyText"/>
       </w:pPr>
       <w:r>
         <w:t>Specify a URL or a persistent identifier (e.g. DOI) for the database or dataset. If possible, refer exactly to the version that you are using.</w:t>
@@ -1607,7 +1607,7 @@
     </w:p>
     <w:p>
       <w:pPr>
-        <w:pStyle w:val="Zkladntext"/>
+        <w:pStyle w:val="BodyText"/>
       </w:pPr>
       <w:r>
         <w:t>✔️ RandomDB</w:t>
@@ -1615,7 +1615,7 @@
     </w:p>
     <w:p>
       <w:pPr>
-        <w:pStyle w:val="Nadpis4"/>
+        <w:pStyle w:val="Heading4"/>
       </w:pPr>
       <w:bookmarkStart w:id="23" w:name="Xebf69fe190281a62f68675642e32d8f88e09446"/>
       <w:bookmarkEnd w:id="22"/>
@@ -1640,7 +1640,7 @@
     </w:p>
     <w:p>
       <w:pPr>
-        <w:pStyle w:val="Nadpis4"/>
+        <w:pStyle w:val="Heading4"/>
       </w:pPr>
       <w:bookmarkStart w:id="24" w:name="X4c4a291ddbd3915fc560e947d093efc6801c788"/>
       <w:bookmarkEnd w:id="23"/>
@@ -1685,7 +1685,7 @@
     </w:p>
     <w:p>
       <w:pPr>
-        <w:pStyle w:val="Zkladntext"/>
+        <w:pStyle w:val="BodyText"/>
       </w:pPr>
       <w:r>
         <w:t xml:space="preserve">🔗 </w:t>
@@ -1700,10 +1700,10 @@
       <w:r>
         <w:t xml:space="preserve"> </w:t>
       </w:r>
-      <w:hyperlink r:id="rId14">
+      <w:hyperlink r:id="rId15">
         <w:r>
           <w:rPr>
-            <w:rStyle w:val="Hypertextovodkaz"/>
+            <w:rStyle w:val="Hyperlink"/>
             <w:i/>
             <w:iCs/>
           </w:rPr>
@@ -1713,7 +1713,7 @@
     </w:p>
     <w:p>
       <w:pPr>
-        <w:pStyle w:val="Zkladntext"/>
+        <w:pStyle w:val="BodyText"/>
       </w:pPr>
       <w:r>
         <w:t xml:space="preserve">Although there is no world-wide rule for the application of copyright on data sets (copyright only applies to things that require a so-called "creative step"), it is wise to check for an explicit permission to use a data set and not to assume that data can be used freely just because you can access it. Note that copyright laws explicitly </w:t>
@@ -1741,7 +1741,7 @@
     </w:p>
     <w:p>
       <w:pPr>
-        <w:pStyle w:val="Zkladntext"/>
+        <w:pStyle w:val="BodyText"/>
       </w:pPr>
       <w:r>
         <w:t>✔️ b. They are freely available with obligation to quote the source (e.g. CC-BY)</w:t>
@@ -1749,7 +1749,7 @@
     </w:p>
     <w:p>
       <w:pPr>
-        <w:pStyle w:val="Nadpis1"/>
+        <w:pStyle w:val="Heading1"/>
       </w:pPr>
       <w:bookmarkStart w:id="25" w:name="iv.-processing-data"/>
       <w:bookmarkEnd w:id="13"/>
@@ -1772,7 +1772,7 @@
     </w:p>
     <w:p>
       <w:pPr>
-        <w:pStyle w:val="Nadpis3"/>
+        <w:pStyle w:val="Heading3"/>
       </w:pPr>
       <w:bookmarkStart w:id="26" w:name="summary-4"/>
       <w:r>
@@ -1781,7 +1781,7 @@
     </w:p>
     <w:p>
       <w:pPr>
-        <w:pStyle w:val="Nadpis4"/>
+        <w:pStyle w:val="Heading4"/>
       </w:pPr>
       <w:bookmarkStart w:id="27" w:name="answered-indication-4"/>
       <w:r>
@@ -1884,7 +1884,7 @@
     </w:tbl>
     <w:p>
       <w:pPr>
-        <w:pStyle w:val="Nadpis4"/>
+        <w:pStyle w:val="Heading4"/>
       </w:pPr>
       <w:bookmarkStart w:id="28" w:name="metrics-2"/>
       <w:bookmarkEnd w:id="27"/>
@@ -1993,7 +1993,7 @@
     </w:tbl>
     <w:p>
       <w:pPr>
-        <w:pStyle w:val="Nadpis4"/>
+        <w:pStyle w:val="Heading4"/>
       </w:pPr>
       <w:bookmarkStart w:id="29" w:name="X6c3d2499b5757d9a9805c23b602212ee0a9cfeb"/>
       <w:bookmarkEnd w:id="26"/>
@@ -2039,7 +2039,7 @@
     </w:p>
     <w:p>
       <w:pPr>
-        <w:pStyle w:val="Zkladntext"/>
+        <w:pStyle w:val="BodyText"/>
       </w:pPr>
       <w:r>
         <w:t xml:space="preserve">Will you be using a working space that is shared between all the people working on the data in the project? Sometimes such a system is called a </w:t>
@@ -2057,7 +2057,7 @@
     </w:p>
     <w:p>
       <w:pPr>
-        <w:pStyle w:val="Zkladntext"/>
+        <w:pStyle w:val="BodyText"/>
       </w:pPr>
       <w:r>
         <w:t>✔️ a. No</w:t>
@@ -2065,7 +2065,7 @@
     </w:p>
     <w:p>
       <w:pPr>
-        <w:pStyle w:val="Nadpis4"/>
+        <w:pStyle w:val="Heading4"/>
       </w:pPr>
       <w:bookmarkStart w:id="30" w:name="X9cdcb3be6232614d01849efa9cee7c3a7fe5fd0"/>
       <w:r>
@@ -2099,7 +2099,7 @@
     </w:p>
     <w:p>
       <w:pPr>
-        <w:pStyle w:val="Zkladntext"/>
+        <w:pStyle w:val="BodyText"/>
       </w:pPr>
       <w:r>
         <w:t>✔️ b. Yes, protected against both equipment failure and human error</w:t>
@@ -2107,7 +2107,7 @@
     </w:p>
     <w:p>
       <w:pPr>
-        <w:pStyle w:val="Nadpis4"/>
+        <w:pStyle w:val="Heading4"/>
       </w:pPr>
       <w:bookmarkStart w:id="31" w:name="X8d59062b5528917c569e4bb263189686898b5d8"/>
       <w:bookmarkEnd w:id="29"/>
@@ -2143,7 +2143,7 @@
     </w:p>
     <w:p>
       <w:pPr>
-        <w:pStyle w:val="Zkladntext"/>
+        <w:pStyle w:val="BodyText"/>
       </w:pPr>
       <w:r>
         <w:t>It is a good idea to pre-define how data will be organised in the project work space, and to set conventions for how any data files and folders will be named.</w:t>
@@ -2151,7 +2151,7 @@
     </w:p>
     <w:p>
       <w:pPr>
-        <w:pStyle w:val="Zkladntext"/>
+        <w:pStyle w:val="BodyText"/>
       </w:pPr>
       <w:r>
         <w:t xml:space="preserve">❗ </w:t>
@@ -2166,7 +2166,7 @@
     </w:p>
     <w:p>
       <w:pPr>
-        <w:pStyle w:val="Nadpis4"/>
+        <w:pStyle w:val="Heading4"/>
       </w:pPr>
       <w:bookmarkStart w:id="32" w:name="workflow-development"/>
       <w:bookmarkEnd w:id="31"/>
@@ -2184,7 +2184,7 @@
     </w:p>
     <w:p>
       <w:pPr>
-        <w:pStyle w:val="Zkladntext"/>
+        <w:pStyle w:val="BodyText"/>
       </w:pPr>
       <w:r>
         <w:lastRenderedPageBreak/>
@@ -2193,7 +2193,7 @@
     </w:p>
     <w:p>
       <w:pPr>
-        <w:pStyle w:val="Nadpis4"/>
+        <w:pStyle w:val="Heading4"/>
       </w:pPr>
       <w:bookmarkStart w:id="33" w:name="X8138edc684f2763b2092a317c8b02563015428a"/>
       <w:bookmarkEnd w:id="32"/>
@@ -2218,7 +2218,7 @@
     </w:p>
     <w:p>
       <w:pPr>
-        <w:pStyle w:val="Nadpis4"/>
+        <w:pStyle w:val="Heading4"/>
       </w:pPr>
       <w:bookmarkStart w:id="34" w:name="X5fcdea77589c0b6b6d5c6c9fa030e9189e1aa77"/>
       <w:bookmarkEnd w:id="33"/>
@@ -2253,7 +2253,7 @@
     </w:p>
     <w:p>
       <w:pPr>
-        <w:pStyle w:val="Zkladntext"/>
+        <w:pStyle w:val="BodyText"/>
       </w:pPr>
       <w:r>
         <w:t>✔️ a. Explore</w:t>
@@ -2261,7 +2261,7 @@
     </w:p>
     <w:p>
       <w:pPr>
-        <w:pStyle w:val="Nadpis4"/>
+        <w:pStyle w:val="Heading4"/>
       </w:pPr>
       <w:bookmarkStart w:id="35" w:name="Xa51d0d2ea026781d0a0f5872adffad76390fa2c"/>
       <w:r>
@@ -2295,7 +2295,7 @@
     </w:p>
     <w:p>
       <w:pPr>
-        <w:pStyle w:val="Zkladntext"/>
+        <w:pStyle w:val="BodyText"/>
       </w:pPr>
       <w:r>
         <w:t>There are surprisingly many complications that can cause (slight) inconsistencies between results when workflows are run on different compute infrastructures. A good way to make sure this does not bite you is to run a subset of all jobs on all different infrastructure to check the consistency.</w:t>
@@ -2303,7 +2303,7 @@
     </w:p>
     <w:p>
       <w:pPr>
-        <w:pStyle w:val="Zkladntext"/>
+        <w:pStyle w:val="BodyText"/>
       </w:pPr>
       <w:r>
         <w:t>✔️ b. Yes</w:t>
@@ -2311,7 +2311,7 @@
     </w:p>
     <w:p>
       <w:pPr>
-        <w:pStyle w:val="Nadpis4"/>
+        <w:pStyle w:val="Heading4"/>
       </w:pPr>
       <w:bookmarkStart w:id="36" w:name="X6c78a688433fe65ab2f9d4d35fe801e8494a11c"/>
       <w:bookmarkEnd w:id="35"/>
@@ -2346,7 +2346,7 @@
     </w:p>
     <w:p>
       <w:pPr>
-        <w:pStyle w:val="Zkladntext"/>
+        <w:pStyle w:val="BodyText"/>
       </w:pPr>
       <w:r>
         <w:t>Surrounding all tools in your data processing and analysis workflows with the 'boilerplate' code necessary on the computer system you are using is tedious and error prone. Especially if you are using the same tools in multiple different work flows and/or on multiple different computer architectures. Automated instrumentation, e.g. by using a workflow management system, can prevent many mistakes.</w:t>
@@ -2354,7 +2354,7 @@
     </w:p>
     <w:p>
       <w:pPr>
-        <w:pStyle w:val="Zkladntext"/>
+        <w:pStyle w:val="BodyText"/>
       </w:pPr>
       <w:r>
         <w:t>✔️ a. No</w:t>
@@ -2362,7 +2362,7 @@
     </w:p>
     <w:p>
       <w:pPr>
-        <w:pStyle w:val="Nadpis4"/>
+        <w:pStyle w:val="Heading4"/>
       </w:pPr>
       <w:bookmarkStart w:id="37" w:name="X391db5e734d82e6917f19bcbdb18bb0ac6fb4c0"/>
       <w:bookmarkEnd w:id="36"/>
@@ -2397,7 +2397,7 @@
     </w:p>
     <w:p>
       <w:pPr>
-        <w:pStyle w:val="Zkladntext"/>
+        <w:pStyle w:val="BodyText"/>
       </w:pPr>
       <w:r>
         <w:t>Validation of results without a golden standard is very hard. One way of doing it is to develop two solutions for a problem (two independent workflows or two independently developed tools) to check whether the results are identical or comparable.</w:t>
@@ -2405,7 +2405,7 @@
     </w:p>
     <w:p>
       <w:pPr>
-        <w:pStyle w:val="Zkladntext"/>
+        <w:pStyle w:val="BodyText"/>
       </w:pPr>
       <w:r>
         <w:t>✔️ b. Yes</w:t>
@@ -2413,7 +2413,7 @@
     </w:p>
     <w:p>
       <w:pPr>
-        <w:pStyle w:val="Nadpis4"/>
+        <w:pStyle w:val="Heading4"/>
       </w:pPr>
       <w:bookmarkStart w:id="38" w:name="X584458674d7c38d3dd6e4993a12d293d8fdbb40"/>
       <w:bookmarkEnd w:id="37"/>
@@ -2448,7 +2448,7 @@
     </w:p>
     <w:p>
       <w:pPr>
-        <w:pStyle w:val="Zkladntext"/>
+        <w:pStyle w:val="BodyText"/>
       </w:pPr>
       <w:r>
         <w:lastRenderedPageBreak/>
@@ -2464,10 +2464,10 @@
       <w:r>
         <w:t xml:space="preserve"> </w:t>
       </w:r>
-      <w:hyperlink r:id="rId15">
+      <w:hyperlink r:id="rId16">
         <w:r>
           <w:rPr>
-            <w:rStyle w:val="Hypertextovodkaz"/>
+            <w:rStyle w:val="Hyperlink"/>
             <w:i/>
             <w:iCs/>
           </w:rPr>
@@ -2477,7 +2477,7 @@
     </w:p>
     <w:p>
       <w:pPr>
-        <w:pStyle w:val="Zkladntext"/>
+        <w:pStyle w:val="BodyText"/>
       </w:pPr>
       <w:r>
         <w:t>Running a small subset of the data repeatedly can be useful to catch unexpected problems that would otherwise be very hard to detect.</w:t>
@@ -2485,7 +2485,7 @@
     </w:p>
     <w:p>
       <w:pPr>
-        <w:pStyle w:val="Zkladntext"/>
+        <w:pStyle w:val="BodyText"/>
       </w:pPr>
       <w:r>
         <w:t>✔️ b. Yes</w:t>
@@ -2493,7 +2493,7 @@
     </w:p>
     <w:p>
       <w:pPr>
-        <w:pStyle w:val="Nadpis4"/>
+        <w:pStyle w:val="Heading4"/>
       </w:pPr>
       <w:bookmarkStart w:id="39" w:name="X3577f66812acb323b1998a4444da8e2d48badcc"/>
       <w:bookmarkEnd w:id="34"/>
@@ -2512,7 +2512,7 @@
     </w:p>
     <w:p>
       <w:pPr>
-        <w:pStyle w:val="Zkladntext"/>
+        <w:pStyle w:val="BodyText"/>
       </w:pPr>
       <w:r>
         <w:t>✔️ a. No</w:t>
@@ -2520,7 +2520,7 @@
     </w:p>
     <w:p>
       <w:pPr>
-        <w:pStyle w:val="Nadpis4"/>
+        <w:pStyle w:val="Heading4"/>
       </w:pPr>
       <w:bookmarkStart w:id="40" w:name="X08b1998e72b1edcf3bc76483422caed958f4cd3"/>
       <w:bookmarkEnd w:id="39"/>
@@ -2565,7 +2565,7 @@
     </w:p>
     <w:p>
       <w:pPr>
-        <w:pStyle w:val="Zkladntext"/>
+        <w:pStyle w:val="BodyText"/>
       </w:pPr>
       <w:r>
         <w:t>There are many factors that can contribute to the risk of information loss or information leaks. They are often part of the behavior of the people that are involved in the project, but can also be steered by properly planned infrastructure.</w:t>
@@ -2573,7 +2573,7 @@
     </w:p>
     <w:p>
       <w:pPr>
-        <w:pStyle w:val="Zkladntext"/>
+        <w:pStyle w:val="BodyText"/>
       </w:pPr>
       <w:r>
         <w:t xml:space="preserve">❗ </w:t>
@@ -2588,7 +2588,7 @@
     </w:p>
     <w:p>
       <w:pPr>
-        <w:pStyle w:val="Nadpis4"/>
+        <w:pStyle w:val="Heading4"/>
       </w:pPr>
       <w:bookmarkStart w:id="41" w:name="do-you-have-a-contingency-plan"/>
       <w:bookmarkEnd w:id="40"/>
@@ -2606,7 +2606,7 @@
     </w:p>
     <w:p>
       <w:pPr>
-        <w:pStyle w:val="Zkladntext"/>
+        <w:pStyle w:val="BodyText"/>
       </w:pPr>
       <w:r>
         <w:t>✔️ a. We will wait until the problem is fixed</w:t>
@@ -2621,7 +2621,7 @@
     </w:p>
     <w:p>
       <w:pPr>
-        <w:pStyle w:val="Nadpis1"/>
+        <w:pStyle w:val="Heading1"/>
       </w:pPr>
       <w:bookmarkStart w:id="42" w:name="v.-interpreting-data"/>
       <w:r>
@@ -2639,7 +2639,7 @@
     </w:p>
     <w:p>
       <w:pPr>
-        <w:pStyle w:val="Nadpis3"/>
+        <w:pStyle w:val="Heading3"/>
       </w:pPr>
       <w:bookmarkStart w:id="43" w:name="summary-5"/>
       <w:r>
@@ -2648,7 +2648,7 @@
     </w:p>
     <w:p>
       <w:pPr>
-        <w:pStyle w:val="Nadpis4"/>
+        <w:pStyle w:val="Heading4"/>
       </w:pPr>
       <w:bookmarkStart w:id="44" w:name="answered-indication-5"/>
       <w:r>
@@ -2751,7 +2751,7 @@
     </w:tbl>
     <w:p>
       <w:pPr>
-        <w:pStyle w:val="Nadpis4"/>
+        <w:pStyle w:val="Heading4"/>
       </w:pPr>
       <w:bookmarkStart w:id="45" w:name="metrics-3"/>
       <w:bookmarkEnd w:id="44"/>
@@ -2832,7 +2832,7 @@
     </w:tbl>
     <w:p>
       <w:pPr>
-        <w:pStyle w:val="Nadpis4"/>
+        <w:pStyle w:val="Heading4"/>
       </w:pPr>
       <w:bookmarkStart w:id="46" w:name="Xea3c249504abc08f8fd320ff617f81dd214ea1e"/>
       <w:bookmarkEnd w:id="43"/>
@@ -2851,7 +2851,7 @@
     </w:p>
     <w:p>
       <w:pPr>
-        <w:pStyle w:val="Zkladntext"/>
+        <w:pStyle w:val="BodyText"/>
       </w:pPr>
       <w:r>
         <w:t>If you have data in many different structures, integrating the data may be more challenging.</w:t>
@@ -2859,7 +2859,7 @@
     </w:p>
     <w:p>
       <w:pPr>
-        <w:pStyle w:val="Zkladntext"/>
+        <w:pStyle w:val="BodyText"/>
       </w:pPr>
       <w:r>
         <w:t xml:space="preserve">❗ </w:t>
@@ -2874,7 +2874,7 @@
     </w:p>
     <w:p>
       <w:pPr>
-        <w:pStyle w:val="Nadpis4"/>
+        <w:pStyle w:val="Heading4"/>
       </w:pPr>
       <w:bookmarkStart w:id="47" w:name="Xe81061cce9d7f7c72dc5648c5ed060de142aa95"/>
       <w:bookmarkEnd w:id="46"/>
@@ -2892,7 +2892,7 @@
     </w:p>
     <w:p>
       <w:pPr>
-        <w:pStyle w:val="Zkladntext"/>
+        <w:pStyle w:val="BodyText"/>
       </w:pPr>
       <w:r>
         <w:t>This is an advanced subject that you may want to skip if this is not an issue for you. On the other hand, if this is your expertise we would like your help in improving the questions in this section.</w:t>
@@ -2900,7 +2900,7 @@
     </w:p>
     <w:p>
       <w:pPr>
-        <w:pStyle w:val="Zkladntext"/>
+        <w:pStyle w:val="BodyText"/>
       </w:pPr>
       <w:r>
         <w:t>✔️ a. No</w:t>
@@ -2908,7 +2908,7 @@
     </w:p>
     <w:p>
       <w:pPr>
-        <w:pStyle w:val="Nadpis4"/>
+        <w:pStyle w:val="Heading4"/>
       </w:pPr>
       <w:bookmarkStart w:id="48" w:name="Xbdddbea4bad26b7a4aa08a184698f09d4d5de9e"/>
       <w:bookmarkEnd w:id="47"/>
@@ -2926,7 +2926,7 @@
     </w:p>
     <w:p>
       <w:pPr>
-        <w:pStyle w:val="Nadpis4"/>
+        <w:pStyle w:val="Heading4"/>
       </w:pPr>
       <w:bookmarkStart w:id="49" w:name="will-you-be-using-common-ontologies"/>
       <w:bookmarkEnd w:id="48"/>
@@ -2944,7 +2944,7 @@
     </w:p>
     <w:p>
       <w:pPr>
-        <w:pStyle w:val="Nadpis4"/>
+        <w:pStyle w:val="Heading4"/>
       </w:pPr>
       <w:bookmarkStart w:id="50" w:name="Xd23dc2cb8c1e4b31ad71cb04d8ae9f0cfaac6cb"/>
       <w:bookmarkEnd w:id="49"/>
@@ -2962,7 +2962,7 @@
     </w:p>
     <w:p>
       <w:pPr>
-        <w:pStyle w:val="Nadpis4"/>
+        <w:pStyle w:val="Heading4"/>
       </w:pPr>
       <w:bookmarkStart w:id="51" w:name="X57e91ed789d19fb103868c749baf27a5008c764"/>
       <w:bookmarkEnd w:id="50"/>
@@ -2981,7 +2981,7 @@
     </w:p>
     <w:p>
       <w:pPr>
-        <w:pStyle w:val="Nadpis4"/>
+        <w:pStyle w:val="Heading4"/>
       </w:pPr>
       <w:bookmarkStart w:id="52" w:name="Xf82bc4e83a263413b91eb10885393742c90dd78"/>
       <w:bookmarkEnd w:id="51"/>
@@ -2999,7 +2999,7 @@
     </w:p>
     <w:p>
       <w:pPr>
-        <w:pStyle w:val="Nadpis4"/>
+        <w:pStyle w:val="Heading4"/>
       </w:pPr>
       <w:bookmarkStart w:id="53" w:name="X4c80df1f8234164578884282249913c98c68dfd"/>
       <w:bookmarkEnd w:id="52"/>
@@ -3017,7 +3017,7 @@
     </w:p>
     <w:p>
       <w:pPr>
-        <w:pStyle w:val="Nadpis4"/>
+        <w:pStyle w:val="Heading4"/>
       </w:pPr>
       <w:bookmarkStart w:id="54" w:name="X1e5b4e9ec5258b60fa0f0b23d2463f73ffb1bd7"/>
       <w:bookmarkEnd w:id="53"/>
@@ -3042,10 +3042,10 @@
       <w:r>
         <w:t xml:space="preserve"> </w:t>
       </w:r>
-      <w:hyperlink r:id="rId16">
+      <w:hyperlink r:id="rId17">
         <w:r>
           <w:rPr>
-            <w:rStyle w:val="Hypertextovodkaz"/>
+            <w:rStyle w:val="Hyperlink"/>
             <w:i/>
             <w:iCs/>
           </w:rPr>
@@ -3055,7 +3055,7 @@
     </w:p>
     <w:p>
       <w:pPr>
-        <w:pStyle w:val="Zkladntext"/>
+        <w:pStyle w:val="BodyText"/>
       </w:pPr>
       <w:r>
         <w:t>✔️ a. No</w:t>
@@ -3070,7 +3070,7 @@
     </w:p>
     <w:p>
       <w:pPr>
-        <w:pStyle w:val="Nadpis1"/>
+        <w:pStyle w:val="Heading1"/>
       </w:pPr>
       <w:bookmarkStart w:id="55" w:name="vi.-preserving-data"/>
       <w:r>
@@ -3088,7 +3088,7 @@
     </w:p>
     <w:p>
       <w:pPr>
-        <w:pStyle w:val="Nadpis3"/>
+        <w:pStyle w:val="Heading3"/>
       </w:pPr>
       <w:bookmarkStart w:id="56" w:name="summary-6"/>
       <w:r>
@@ -3097,7 +3097,7 @@
     </w:p>
     <w:p>
       <w:pPr>
-        <w:pStyle w:val="Nadpis4"/>
+        <w:pStyle w:val="Heading4"/>
       </w:pPr>
       <w:bookmarkStart w:id="57" w:name="answered-indication-6"/>
       <w:r>
@@ -3200,7 +3200,7 @@
     </w:tbl>
     <w:p>
       <w:pPr>
-        <w:pStyle w:val="Nadpis4"/>
+        <w:pStyle w:val="Heading4"/>
       </w:pPr>
       <w:bookmarkStart w:id="58" w:name="metrics-4"/>
       <w:bookmarkEnd w:id="57"/>
@@ -3365,7 +3365,7 @@
     </w:tbl>
     <w:p>
       <w:pPr>
-        <w:pStyle w:val="Nadpis4"/>
+        <w:pStyle w:val="Heading4"/>
       </w:pPr>
       <w:bookmarkStart w:id="59" w:name="X988de40c278035602bd6093aa8ea9a95d84c7fd"/>
       <w:bookmarkEnd w:id="56"/>
@@ -3421,7 +3421,7 @@
     </w:p>
     <w:p>
       <w:pPr>
-        <w:pStyle w:val="Zkladntext"/>
+        <w:pStyle w:val="BodyText"/>
       </w:pPr>
       <w:r>
         <w:t>Add all the data sets you will be producing. Give each a short name, sufficient for yourself to know what data it is about. It is useful to think about a data set as some collection of data that will be ending up in the same place.</w:t>
@@ -3429,7 +3429,7 @@
     </w:p>
     <w:p>
       <w:pPr>
-        <w:pStyle w:val="Zkladntext"/>
+        <w:pStyle w:val="BodyText"/>
       </w:pPr>
       <w:r>
         <w:t xml:space="preserve">❗ </w:t>
@@ -3444,7 +3444,7 @@
     </w:p>
     <w:p>
       <w:pPr>
-        <w:pStyle w:val="Nadpis4"/>
+        <w:pStyle w:val="Heading4"/>
       </w:pPr>
       <w:bookmarkStart w:id="60" w:name="X3dbbc2e204472a6379e8b6f9847f955a4f2798f"/>
       <w:bookmarkEnd w:id="59"/>
@@ -3479,7 +3479,7 @@
     </w:p>
     <w:p>
       <w:pPr>
-        <w:pStyle w:val="Zkladntext"/>
+        <w:pStyle w:val="BodyText"/>
       </w:pPr>
       <w:r>
         <w:t xml:space="preserve">📖 </w:t>
@@ -3494,10 +3494,10 @@
       <w:r>
         <w:t xml:space="preserve"> </w:t>
       </w:r>
-      <w:hyperlink r:id="rId17">
+      <w:hyperlink r:id="rId18">
         <w:r>
           <w:rPr>
-            <w:rStyle w:val="Hypertextovodkaz"/>
+            <w:rStyle w:val="Hyperlink"/>
             <w:i/>
             <w:iCs/>
           </w:rPr>
@@ -3507,7 +3507,7 @@
     </w:p>
     <w:p>
       <w:pPr>
-        <w:pStyle w:val="Zkladntext"/>
+        <w:pStyle w:val="BodyText"/>
       </w:pPr>
       <w:r>
         <w:t>Much of the raw data you have will need to be archived for your own later use somewhere. This is often done off-line on tape, not on the disks of the compute facility. Please note that this does not refer to the data publication.</w:t>
@@ -3515,7 +3515,7 @@
     </w:p>
     <w:p>
       <w:pPr>
-        <w:pStyle w:val="Zkladntext"/>
+        <w:pStyle w:val="BodyText"/>
       </w:pPr>
       <w:r>
         <w:t>✔️ b. Yes</w:t>
@@ -3523,7 +3523,7 @@
     </w:p>
     <w:p>
       <w:pPr>
-        <w:pStyle w:val="Nadpis4"/>
+        <w:pStyle w:val="Heading4"/>
       </w:pPr>
       <w:bookmarkStart w:id="61" w:name="Xd821dbfce3168de019d01db4c4adbfaf8f2e19e"/>
       <w:r>
@@ -3547,10 +3547,10 @@
       <w:r>
         <w:t xml:space="preserve"> </w:t>
       </w:r>
-      <w:hyperlink r:id="rId18">
+      <w:hyperlink r:id="rId19">
         <w:r>
           <w:rPr>
-            <w:rStyle w:val="Hypertextovodkaz"/>
+            <w:rStyle w:val="Hyperlink"/>
             <w:i/>
             <w:iCs/>
           </w:rPr>
@@ -3560,7 +3560,7 @@
     </w:p>
     <w:p>
       <w:pPr>
-        <w:pStyle w:val="Zkladntext"/>
+        <w:pStyle w:val="BodyText"/>
       </w:pPr>
       <w:r>
         <w:t>✔️ b. Yes</w:t>
@@ -3568,7 +3568,7 @@
     </w:p>
     <w:p>
       <w:pPr>
-        <w:pStyle w:val="Nadpis4"/>
+        <w:pStyle w:val="Heading4"/>
       </w:pPr>
       <w:bookmarkStart w:id="62" w:name="b.1.b.1.-do-you-need-frequent-backups"/>
       <w:r>
@@ -3586,7 +3586,7 @@
     </w:p>
     <w:p>
       <w:pPr>
-        <w:pStyle w:val="Zkladntext"/>
+        <w:pStyle w:val="BodyText"/>
       </w:pPr>
       <w:r>
         <w:t>✔️ b. Yes, data changes frequently</w:t>
@@ -3594,7 +3594,7 @@
     </w:p>
     <w:p>
       <w:pPr>
-        <w:pStyle w:val="Nadpis4"/>
+        <w:pStyle w:val="Heading4"/>
       </w:pPr>
       <w:bookmarkStart w:id="63" w:name="Xcfb3cf91541e8e3d230432c3a4bc0afb913a214"/>
       <w:bookmarkEnd w:id="62"/>
@@ -3612,7 +3612,7 @@
     </w:p>
     <w:p>
       <w:pPr>
-        <w:pStyle w:val="Zkladntext"/>
+        <w:pStyle w:val="BodyText"/>
       </w:pPr>
       <w:r>
         <w:rPr>
@@ -3624,7 +3624,7 @@
     </w:p>
     <w:p>
       <w:pPr>
-        <w:pStyle w:val="Zkladntext"/>
+        <w:pStyle w:val="BodyText"/>
       </w:pPr>
       <w:r>
         <w:t>This puts other demands on the possibility to restore files. Make sure this is covered</w:t>
@@ -3632,7 +3632,7 @@
     </w:p>
     <w:p>
       <w:pPr>
-        <w:pStyle w:val="Nadpis4"/>
+        <w:pStyle w:val="Heading4"/>
       </w:pPr>
       <w:bookmarkStart w:id="64" w:name="X8269ee5b82120913e58bc3509fe55bb4d5f6267"/>
       <w:bookmarkEnd w:id="61"/>
@@ -3651,7 +3651,7 @@
     </w:p>
     <w:p>
       <w:pPr>
-        <w:pStyle w:val="Nadpis4"/>
+        <w:pStyle w:val="Heading4"/>
       </w:pPr>
       <w:bookmarkStart w:id="65" w:name="X076a0c65f5a612dbfcaf9c9085f7b54ad9204ce"/>
       <w:bookmarkEnd w:id="64"/>
@@ -3686,7 +3686,7 @@
     </w:p>
     <w:p>
       <w:pPr>
-        <w:pStyle w:val="Zkladntext"/>
+        <w:pStyle w:val="BodyText"/>
       </w:pPr>
       <w:r>
         <w:t>✔️ a. No</w:t>
@@ -3694,7 +3694,7 @@
     </w:p>
     <w:p>
       <w:pPr>
-        <w:pStyle w:val="Nadpis4"/>
+        <w:pStyle w:val="Heading4"/>
       </w:pPr>
       <w:bookmarkStart w:id="66" w:name="X51ece24d2c0f7ec6e310909dcc63f438b7bbd21"/>
       <w:bookmarkEnd w:id="65"/>
@@ -3729,7 +3729,7 @@
     </w:p>
     <w:p>
       <w:pPr>
-        <w:pStyle w:val="Zkladntext"/>
+        <w:pStyle w:val="BodyText"/>
       </w:pPr>
       <w:r>
         <w:t>✔️ a. No</w:t>
@@ -3737,7 +3737,7 @@
     </w:p>
     <w:p>
       <w:pPr>
-        <w:pStyle w:val="Nadpis4"/>
+        <w:pStyle w:val="Heading4"/>
       </w:pPr>
       <w:bookmarkStart w:id="67" w:name="Xef057df3d8274c3526ebf93cb3677b392923297"/>
       <w:bookmarkEnd w:id="66"/>
@@ -3762,10 +3762,10 @@
       <w:r>
         <w:t xml:space="preserve"> </w:t>
       </w:r>
-      <w:hyperlink r:id="rId19">
+      <w:hyperlink r:id="rId20">
         <w:r>
           <w:rPr>
-            <w:rStyle w:val="Hypertextovodkaz"/>
+            <w:rStyle w:val="Hyperlink"/>
             <w:i/>
             <w:iCs/>
           </w:rPr>
@@ -3775,7 +3775,7 @@
     </w:p>
     <w:p>
       <w:pPr>
-        <w:pStyle w:val="Zkladntext"/>
+        <w:pStyle w:val="BodyText"/>
       </w:pPr>
       <w:r>
         <w:t>✔️ a. No</w:t>
@@ -3783,7 +3783,7 @@
     </w:p>
     <w:p>
       <w:pPr>
-        <w:pStyle w:val="Nadpis4"/>
+        <w:pStyle w:val="Heading4"/>
       </w:pPr>
       <w:bookmarkStart w:id="68" w:name="X73a04a064ee3d82323da5cc6e173e92bd199550"/>
       <w:bookmarkEnd w:id="67"/>
@@ -3808,7 +3808,7 @@
     </w:p>
     <w:p>
       <w:pPr>
-        <w:pStyle w:val="Nadpis4"/>
+        <w:pStyle w:val="Heading4"/>
       </w:pPr>
       <w:bookmarkStart w:id="69" w:name="X93aef7b3abab0ca5474e11140b3923659edf3ed"/>
       <w:bookmarkEnd w:id="68"/>
@@ -3833,10 +3833,10 @@
       <w:r>
         <w:t xml:space="preserve"> </w:t>
       </w:r>
-      <w:hyperlink r:id="rId20">
+      <w:hyperlink r:id="rId21">
         <w:r>
           <w:rPr>
-            <w:rStyle w:val="Hypertextovodkaz"/>
+            <w:rStyle w:val="Hyperlink"/>
             <w:i/>
             <w:iCs/>
           </w:rPr>
@@ -3846,7 +3846,7 @@
     </w:p>
     <w:p>
       <w:pPr>
-        <w:pStyle w:val="Zkladntext"/>
+        <w:pStyle w:val="BodyText"/>
       </w:pPr>
       <w:r>
         <w:t xml:space="preserve">❗ </w:t>
@@ -3861,7 +3861,7 @@
     </w:p>
     <w:p>
       <w:pPr>
-        <w:pStyle w:val="Nadpis4"/>
+        <w:pStyle w:val="Heading4"/>
       </w:pPr>
       <w:bookmarkStart w:id="70" w:name="Xdd917f17f1c19869567a0bec33469b3d0100c0b"/>
       <w:bookmarkEnd w:id="69"/>
@@ -3897,7 +3897,7 @@
     </w:p>
     <w:p>
       <w:pPr>
-        <w:pStyle w:val="Zkladntext"/>
+        <w:pStyle w:val="BodyText"/>
       </w:pPr>
       <w:r>
         <w:t xml:space="preserve">📖 </w:t>
@@ -3912,10 +3912,10 @@
       <w:r>
         <w:t xml:space="preserve"> </w:t>
       </w:r>
-      <w:hyperlink r:id="rId21">
+      <w:hyperlink r:id="rId22">
         <w:r>
           <w:rPr>
-            <w:rStyle w:val="Hypertextovodkaz"/>
+            <w:rStyle w:val="Hyperlink"/>
             <w:i/>
             <w:iCs/>
           </w:rPr>
@@ -3925,7 +3925,7 @@
     </w:p>
     <w:p>
       <w:pPr>
-        <w:pStyle w:val="Zkladntext"/>
+        <w:pStyle w:val="BodyText"/>
       </w:pPr>
       <w:r>
         <w:t>See also all questions about keeping metadata and data formats. Make sure the metadata is kept close to the data in the archive, and that community supported data formats are used for all long term archiving.</w:t>
@@ -3933,7 +3933,7 @@
     </w:p>
     <w:p>
       <w:pPr>
-        <w:pStyle w:val="Zkladntext"/>
+        <w:pStyle w:val="BodyText"/>
       </w:pPr>
       <w:r>
         <w:t>✔️ b. Yes</w:t>
@@ -3941,7 +3941,7 @@
     </w:p>
     <w:p>
       <w:pPr>
-        <w:pStyle w:val="Nadpis4"/>
+        <w:pStyle w:val="Heading4"/>
       </w:pPr>
       <w:bookmarkStart w:id="71" w:name="Xe1fe98f4321058ad82c8c28f1531013ae593059"/>
       <w:bookmarkEnd w:id="60"/>
@@ -3977,7 +3977,7 @@
     </w:p>
     <w:p>
       <w:pPr>
-        <w:pStyle w:val="Zkladntext"/>
+        <w:pStyle w:val="BodyText"/>
       </w:pPr>
       <w:r>
         <w:t xml:space="preserve">📖 </w:t>
@@ -3992,10 +3992,10 @@
       <w:r>
         <w:t xml:space="preserve"> </w:t>
       </w:r>
-      <w:hyperlink r:id="rId22">
+      <w:hyperlink r:id="rId23">
         <w:r>
           <w:rPr>
-            <w:rStyle w:val="Hypertextovodkaz"/>
+            <w:rStyle w:val="Hyperlink"/>
             <w:i/>
             <w:iCs/>
           </w:rPr>
@@ -4005,7 +4005,7 @@
     </w:p>
     <w:p>
       <w:pPr>
-        <w:pStyle w:val="Zkladntext"/>
+        <w:pStyle w:val="BodyText"/>
       </w:pPr>
       <w:r>
         <w:t>Will you be storing (in cold storage) copies of your own data for a longer period after the project has ended? Possibly as a continuation of archival as part of data storage strategy during the project? Data archival is distinct from data publishing, an archive is usually strictly limited in who can access the data.</w:t>
@@ -4013,7 +4013,7 @@
     </w:p>
     <w:p>
       <w:pPr>
-        <w:pStyle w:val="Zkladntext"/>
+        <w:pStyle w:val="BodyText"/>
       </w:pPr>
       <w:r>
         <w:t>✔️ a. No</w:t>
@@ -4021,7 +4021,7 @@
     </w:p>
     <w:p>
       <w:pPr>
-        <w:pStyle w:val="Nadpis4"/>
+        <w:pStyle w:val="Heading4"/>
       </w:pPr>
       <w:bookmarkStart w:id="72" w:name="X23c1fcf891c4106060dda739a4bbd2e3c93dcc1"/>
       <w:bookmarkEnd w:id="71"/>
@@ -4066,7 +4066,7 @@
     </w:p>
     <w:p>
       <w:pPr>
-        <w:pStyle w:val="Zkladntext"/>
+        <w:pStyle w:val="BodyText"/>
       </w:pPr>
       <w:r>
         <w:t>✔️ b. Yes</w:t>
@@ -4074,7 +4074,7 @@
     </w:p>
     <w:p>
       <w:pPr>
-        <w:pStyle w:val="Nadpis4"/>
+        <w:pStyle w:val="Heading4"/>
       </w:pPr>
       <w:bookmarkStart w:id="73" w:name="Xb7a635454eb849ad400810fdd4d5e8c4b56f10f"/>
       <w:r>
@@ -4118,7 +4118,7 @@
     </w:p>
     <w:p>
       <w:pPr>
-        <w:pStyle w:val="Zkladntext"/>
+        <w:pStyle w:val="BodyText"/>
       </w:pPr>
       <w:r>
         <w:t>✔️ b. These costs will be carried by (one of) the departments involved in the project</w:t>
@@ -4126,7 +4126,7 @@
     </w:p>
     <w:p>
       <w:pPr>
-        <w:pStyle w:val="Nadpis4"/>
+        <w:pStyle w:val="Heading4"/>
       </w:pPr>
       <w:bookmarkStart w:id="74" w:name="X929f72d611920846a877959a81168843b15efcd"/>
       <w:bookmarkEnd w:id="72"/>
@@ -4145,7 +4145,7 @@
     </w:p>
     <w:p>
       <w:pPr>
-        <w:pStyle w:val="Zkladntext"/>
+        <w:pStyle w:val="BodyText"/>
       </w:pPr>
       <w:r>
         <w:t>✔️ a. No</w:t>
@@ -4153,7 +4153,7 @@
     </w:p>
     <w:p>
       <w:pPr>
-        <w:pStyle w:val="Nadpis4"/>
+        <w:pStyle w:val="Heading4"/>
       </w:pPr>
       <w:bookmarkStart w:id="75" w:name="X4701496f217130535552de29aa7c81872e5d585"/>
       <w:bookmarkEnd w:id="74"/>
@@ -4198,7 +4198,7 @@
     </w:p>
     <w:p>
       <w:pPr>
-        <w:pStyle w:val="Zkladntext"/>
+        <w:pStyle w:val="BodyText"/>
       </w:pPr>
       <w:r>
         <w:t>✔️ b. Yes</w:t>
@@ -4206,7 +4206,7 @@
     </w:p>
     <w:p>
       <w:pPr>
-        <w:pStyle w:val="Nadpis4"/>
+        <w:pStyle w:val="Heading4"/>
       </w:pPr>
       <w:bookmarkStart w:id="76" w:name="X2360bf7211ef6fdad5fe8bee438cf2a973f3145"/>
       <w:bookmarkEnd w:id="75"/>
@@ -4225,7 +4225,7 @@
     </w:p>
     <w:p>
       <w:pPr>
-        <w:pStyle w:val="Zkladntext"/>
+        <w:pStyle w:val="BodyText"/>
       </w:pPr>
       <w:r>
         <w:t>✔️ a. No</w:t>
@@ -4233,7 +4233,7 @@
     </w:p>
     <w:p>
       <w:pPr>
-        <w:pStyle w:val="Nadpis4"/>
+        <w:pStyle w:val="Heading4"/>
       </w:pPr>
       <w:bookmarkStart w:id="77" w:name="Xd95f2f757fc6f3b73a64e4471d492b4d57cc9e7"/>
       <w:bookmarkEnd w:id="76"/>
@@ -4251,7 +4251,7 @@
     </w:p>
     <w:p>
       <w:pPr>
-        <w:pStyle w:val="Nadpis4"/>
+        <w:pStyle w:val="Heading4"/>
       </w:pPr>
       <w:bookmarkStart w:id="78" w:name="Xf4c13a356b7ba918b73c9a4e296daeb564f6e2c"/>
       <w:bookmarkEnd w:id="77"/>
@@ -4269,7 +4269,7 @@
     </w:p>
     <w:p>
       <w:pPr>
-        <w:pStyle w:val="Zkladntext"/>
+        <w:pStyle w:val="BodyText"/>
       </w:pPr>
       <w:r>
         <w:t xml:space="preserve">❗ </w:t>
@@ -4284,7 +4284,7 @@
     </w:p>
     <w:p>
       <w:pPr>
-        <w:pStyle w:val="Nadpis4"/>
+        <w:pStyle w:val="Heading4"/>
       </w:pPr>
       <w:bookmarkStart w:id="79" w:name="will-reference-data-be-created"/>
       <w:bookmarkEnd w:id="78"/>
@@ -4309,10 +4309,10 @@
       <w:r>
         <w:t xml:space="preserve"> </w:t>
       </w:r>
-      <w:hyperlink r:id="rId23">
+      <w:hyperlink r:id="rId24">
         <w:r>
           <w:rPr>
-            <w:rStyle w:val="Hypertextovodkaz"/>
+            <w:rStyle w:val="Hyperlink"/>
             <w:i/>
             <w:iCs/>
           </w:rPr>
@@ -4322,7 +4322,7 @@
     </w:p>
     <w:p>
       <w:pPr>
-        <w:pStyle w:val="Zkladntext"/>
+        <w:pStyle w:val="BodyText"/>
       </w:pPr>
       <w:r>
         <w:t>Will any of the data that you will be creating form a reference data set for future research (by others)?</w:t>
@@ -4330,7 +4330,7 @@
     </w:p>
     <w:p>
       <w:pPr>
-        <w:pStyle w:val="Zkladntext"/>
+        <w:pStyle w:val="BodyText"/>
       </w:pPr>
       <w:r>
         <w:t>Much of todays data is used in comparison with reference data. You may be comparing your own data with a "standard set" which is maintained as a collection by someone else. Or you could be determining differences to a standard (for example in bioinformatics, a genome is often compared with a reference genome to identify genomic variants). Will you be creating any data that will be reference data for other researchers?</w:t>
@@ -4338,7 +4338,7 @@
     </w:p>
     <w:p>
       <w:pPr>
-        <w:pStyle w:val="Zkladntext"/>
+        <w:pStyle w:val="BodyText"/>
       </w:pPr>
       <w:r>
         <w:t>✔️ a. No</w:t>
@@ -4353,7 +4353,7 @@
     </w:p>
     <w:p>
       <w:pPr>
-        <w:pStyle w:val="Nadpis1"/>
+        <w:pStyle w:val="Heading1"/>
       </w:pPr>
       <w:bookmarkStart w:id="80" w:name="vii.-giving-access-to-data"/>
       <w:r>
@@ -4371,7 +4371,7 @@
     </w:p>
     <w:p>
       <w:pPr>
-        <w:pStyle w:val="Nadpis3"/>
+        <w:pStyle w:val="Heading3"/>
       </w:pPr>
       <w:bookmarkStart w:id="81" w:name="summary-7"/>
       <w:r>
@@ -4380,7 +4380,7 @@
     </w:p>
     <w:p>
       <w:pPr>
-        <w:pStyle w:val="Nadpis4"/>
+        <w:pStyle w:val="Heading4"/>
       </w:pPr>
       <w:bookmarkStart w:id="82" w:name="answered-indication-7"/>
       <w:r>
@@ -4483,7 +4483,7 @@
     </w:tbl>
     <w:p>
       <w:pPr>
-        <w:pStyle w:val="Nadpis4"/>
+        <w:pStyle w:val="Heading4"/>
       </w:pPr>
       <w:bookmarkStart w:id="83" w:name="metrics-5"/>
       <w:bookmarkEnd w:id="82"/>
@@ -4564,7 +4564,7 @@
     </w:tbl>
     <w:p>
       <w:pPr>
-        <w:pStyle w:val="Nadpis4"/>
+        <w:pStyle w:val="Heading4"/>
       </w:pPr>
       <w:bookmarkStart w:id="84" w:name="X0898c3f205f0b8755bf9b31fd9f0c45ed6fbeb5"/>
       <w:bookmarkEnd w:id="81"/>
@@ -4610,7 +4610,7 @@
     </w:p>
     <w:p>
       <w:pPr>
-        <w:pStyle w:val="Zkladntext"/>
+        <w:pStyle w:val="BodyText"/>
       </w:pPr>
       <w:r>
         <w:t xml:space="preserve">📖 </w:t>
@@ -4625,10 +4625,10 @@
       <w:r>
         <w:t xml:space="preserve"> </w:t>
       </w:r>
-      <w:hyperlink r:id="rId24">
+      <w:hyperlink r:id="rId25">
         <w:r>
           <w:rPr>
-            <w:rStyle w:val="Hypertextovodkaz"/>
+            <w:rStyle w:val="Hyperlink"/>
             <w:i/>
             <w:iCs/>
           </w:rPr>
@@ -4638,7 +4638,7 @@
     </w:p>
     <w:p>
       <w:pPr>
-        <w:pStyle w:val="Zkladntext"/>
+        <w:pStyle w:val="BodyText"/>
       </w:pPr>
       <w:r>
         <w:t>The FAIR principles do not contain any direction towards "Openness". This is done on purpose, because there can be compelling reasons not to make data "Open", such as privacy, other sensitive data, or intellectual property protection.</w:t>
@@ -4646,7 +4646,7 @@
     </w:p>
     <w:p>
       <w:pPr>
-        <w:pStyle w:val="Zkladntext"/>
+        <w:pStyle w:val="BodyText"/>
       </w:pPr>
       <w:r>
         <w:t>The true goal of funding agencies is to create the maximum value for society from their investments. They therefore often add "As open as possible, as closed as necessary" to the requirements for funding.</w:t>
@@ -4654,7 +4654,7 @@
     </w:p>
     <w:p>
       <w:pPr>
-        <w:pStyle w:val="Zkladntext"/>
+        <w:pStyle w:val="BodyText"/>
       </w:pPr>
       <w:r>
         <w:t>✔️ b. Yes</w:t>
@@ -4662,7 +4662,7 @@
     </w:p>
     <w:p>
       <w:pPr>
-        <w:pStyle w:val="Nadpis4"/>
+        <w:pStyle w:val="Heading4"/>
       </w:pPr>
       <w:bookmarkStart w:id="85" w:name="Xe3dc6f452954fd10e8d7dc65de7a97ec3b06b2e"/>
       <w:bookmarkEnd w:id="84"/>
@@ -4717,7 +4717,7 @@
     </w:p>
     <w:p>
       <w:pPr>
-        <w:pStyle w:val="Zkladntext"/>
+        <w:pStyle w:val="BodyText"/>
       </w:pPr>
       <w:r>
         <w:t>Some data may be subject to a temporary embargo, or need to stay closed for specific reasons.</w:t>
@@ -4725,7 +4725,7 @@
     </w:p>
     <w:p>
       <w:pPr>
-        <w:pStyle w:val="Zkladntext"/>
+        <w:pStyle w:val="BodyText"/>
       </w:pPr>
       <w:r>
         <w:t>✔️ a. No</w:t>
@@ -4733,7 +4733,7 @@
     </w:p>
     <w:p>
       <w:pPr>
-        <w:pStyle w:val="Nadpis4"/>
+        <w:pStyle w:val="Heading4"/>
       </w:pPr>
       <w:bookmarkStart w:id="86" w:name="Xa55680014ecfff203c2f6ebca22c8ff6e59aefd"/>
       <w:r>
@@ -4787,7 +4787,7 @@
     </w:p>
     <w:p>
       <w:pPr>
-        <w:pStyle w:val="Zkladntext"/>
+        <w:pStyle w:val="BodyText"/>
       </w:pPr>
       <w:r>
         <w:t>✔️ a. No</w:t>
@@ -4795,7 +4795,7 @@
     </w:p>
     <w:p>
       <w:pPr>
-        <w:pStyle w:val="Nadpis4"/>
+        <w:pStyle w:val="Heading4"/>
       </w:pPr>
       <w:bookmarkStart w:id="87" w:name="X42e64d87183da129b03597976b25985de831c6d"/>
       <w:bookmarkEnd w:id="86"/>
@@ -4840,7 +4840,7 @@
     </w:p>
     <w:p>
       <w:pPr>
-        <w:pStyle w:val="Zkladntext"/>
+        <w:pStyle w:val="BodyText"/>
       </w:pPr>
       <w:r>
         <w:lastRenderedPageBreak/>
@@ -4849,7 +4849,7 @@
     </w:p>
     <w:p>
       <w:pPr>
-        <w:pStyle w:val="Nadpis4"/>
+        <w:pStyle w:val="Heading4"/>
       </w:pPr>
       <w:bookmarkStart w:id="88" w:name="Xf0065e710a32a50741693c88aa01f7e1f79c936"/>
       <w:bookmarkEnd w:id="87"/>
@@ -4894,7 +4894,7 @@
     </w:p>
     <w:p>
       <w:pPr>
-        <w:pStyle w:val="Zkladntext"/>
+        <w:pStyle w:val="BodyText"/>
       </w:pPr>
       <w:r>
         <w:t>✔️ b. Yes, papers need to be submitted first</w:t>
@@ -4902,7 +4902,7 @@
     </w:p>
     <w:p>
       <w:pPr>
-        <w:pStyle w:val="Nadpis4"/>
+        <w:pStyle w:val="Heading4"/>
       </w:pPr>
       <w:bookmarkStart w:id="89" w:name="a.4.-will-you-use-a-limited-embargo"/>
       <w:bookmarkEnd w:id="88"/>
@@ -4947,7 +4947,7 @@
     </w:p>
     <w:p>
       <w:pPr>
-        <w:pStyle w:val="Zkladntext"/>
+        <w:pStyle w:val="BodyText"/>
       </w:pPr>
       <w:r>
         <w:t>✔️ c. Yes, data that is not legally restrained will be released after a fixed time period, unconditionally</w:t>
@@ -4955,7 +4955,7 @@
     </w:p>
     <w:p>
       <w:pPr>
-        <w:pStyle w:val="Nadpis4"/>
+        <w:pStyle w:val="Heading4"/>
       </w:pPr>
       <w:bookmarkStart w:id="90" w:name="X212ec0308097c507b5df9e33ff6be621f3a23d6"/>
       <w:r>
@@ -4999,7 +4999,7 @@
     </w:p>
     <w:p>
       <w:pPr>
-        <w:pStyle w:val="Zkladntext"/>
+        <w:pStyle w:val="BodyText"/>
       </w:pPr>
       <w:r>
         <w:t>After what period will restrictions on the reuse of data (except ethical and legal restrictions) fall away?</w:t>
@@ -5007,7 +5007,7 @@
     </w:p>
     <w:p>
       <w:pPr>
-        <w:pStyle w:val="Zkladntext"/>
+        <w:pStyle w:val="BodyText"/>
       </w:pPr>
       <w:r>
         <w:t>✔️ 10 days</w:t>
@@ -5018,9 +5018,8 @@
       <w:bookmarkEnd w:id="90"/>
     </w:p>
     <w:sectPr>
-      <w:headerReference w:type="default" r:id="rId25"/>
-      <w:footerReference w:type="default" r:id="rId26"/>
-      <w:headerReference w:type="first" r:id="rId27"/>
+      <w:headerReference w:type="default" r:id="rId26"/>
+      <w:footerReference w:type="default" r:id="rId27"/>
       <w:pgSz w:w="12240" w:h="15840"/>
       <w:pgMar w:top="1608" w:right="1417" w:bottom="1417" w:left="1417" w:header="708" w:footer="708" w:gutter="0"/>
       <w:cols w:space="708"/>
@@ -5032,7 +5031,7 @@
 </file>
 
 <file path=word/endnotes.xml><?xml version="1.0" encoding="utf-8"?>
-<w:endnotes xmlns:wpc="http://schemas.microsoft.com/office/word/2010/wordprocessingCanvas" xmlns:cx="http://schemas.microsoft.com/office/drawing/2014/chartex" xmlns:cx1="http://schemas.microsoft.com/office/drawing/2015/9/8/chartex" xmlns:cx2="http://schemas.microsoft.com/office/drawing/2015/10/21/chartex" xmlns:cx3="http://schemas.microsoft.com/office/drawing/2016/5/9/chartex" xmlns:cx4="http://schemas.microsoft.com/office/drawing/2016/5/10/chartex" xmlns:cx5="http://schemas.microsoft.com/office/drawing/2016/5/11/chartex" xmlns:cx6="http://schemas.microsoft.com/office/drawing/2016/5/12/chartex" xmlns:cx7="http://schemas.microsoft.com/office/drawing/2016/5/13/chartex" xmlns:cx8="http://schemas.microsoft.com/office/drawing/2016/5/14/chartex" xmlns:mc="http://schemas.openxmlformats.org/markup-compatibility/2006" xmlns:aink="http://schemas.microsoft.com/office/drawing/2016/ink" xmlns:am3d="http://schemas.microsoft.com/office/drawing/2017/model3d" xmlns:o="urn:schemas-microsoft-com:office:office" xmlns:r="http://schemas.openxmlformats.org/officeDocument/2006/relationships" xmlns:m="http://schemas.openxmlformats.org/officeDocument/2006/math" xmlns:v="urn:schemas-microsoft-com:vml" xmlns:wp14="http://schemas.microsoft.com/office/word/2010/wordprocessingDrawing" xmlns:wp="http://schemas.openxmlformats.org/drawingml/2006/wordprocessingDrawing" xmlns:w10="urn:schemas-microsoft-com:office:word" xmlns:w="http://schemas.openxmlformats.org/wordprocessingml/2006/main" xmlns:w14="http://schemas.microsoft.com/office/word/2010/wordml" xmlns:w15="http://schemas.microsoft.com/office/word/2012/wordml" xmlns:w16cex="http://schemas.microsoft.com/office/word/2018/wordml/cex" xmlns:w16cid="http://schemas.microsoft.com/office/word/2016/wordml/cid" xmlns:w16="http://schemas.microsoft.com/office/word/2018/wordml" xmlns:w16se="http://schemas.microsoft.com/office/word/2015/wordml/symex" xmlns:wpg="http://schemas.microsoft.com/office/word/2010/wordprocessingGroup" xmlns:wpi="http://schemas.microsoft.com/office/word/2010/wordprocessingInk" xmlns:wne="http://schemas.microsoft.com/office/word/2006/wordml" xmlns:wps="http://schemas.microsoft.com/office/word/2010/wordprocessingShape" mc:Ignorable="w14 w15 w16se w16cid w16 w16cex wp14">
+<w:endnotes xmlns:wpc="http://schemas.microsoft.com/office/word/2010/wordprocessingCanvas" xmlns:cx="http://schemas.microsoft.com/office/drawing/2014/chartex" xmlns:cx1="http://schemas.microsoft.com/office/drawing/2015/9/8/chartex" xmlns:cx2="http://schemas.microsoft.com/office/drawing/2015/10/21/chartex" xmlns:cx3="http://schemas.microsoft.com/office/drawing/2016/5/9/chartex" xmlns:cx4="http://schemas.microsoft.com/office/drawing/2016/5/10/chartex" xmlns:cx5="http://schemas.microsoft.com/office/drawing/2016/5/11/chartex" xmlns:cx6="http://schemas.microsoft.com/office/drawing/2016/5/12/chartex" xmlns:cx7="http://schemas.microsoft.com/office/drawing/2016/5/13/chartex" xmlns:cx8="http://schemas.microsoft.com/office/drawing/2016/5/14/chartex" xmlns:mc="http://schemas.openxmlformats.org/markup-compatibility/2006" xmlns:aink="http://schemas.microsoft.com/office/drawing/2016/ink" xmlns:am3d="http://schemas.microsoft.com/office/drawing/2017/model3d" xmlns:o="urn:schemas-microsoft-com:office:office" xmlns:oel="http://schemas.microsoft.com/office/2019/extlst" xmlns:r="http://schemas.openxmlformats.org/officeDocument/2006/relationships" xmlns:m="http://schemas.openxmlformats.org/officeDocument/2006/math" xmlns:v="urn:schemas-microsoft-com:vml" xmlns:wp14="http://schemas.microsoft.com/office/word/2010/wordprocessingDrawing" xmlns:wp="http://schemas.openxmlformats.org/drawingml/2006/wordprocessingDrawing" xmlns:w10="urn:schemas-microsoft-com:office:word" xmlns:w="http://schemas.openxmlformats.org/wordprocessingml/2006/main" xmlns:w14="http://schemas.microsoft.com/office/word/2010/wordml" xmlns:w15="http://schemas.microsoft.com/office/word/2012/wordml" xmlns:w16cex="http://schemas.microsoft.com/office/word/2018/wordml/cex" xmlns:w16cid="http://schemas.microsoft.com/office/word/2016/wordml/cid" xmlns:w16="http://schemas.microsoft.com/office/word/2018/wordml" xmlns:w16du="http://schemas.microsoft.com/office/word/2023/wordml/word16du" xmlns:w16sdtdh="http://schemas.microsoft.com/office/word/2020/wordml/sdtdatahash" xmlns:w16sdtfl="http://schemas.microsoft.com/office/word/2024/wordml/sdtformatlock" xmlns:w16se="http://schemas.microsoft.com/office/word/2015/wordml/symex" xmlns:wpg="http://schemas.microsoft.com/office/word/2010/wordprocessingGroup" xmlns:wpi="http://schemas.microsoft.com/office/word/2010/wordprocessingInk" xmlns:wne="http://schemas.microsoft.com/office/word/2006/wordml" xmlns:wps="http://schemas.microsoft.com/office/word/2010/wordprocessingShape" mc:Ignorable="w14 w15 w16se w16cid w16 w16cex w16sdtdh w16sdtfl w16du wp14">
   <w:endnote w:type="separator" w:id="-1">
     <w:p>
       <w:pPr>
@@ -5057,10 +5056,10 @@
 </file>
 
 <file path=word/footer1.xml><?xml version="1.0" encoding="utf-8"?>
-<w:ftr xmlns:wpc="http://schemas.microsoft.com/office/word/2010/wordprocessingCanvas" xmlns:cx="http://schemas.microsoft.com/office/drawing/2014/chartex" xmlns:cx1="http://schemas.microsoft.com/office/drawing/2015/9/8/chartex" xmlns:cx2="http://schemas.microsoft.com/office/drawing/2015/10/21/chartex" xmlns:cx3="http://schemas.microsoft.com/office/drawing/2016/5/9/chartex" xmlns:cx4="http://schemas.microsoft.com/office/drawing/2016/5/10/chartex" xmlns:cx5="http://schemas.microsoft.com/office/drawing/2016/5/11/chartex" xmlns:cx6="http://schemas.microsoft.com/office/drawing/2016/5/12/chartex" xmlns:cx7="http://schemas.microsoft.com/office/drawing/2016/5/13/chartex" xmlns:cx8="http://schemas.microsoft.com/office/drawing/2016/5/14/chartex" xmlns:mc="http://schemas.openxmlformats.org/markup-compatibility/2006" xmlns:aink="http://schemas.microsoft.com/office/drawing/2016/ink" xmlns:am3d="http://schemas.microsoft.com/office/drawing/2017/model3d" xmlns:o="urn:schemas-microsoft-com:office:office" xmlns:r="http://schemas.openxmlformats.org/officeDocument/2006/relationships" xmlns:m="http://schemas.openxmlformats.org/officeDocument/2006/math" xmlns:v="urn:schemas-microsoft-com:vml" xmlns:wp14="http://schemas.microsoft.com/office/word/2010/wordprocessingDrawing" xmlns:wp="http://schemas.openxmlformats.org/drawingml/2006/wordprocessingDrawing" xmlns:w10="urn:schemas-microsoft-com:office:word" xmlns:w="http://schemas.openxmlformats.org/wordprocessingml/2006/main" xmlns:w14="http://schemas.microsoft.com/office/word/2010/wordml" xmlns:w15="http://schemas.microsoft.com/office/word/2012/wordml" xmlns:w16cex="http://schemas.microsoft.com/office/word/2018/wordml/cex" xmlns:w16cid="http://schemas.microsoft.com/office/word/2016/wordml/cid" xmlns:w16="http://schemas.microsoft.com/office/word/2018/wordml" xmlns:w16se="http://schemas.microsoft.com/office/word/2015/wordml/symex" xmlns:wpg="http://schemas.microsoft.com/office/word/2010/wordprocessingGroup" xmlns:wpi="http://schemas.microsoft.com/office/word/2010/wordprocessingInk" xmlns:wne="http://schemas.microsoft.com/office/word/2006/wordml" xmlns:wps="http://schemas.microsoft.com/office/word/2010/wordprocessingShape" mc:Ignorable="w14 w15 w16se w16cid w16 w16cex wp14">
+<w:ftr xmlns:wpc="http://schemas.microsoft.com/office/word/2010/wordprocessingCanvas" xmlns:cx="http://schemas.microsoft.com/office/drawing/2014/chartex" xmlns:cx1="http://schemas.microsoft.com/office/drawing/2015/9/8/chartex" xmlns:cx2="http://schemas.microsoft.com/office/drawing/2015/10/21/chartex" xmlns:cx3="http://schemas.microsoft.com/office/drawing/2016/5/9/chartex" xmlns:cx4="http://schemas.microsoft.com/office/drawing/2016/5/10/chartex" xmlns:cx5="http://schemas.microsoft.com/office/drawing/2016/5/11/chartex" xmlns:cx6="http://schemas.microsoft.com/office/drawing/2016/5/12/chartex" xmlns:cx7="http://schemas.microsoft.com/office/drawing/2016/5/13/chartex" xmlns:cx8="http://schemas.microsoft.com/office/drawing/2016/5/14/chartex" xmlns:mc="http://schemas.openxmlformats.org/markup-compatibility/2006" xmlns:aink="http://schemas.microsoft.com/office/drawing/2016/ink" xmlns:am3d="http://schemas.microsoft.com/office/drawing/2017/model3d" xmlns:o="urn:schemas-microsoft-com:office:office" xmlns:oel="http://schemas.microsoft.com/office/2019/extlst" xmlns:r="http://schemas.openxmlformats.org/officeDocument/2006/relationships" xmlns:m="http://schemas.openxmlformats.org/officeDocument/2006/math" xmlns:v="urn:schemas-microsoft-com:vml" xmlns:wp14="http://schemas.microsoft.com/office/word/2010/wordprocessingDrawing" xmlns:wp="http://schemas.openxmlformats.org/drawingml/2006/wordprocessingDrawing" xmlns:w10="urn:schemas-microsoft-com:office:word" xmlns:w="http://schemas.openxmlformats.org/wordprocessingml/2006/main" xmlns:w14="http://schemas.microsoft.com/office/word/2010/wordml" xmlns:w15="http://schemas.microsoft.com/office/word/2012/wordml" xmlns:w16cex="http://schemas.microsoft.com/office/word/2018/wordml/cex" xmlns:w16cid="http://schemas.microsoft.com/office/word/2016/wordml/cid" xmlns:w16="http://schemas.microsoft.com/office/word/2018/wordml" xmlns:w16du="http://schemas.microsoft.com/office/word/2023/wordml/word16du" xmlns:w16sdtdh="http://schemas.microsoft.com/office/word/2020/wordml/sdtdatahash" xmlns:w16sdtfl="http://schemas.microsoft.com/office/word/2024/wordml/sdtformatlock" xmlns:w16se="http://schemas.microsoft.com/office/word/2015/wordml/symex" xmlns:wpg="http://schemas.microsoft.com/office/word/2010/wordprocessingGroup" xmlns:wpi="http://schemas.microsoft.com/office/word/2010/wordprocessingInk" xmlns:wne="http://schemas.microsoft.com/office/word/2006/wordml" xmlns:wps="http://schemas.microsoft.com/office/word/2010/wordprocessingShape" mc:Ignorable="w14 w15 w16se w16cid w16 w16cex w16sdtdh w16sdtfl w16du wp14">
   <w:p>
     <w:pPr>
-      <w:pStyle w:val="Zpat"/>
+      <w:pStyle w:val="Footer"/>
       <w:pBdr>
         <w:top w:val="single" w:sz="18" w:space="5" w:color="E36C0A" w:themeColor="accent6" w:themeShade="BF"/>
       </w:pBdr>
@@ -5089,33 +5088,20 @@
     <w:r>
       <w:t xml:space="preserve"> / </w:t>
     </w:r>
-    <w:r>
-      <w:fldChar w:fldCharType="begin"/>
-    </w:r>
-    <w:r>
-      <w:instrText xml:space="preserve"> NUMPAGES   \* MERGEFORMAT </w:instrText>
-    </w:r>
-    <w:r>
-      <w:fldChar w:fldCharType="separate"/>
-    </w:r>
-    <w:r>
-      <w:rPr>
-        <w:noProof/>
-      </w:rPr>
-      <w:t>16</w:t>
-    </w:r>
-    <w:r>
-      <w:rPr>
-        <w:noProof/>
-      </w:rPr>
-      <w:fldChar w:fldCharType="end"/>
-    </w:r>
+    <w:fldSimple w:instr=" NUMPAGES   \* MERGEFORMAT ">
+      <w:r>
+        <w:rPr>
+          <w:noProof/>
+        </w:rPr>
+        <w:t>16</w:t>
+      </w:r>
+    </w:fldSimple>
   </w:p>
 </w:ftr>
 </file>
 
 <file path=word/footnotes.xml><?xml version="1.0" encoding="utf-8"?>
-<w:footnotes xmlns:wpc="http://schemas.microsoft.com/office/word/2010/wordprocessingCanvas" xmlns:cx="http://schemas.microsoft.com/office/drawing/2014/chartex" xmlns:cx1="http://schemas.microsoft.com/office/drawing/2015/9/8/chartex" xmlns:cx2="http://schemas.microsoft.com/office/drawing/2015/10/21/chartex" xmlns:cx3="http://schemas.microsoft.com/office/drawing/2016/5/9/chartex" xmlns:cx4="http://schemas.microsoft.com/office/drawing/2016/5/10/chartex" xmlns:cx5="http://schemas.microsoft.com/office/drawing/2016/5/11/chartex" xmlns:cx6="http://schemas.microsoft.com/office/drawing/2016/5/12/chartex" xmlns:cx7="http://schemas.microsoft.com/office/drawing/2016/5/13/chartex" xmlns:cx8="http://schemas.microsoft.com/office/drawing/2016/5/14/chartex" xmlns:mc="http://schemas.openxmlformats.org/markup-compatibility/2006" xmlns:aink="http://schemas.microsoft.com/office/drawing/2016/ink" xmlns:am3d="http://schemas.microsoft.com/office/drawing/2017/model3d" xmlns:o="urn:schemas-microsoft-com:office:office" xmlns:r="http://schemas.openxmlformats.org/officeDocument/2006/relationships" xmlns:m="http://schemas.openxmlformats.org/officeDocument/2006/math" xmlns:v="urn:schemas-microsoft-com:vml" xmlns:wp14="http://schemas.microsoft.com/office/word/2010/wordprocessingDrawing" xmlns:wp="http://schemas.openxmlformats.org/drawingml/2006/wordprocessingDrawing" xmlns:w10="urn:schemas-microsoft-com:office:word" xmlns:w="http://schemas.openxmlformats.org/wordprocessingml/2006/main" xmlns:w14="http://schemas.microsoft.com/office/word/2010/wordml" xmlns:w15="http://schemas.microsoft.com/office/word/2012/wordml" xmlns:w16cex="http://schemas.microsoft.com/office/word/2018/wordml/cex" xmlns:w16cid="http://schemas.microsoft.com/office/word/2016/wordml/cid" xmlns:w16="http://schemas.microsoft.com/office/word/2018/wordml" xmlns:w16se="http://schemas.microsoft.com/office/word/2015/wordml/symex" xmlns:wpg="http://schemas.microsoft.com/office/word/2010/wordprocessingGroup" xmlns:wpi="http://schemas.microsoft.com/office/word/2010/wordprocessingInk" xmlns:wne="http://schemas.microsoft.com/office/word/2006/wordml" xmlns:wps="http://schemas.microsoft.com/office/word/2010/wordprocessingShape" mc:Ignorable="w14 w15 w16se w16cid w16 w16cex wp14">
+<w:footnotes xmlns:wpc="http://schemas.microsoft.com/office/word/2010/wordprocessingCanvas" xmlns:cx="http://schemas.microsoft.com/office/drawing/2014/chartex" xmlns:cx1="http://schemas.microsoft.com/office/drawing/2015/9/8/chartex" xmlns:cx2="http://schemas.microsoft.com/office/drawing/2015/10/21/chartex" xmlns:cx3="http://schemas.microsoft.com/office/drawing/2016/5/9/chartex" xmlns:cx4="http://schemas.microsoft.com/office/drawing/2016/5/10/chartex" xmlns:cx5="http://schemas.microsoft.com/office/drawing/2016/5/11/chartex" xmlns:cx6="http://schemas.microsoft.com/office/drawing/2016/5/12/chartex" xmlns:cx7="http://schemas.microsoft.com/office/drawing/2016/5/13/chartex" xmlns:cx8="http://schemas.microsoft.com/office/drawing/2016/5/14/chartex" xmlns:mc="http://schemas.openxmlformats.org/markup-compatibility/2006" xmlns:aink="http://schemas.microsoft.com/office/drawing/2016/ink" xmlns:am3d="http://schemas.microsoft.com/office/drawing/2017/model3d" xmlns:o="urn:schemas-microsoft-com:office:office" xmlns:oel="http://schemas.microsoft.com/office/2019/extlst" xmlns:r="http://schemas.openxmlformats.org/officeDocument/2006/relationships" xmlns:m="http://schemas.openxmlformats.org/officeDocument/2006/math" xmlns:v="urn:schemas-microsoft-com:vml" xmlns:wp14="http://schemas.microsoft.com/office/word/2010/wordprocessingDrawing" xmlns:wp="http://schemas.openxmlformats.org/drawingml/2006/wordprocessingDrawing" xmlns:w10="urn:schemas-microsoft-com:office:word" xmlns:w="http://schemas.openxmlformats.org/wordprocessingml/2006/main" xmlns:w14="http://schemas.microsoft.com/office/word/2010/wordml" xmlns:w15="http://schemas.microsoft.com/office/word/2012/wordml" xmlns:w16cex="http://schemas.microsoft.com/office/word/2018/wordml/cex" xmlns:w16cid="http://schemas.microsoft.com/office/word/2016/wordml/cid" xmlns:w16="http://schemas.microsoft.com/office/word/2018/wordml" xmlns:w16du="http://schemas.microsoft.com/office/word/2023/wordml/word16du" xmlns:w16sdtdh="http://schemas.microsoft.com/office/word/2020/wordml/sdtdatahash" xmlns:w16sdtfl="http://schemas.microsoft.com/office/word/2024/wordml/sdtformatlock" xmlns:w16se="http://schemas.microsoft.com/office/word/2015/wordml/symex" xmlns:wpg="http://schemas.microsoft.com/office/word/2010/wordprocessingGroup" xmlns:wpi="http://schemas.microsoft.com/office/word/2010/wordprocessingInk" xmlns:wne="http://schemas.microsoft.com/office/word/2006/wordml" xmlns:wps="http://schemas.microsoft.com/office/word/2010/wordprocessingShape" mc:Ignorable="w14 w15 w16se w16cid w16 w16cex w16sdtdh w16sdtfl w16du wp14">
   <w:footnote w:type="separator" w:id="-1">
     <w:p>
       <w:r>
@@ -5134,84 +5120,14 @@
 </file>
 
 <file path=word/header1.xml><?xml version="1.0" encoding="utf-8"?>
-<w:hdr xmlns:wpc="http://schemas.microsoft.com/office/word/2010/wordprocessingCanvas" xmlns:cx="http://schemas.microsoft.com/office/drawing/2014/chartex" xmlns:cx1="http://schemas.microsoft.com/office/drawing/2015/9/8/chartex" xmlns:cx2="http://schemas.microsoft.com/office/drawing/2015/10/21/chartex" xmlns:cx3="http://schemas.microsoft.com/office/drawing/2016/5/9/chartex" xmlns:cx4="http://schemas.microsoft.com/office/drawing/2016/5/10/chartex" xmlns:cx5="http://schemas.microsoft.com/office/drawing/2016/5/11/chartex" xmlns:cx6="http://schemas.microsoft.com/office/drawing/2016/5/12/chartex" xmlns:cx7="http://schemas.microsoft.com/office/drawing/2016/5/13/chartex" xmlns:cx8="http://schemas.microsoft.com/office/drawing/2016/5/14/chartex" xmlns:mc="http://schemas.openxmlformats.org/markup-compatibility/2006" xmlns:aink="http://schemas.microsoft.com/office/drawing/2016/ink" xmlns:am3d="http://schemas.microsoft.com/office/drawing/2017/model3d" xmlns:o="urn:schemas-microsoft-com:office:office" xmlns:r="http://schemas.openxmlformats.org/officeDocument/2006/relationships" xmlns:m="http://schemas.openxmlformats.org/officeDocument/2006/math" xmlns:v="urn:schemas-microsoft-com:vml" xmlns:wp14="http://schemas.microsoft.com/office/word/2010/wordprocessingDrawing" xmlns:wp="http://schemas.openxmlformats.org/drawingml/2006/wordprocessingDrawing" xmlns:w10="urn:schemas-microsoft-com:office:word" xmlns:w="http://schemas.openxmlformats.org/wordprocessingml/2006/main" xmlns:w14="http://schemas.microsoft.com/office/word/2010/wordml" xmlns:w15="http://schemas.microsoft.com/office/word/2012/wordml" xmlns:w16cex="http://schemas.microsoft.com/office/word/2018/wordml/cex" xmlns:w16cid="http://schemas.microsoft.com/office/word/2016/wordml/cid" xmlns:w16="http://schemas.microsoft.com/office/word/2018/wordml" xmlns:w16se="http://schemas.microsoft.com/office/word/2015/wordml/symex" xmlns:wpg="http://schemas.microsoft.com/office/word/2010/wordprocessingGroup" xmlns:wpi="http://schemas.microsoft.com/office/word/2010/wordprocessingInk" xmlns:wne="http://schemas.microsoft.com/office/word/2006/wordml" xmlns:wps="http://schemas.microsoft.com/office/word/2010/wordprocessingShape" mc:Ignorable="w14 w15 w16se w16cid w16 w16cex wp14">
+<w:hdr xmlns:wpc="http://schemas.microsoft.com/office/word/2010/wordprocessingCanvas" xmlns:cx="http://schemas.microsoft.com/office/drawing/2014/chartex" xmlns:cx1="http://schemas.microsoft.com/office/drawing/2015/9/8/chartex" xmlns:cx2="http://schemas.microsoft.com/office/drawing/2015/10/21/chartex" xmlns:cx3="http://schemas.microsoft.com/office/drawing/2016/5/9/chartex" xmlns:cx4="http://schemas.microsoft.com/office/drawing/2016/5/10/chartex" xmlns:cx5="http://schemas.microsoft.com/office/drawing/2016/5/11/chartex" xmlns:cx6="http://schemas.microsoft.com/office/drawing/2016/5/12/chartex" xmlns:cx7="http://schemas.microsoft.com/office/drawing/2016/5/13/chartex" xmlns:cx8="http://schemas.microsoft.com/office/drawing/2016/5/14/chartex" xmlns:mc="http://schemas.openxmlformats.org/markup-compatibility/2006" xmlns:aink="http://schemas.microsoft.com/office/drawing/2016/ink" xmlns:am3d="http://schemas.microsoft.com/office/drawing/2017/model3d" xmlns:o="urn:schemas-microsoft-com:office:office" xmlns:oel="http://schemas.microsoft.com/office/2019/extlst" xmlns:r="http://schemas.openxmlformats.org/officeDocument/2006/relationships" xmlns:m="http://schemas.openxmlformats.org/officeDocument/2006/math" xmlns:v="urn:schemas-microsoft-com:vml" xmlns:wp14="http://schemas.microsoft.com/office/word/2010/wordprocessingDrawing" xmlns:wp="http://schemas.openxmlformats.org/drawingml/2006/wordprocessingDrawing" xmlns:w10="urn:schemas-microsoft-com:office:word" xmlns:w="http://schemas.openxmlformats.org/wordprocessingml/2006/main" xmlns:w14="http://schemas.microsoft.com/office/word/2010/wordml" xmlns:w15="http://schemas.microsoft.com/office/word/2012/wordml" xmlns:w16cex="http://schemas.microsoft.com/office/word/2018/wordml/cex" xmlns:w16cid="http://schemas.microsoft.com/office/word/2016/wordml/cid" xmlns:w16="http://schemas.microsoft.com/office/word/2018/wordml" xmlns:w16du="http://schemas.microsoft.com/office/word/2023/wordml/word16du" xmlns:w16sdtdh="http://schemas.microsoft.com/office/word/2020/wordml/sdtdatahash" xmlns:w16sdtfl="http://schemas.microsoft.com/office/word/2024/wordml/sdtformatlock" xmlns:w16se="http://schemas.microsoft.com/office/word/2015/wordml/symex" xmlns:wpg="http://schemas.microsoft.com/office/word/2010/wordprocessingGroup" xmlns:wpi="http://schemas.microsoft.com/office/word/2010/wordprocessingInk" xmlns:wne="http://schemas.microsoft.com/office/word/2006/wordml" xmlns:wps="http://schemas.microsoft.com/office/word/2010/wordprocessingShape" mc:Ignorable="w14 w15 w16se w16cid w16 w16cex w16sdtdh w16sdtfl w16du wp14">
   <w:p>
     <w:pPr>
-      <w:pStyle w:val="Zhlav"/>
+      <w:pStyle w:val="Header"/>
       <w:pBdr>
         <w:bottom w:val="single" w:sz="18" w:space="1" w:color="E36C0A" w:themeColor="accent6" w:themeShade="BF"/>
       </w:pBdr>
     </w:pPr>
-    <w:r>
-      <w:rPr>
-        <w:noProof/>
-      </w:rPr>
-      <w:drawing>
-        <wp:anchor distT="0" distB="0" distL="114300" distR="114300" simplePos="0" relativeHeight="251658240" behindDoc="1" locked="0" layoutInCell="1" allowOverlap="1" wp14:anchorId="75C5E114" wp14:editId="4C2C0D19">
-          <wp:simplePos x="0" y="0"/>
-          <wp:positionH relativeFrom="column">
-            <wp:posOffset>52705</wp:posOffset>
-          </wp:positionH>
-          <wp:positionV relativeFrom="paragraph">
-            <wp:posOffset>-175260</wp:posOffset>
-          </wp:positionV>
-          <wp:extent cx="1097280" cy="493395"/>
-          <wp:effectExtent l="0" t="0" r="0" b="0"/>
-          <wp:wrapTight wrapText="bothSides">
-            <wp:wrapPolygon edited="0">
-              <wp:start x="4125" y="4170"/>
-              <wp:lineTo x="1875" y="17514"/>
-              <wp:lineTo x="4125" y="17514"/>
-              <wp:lineTo x="19125" y="15012"/>
-              <wp:lineTo x="19500" y="5838"/>
-              <wp:lineTo x="6375" y="4170"/>
-              <wp:lineTo x="4125" y="4170"/>
-            </wp:wrapPolygon>
-          </wp:wrapTight>
-          <wp:docPr id="3" name="Obrázek 3"/>
-          <wp:cNvGraphicFramePr>
-            <a:graphicFrameLocks xmlns:a="http://schemas.openxmlformats.org/drawingml/2006/main" noChangeAspect="1"/>
-          </wp:cNvGraphicFramePr>
-          <a:graphic xmlns:a="http://schemas.openxmlformats.org/drawingml/2006/main">
-            <a:graphicData uri="http://schemas.openxmlformats.org/drawingml/2006/picture">
-              <pic:pic xmlns:pic="http://schemas.openxmlformats.org/drawingml/2006/picture">
-                <pic:nvPicPr>
-                  <pic:cNvPr id="1" name="Obrázek 1"/>
-                  <pic:cNvPicPr/>
-                </pic:nvPicPr>
-                <pic:blipFill>
-                  <a:blip r:embed="rId1">
-                    <a:extLst>
-                      <a:ext uri="{28A0092B-C50C-407E-A947-70E740481C1C}">
-                        <a14:useLocalDpi xmlns:a14="http://schemas.microsoft.com/office/drawing/2010/main" val="0"/>
-                      </a:ext>
-                    </a:extLst>
-                  </a:blip>
-                  <a:stretch>
-                    <a:fillRect/>
-                  </a:stretch>
-                </pic:blipFill>
-                <pic:spPr>
-                  <a:xfrm>
-                    <a:off x="0" y="0"/>
-                    <a:ext cx="1097280" cy="493395"/>
-                  </a:xfrm>
-                  <a:prstGeom prst="rect">
-                    <a:avLst/>
-                  </a:prstGeom>
-                </pic:spPr>
-              </pic:pic>
-            </a:graphicData>
-          </a:graphic>
-          <wp14:sizeRelH relativeFrom="page">
-            <wp14:pctWidth>0</wp14:pctWidth>
-          </wp14:sizeRelH>
-          <wp14:sizeRelV relativeFrom="page">
-            <wp14:pctHeight>0</wp14:pctHeight>
-          </wp14:sizeRelV>
-        </wp:anchor>
-      </w:drawing>
-    </w:r>
     <w:r>
       <w:tab/>
     </w:r>
@@ -5229,7 +5145,6 @@
         <w:dataBinding w:prefixMappings="xmlns:ns0='http://purl.org/dc/elements/1.1/' xmlns:ns1='http://schemas.openxmlformats.org/package/2006/metadata/core-properties' " w:xpath="/ns1:coreProperties[1]/ns0:title[1]" w:storeItemID="{6C3C8BC8-F283-45AE-878A-BAB7291924A1}"/>
         <w:text/>
       </w:sdtPr>
-      <w:sdtEndPr/>
       <w:sdtContent>
         <w:r>
           <w:t>Example experiment</w:t>
@@ -5243,95 +5158,8 @@
 </w:hdr>
 </file>
 
-<file path=word/header2.xml><?xml version="1.0" encoding="utf-8"?>
-<w:hdr xmlns:wpc="http://schemas.microsoft.com/office/word/2010/wordprocessingCanvas" xmlns:cx="http://schemas.microsoft.com/office/drawing/2014/chartex" xmlns:cx1="http://schemas.microsoft.com/office/drawing/2015/9/8/chartex" xmlns:cx2="http://schemas.microsoft.com/office/drawing/2015/10/21/chartex" xmlns:cx3="http://schemas.microsoft.com/office/drawing/2016/5/9/chartex" xmlns:cx4="http://schemas.microsoft.com/office/drawing/2016/5/10/chartex" xmlns:cx5="http://schemas.microsoft.com/office/drawing/2016/5/11/chartex" xmlns:cx6="http://schemas.microsoft.com/office/drawing/2016/5/12/chartex" xmlns:cx7="http://schemas.microsoft.com/office/drawing/2016/5/13/chartex" xmlns:cx8="http://schemas.microsoft.com/office/drawing/2016/5/14/chartex" xmlns:mc="http://schemas.openxmlformats.org/markup-compatibility/2006" xmlns:aink="http://schemas.microsoft.com/office/drawing/2016/ink" xmlns:am3d="http://schemas.microsoft.com/office/drawing/2017/model3d" xmlns:o="urn:schemas-microsoft-com:office:office" xmlns:r="http://schemas.openxmlformats.org/officeDocument/2006/relationships" xmlns:m="http://schemas.openxmlformats.org/officeDocument/2006/math" xmlns:v="urn:schemas-microsoft-com:vml" xmlns:wp14="http://schemas.microsoft.com/office/word/2010/wordprocessingDrawing" xmlns:wp="http://schemas.openxmlformats.org/drawingml/2006/wordprocessingDrawing" xmlns:w10="urn:schemas-microsoft-com:office:word" xmlns:w="http://schemas.openxmlformats.org/wordprocessingml/2006/main" xmlns:w14="http://schemas.microsoft.com/office/word/2010/wordml" xmlns:w15="http://schemas.microsoft.com/office/word/2012/wordml" xmlns:w16cex="http://schemas.microsoft.com/office/word/2018/wordml/cex" xmlns:w16cid="http://schemas.microsoft.com/office/word/2016/wordml/cid" xmlns:w16="http://schemas.microsoft.com/office/word/2018/wordml" xmlns:w16se="http://schemas.microsoft.com/office/word/2015/wordml/symex" xmlns:wpg="http://schemas.microsoft.com/office/word/2010/wordprocessingGroup" xmlns:wpi="http://schemas.microsoft.com/office/word/2010/wordprocessingInk" xmlns:wne="http://schemas.microsoft.com/office/word/2006/wordml" xmlns:wps="http://schemas.microsoft.com/office/word/2010/wordprocessingShape" mc:Ignorable="w14 w15 w16se w16cid w16 w16cex wp14">
-  <w:p>
-    <w:pPr>
-      <w:pStyle w:val="Zhlav"/>
-    </w:pPr>
-    <w:r>
-      <w:rPr>
-        <w:noProof/>
-      </w:rPr>
-      <w:drawing>
-        <wp:anchor distT="0" distB="0" distL="114300" distR="114300" simplePos="0" relativeHeight="251660288" behindDoc="1" locked="0" layoutInCell="1" allowOverlap="1" wp14:anchorId="48F3FA60" wp14:editId="2710E3BA">
-          <wp:simplePos x="0" y="0"/>
-          <wp:positionH relativeFrom="margin">
-            <wp:align>center</wp:align>
-          </wp:positionH>
-          <wp:positionV relativeFrom="paragraph">
-            <wp:posOffset>2705100</wp:posOffset>
-          </wp:positionV>
-          <wp:extent cx="3634740" cy="1635125"/>
-          <wp:effectExtent l="0" t="0" r="0" b="0"/>
-          <wp:wrapTight wrapText="bothSides">
-            <wp:wrapPolygon edited="0">
-              <wp:start x="4868" y="5285"/>
-              <wp:lineTo x="4415" y="9814"/>
-              <wp:lineTo x="3962" y="12331"/>
-              <wp:lineTo x="3962" y="13841"/>
-              <wp:lineTo x="2377" y="15602"/>
-              <wp:lineTo x="2377" y="16357"/>
-              <wp:lineTo x="2943" y="16357"/>
-              <wp:lineTo x="18566" y="14596"/>
-              <wp:lineTo x="18453" y="13841"/>
-              <wp:lineTo x="18906" y="9814"/>
-              <wp:lineTo x="19472" y="7046"/>
-              <wp:lineTo x="18340" y="6795"/>
-              <wp:lineTo x="5547" y="5285"/>
-              <wp:lineTo x="4868" y="5285"/>
-            </wp:wrapPolygon>
-          </wp:wrapTight>
-          <wp:docPr id="4" name="Obrázek 4"/>
-          <wp:cNvGraphicFramePr>
-            <a:graphicFrameLocks xmlns:a="http://schemas.openxmlformats.org/drawingml/2006/main" noChangeAspect="1"/>
-          </wp:cNvGraphicFramePr>
-          <a:graphic xmlns:a="http://schemas.openxmlformats.org/drawingml/2006/main">
-            <a:graphicData uri="http://schemas.openxmlformats.org/drawingml/2006/picture">
-              <pic:pic xmlns:pic="http://schemas.openxmlformats.org/drawingml/2006/picture">
-                <pic:nvPicPr>
-                  <pic:cNvPr id="4" name="Obrázek 4"/>
-                  <pic:cNvPicPr/>
-                </pic:nvPicPr>
-                <pic:blipFill>
-                  <a:blip r:embed="rId1">
-                    <a:extLst>
-                      <a:ext uri="{28A0092B-C50C-407E-A947-70E740481C1C}">
-                        <a14:useLocalDpi xmlns:a14="http://schemas.microsoft.com/office/drawing/2010/main" val="0"/>
-                      </a:ext>
-                    </a:extLst>
-                  </a:blip>
-                  <a:stretch>
-                    <a:fillRect/>
-                  </a:stretch>
-                </pic:blipFill>
-                <pic:spPr>
-                  <a:xfrm>
-                    <a:off x="0" y="0"/>
-                    <a:ext cx="3634740" cy="1635125"/>
-                  </a:xfrm>
-                  <a:prstGeom prst="rect">
-                    <a:avLst/>
-                  </a:prstGeom>
-                </pic:spPr>
-              </pic:pic>
-            </a:graphicData>
-          </a:graphic>
-          <wp14:sizeRelH relativeFrom="page">
-            <wp14:pctWidth>0</wp14:pctWidth>
-          </wp14:sizeRelH>
-          <wp14:sizeRelV relativeFrom="page">
-            <wp14:pctHeight>0</wp14:pctHeight>
-          </wp14:sizeRelV>
-        </wp:anchor>
-      </w:drawing>
-    </w:r>
-  </w:p>
-</w:hdr>
-</file>
-
 <file path=word/numbering.xml><?xml version="1.0" encoding="utf-8"?>
-<w:numbering xmlns:wpc="http://schemas.microsoft.com/office/word/2010/wordprocessingCanvas" xmlns:cx="http://schemas.microsoft.com/office/drawing/2014/chartex" xmlns:cx1="http://schemas.microsoft.com/office/drawing/2015/9/8/chartex" xmlns:cx2="http://schemas.microsoft.com/office/drawing/2015/10/21/chartex" xmlns:cx3="http://schemas.microsoft.com/office/drawing/2016/5/9/chartex" xmlns:cx4="http://schemas.microsoft.com/office/drawing/2016/5/10/chartex" xmlns:cx5="http://schemas.microsoft.com/office/drawing/2016/5/11/chartex" xmlns:cx6="http://schemas.microsoft.com/office/drawing/2016/5/12/chartex" xmlns:cx7="http://schemas.microsoft.com/office/drawing/2016/5/13/chartex" xmlns:cx8="http://schemas.microsoft.com/office/drawing/2016/5/14/chartex" xmlns:mc="http://schemas.openxmlformats.org/markup-compatibility/2006" xmlns:aink="http://schemas.microsoft.com/office/drawing/2016/ink" xmlns:am3d="http://schemas.microsoft.com/office/drawing/2017/model3d" xmlns:o="urn:schemas-microsoft-com:office:office" xmlns:r="http://schemas.openxmlformats.org/officeDocument/2006/relationships" xmlns:m="http://schemas.openxmlformats.org/officeDocument/2006/math" xmlns:v="urn:schemas-microsoft-com:vml" xmlns:wp14="http://schemas.microsoft.com/office/word/2010/wordprocessingDrawing" xmlns:wp="http://schemas.openxmlformats.org/drawingml/2006/wordprocessingDrawing" xmlns:w10="urn:schemas-microsoft-com:office:word" xmlns:w="http://schemas.openxmlformats.org/wordprocessingml/2006/main" xmlns:w14="http://schemas.microsoft.com/office/word/2010/wordml" xmlns:w15="http://schemas.microsoft.com/office/word/2012/wordml" xmlns:w16cex="http://schemas.microsoft.com/office/word/2018/wordml/cex" xmlns:w16cid="http://schemas.microsoft.com/office/word/2016/wordml/cid" xmlns:w16="http://schemas.microsoft.com/office/word/2018/wordml" xmlns:w16se="http://schemas.microsoft.com/office/word/2015/wordml/symex" xmlns:wpg="http://schemas.microsoft.com/office/word/2010/wordprocessingGroup" xmlns:wpi="http://schemas.microsoft.com/office/word/2010/wordprocessingInk" xmlns:wne="http://schemas.microsoft.com/office/word/2006/wordml" xmlns:wps="http://schemas.microsoft.com/office/word/2010/wordprocessingShape" mc:Ignorable="w14 w15 w16se w16cid w16 w16cex wp14">
+<w:numbering xmlns:wpc="http://schemas.microsoft.com/office/word/2010/wordprocessingCanvas" xmlns:cx="http://schemas.microsoft.com/office/drawing/2014/chartex" xmlns:cx1="http://schemas.microsoft.com/office/drawing/2015/9/8/chartex" xmlns:cx2="http://schemas.microsoft.com/office/drawing/2015/10/21/chartex" xmlns:cx3="http://schemas.microsoft.com/office/drawing/2016/5/9/chartex" xmlns:cx4="http://schemas.microsoft.com/office/drawing/2016/5/10/chartex" xmlns:cx5="http://schemas.microsoft.com/office/drawing/2016/5/11/chartex" xmlns:cx6="http://schemas.microsoft.com/office/drawing/2016/5/12/chartex" xmlns:cx7="http://schemas.microsoft.com/office/drawing/2016/5/13/chartex" xmlns:cx8="http://schemas.microsoft.com/office/drawing/2016/5/14/chartex" xmlns:mc="http://schemas.openxmlformats.org/markup-compatibility/2006" xmlns:aink="http://schemas.microsoft.com/office/drawing/2016/ink" xmlns:am3d="http://schemas.microsoft.com/office/drawing/2017/model3d" xmlns:o="urn:schemas-microsoft-com:office:office" xmlns:oel="http://schemas.microsoft.com/office/2019/extlst" xmlns:r="http://schemas.openxmlformats.org/officeDocument/2006/relationships" xmlns:m="http://schemas.openxmlformats.org/officeDocument/2006/math" xmlns:v="urn:schemas-microsoft-com:vml" xmlns:wp14="http://schemas.microsoft.com/office/word/2010/wordprocessingDrawing" xmlns:wp="http://schemas.openxmlformats.org/drawingml/2006/wordprocessingDrawing" xmlns:w10="urn:schemas-microsoft-com:office:word" xmlns:w="http://schemas.openxmlformats.org/wordprocessingml/2006/main" xmlns:w14="http://schemas.microsoft.com/office/word/2010/wordml" xmlns:w15="http://schemas.microsoft.com/office/word/2012/wordml" xmlns:w16cex="http://schemas.microsoft.com/office/word/2018/wordml/cex" xmlns:w16cid="http://schemas.microsoft.com/office/word/2016/wordml/cid" xmlns:w16="http://schemas.microsoft.com/office/word/2018/wordml" xmlns:w16du="http://schemas.microsoft.com/office/word/2023/wordml/word16du" xmlns:w16sdtdh="http://schemas.microsoft.com/office/word/2020/wordml/sdtdatahash" xmlns:w16sdtfl="http://schemas.microsoft.com/office/word/2024/wordml/sdtformatlock" xmlns:w16se="http://schemas.microsoft.com/office/word/2015/wordml/symex" xmlns:wpg="http://schemas.microsoft.com/office/word/2010/wordprocessingGroup" xmlns:wpi="http://schemas.microsoft.com/office/word/2010/wordprocessingInk" xmlns:wne="http://schemas.microsoft.com/office/word/2006/wordml" xmlns:wps="http://schemas.microsoft.com/office/word/2010/wordprocessingShape" mc:Ignorable="w14 w15 w16se w16cid w16 w16cex w16sdtdh w16sdtfl w16du wp14">
   <w:abstractNum w:abstractNumId="0" w15:restartNumberingAfterBreak="0">
     <w:nsid w:val="0000A990"/>
     <w:multiLevelType w:val="multilevel"/>
@@ -5409,14 +5237,14 @@
       </w:pPr>
     </w:lvl>
   </w:abstractNum>
-  <w:num w:numId="1">
+  <w:num w:numId="1" w16cid:durableId="2104451501">
     <w:abstractNumId w:val="0"/>
   </w:num>
 </w:numbering>
 </file>
 
 <file path=word/styles.xml><?xml version="1.0" encoding="utf-8"?>
-<w:styles xmlns:mc="http://schemas.openxmlformats.org/markup-compatibility/2006" xmlns:r="http://schemas.openxmlformats.org/officeDocument/2006/relationships" xmlns:w="http://schemas.openxmlformats.org/wordprocessingml/2006/main" xmlns:w14="http://schemas.microsoft.com/office/word/2010/wordml" xmlns:w15="http://schemas.microsoft.com/office/word/2012/wordml" xmlns:w16cex="http://schemas.microsoft.com/office/word/2018/wordml/cex" xmlns:w16cid="http://schemas.microsoft.com/office/word/2016/wordml/cid" xmlns:w16="http://schemas.microsoft.com/office/word/2018/wordml" xmlns:w16se="http://schemas.microsoft.com/office/word/2015/wordml/symex" mc:Ignorable="w14 w15 w16se w16cid w16 w16cex">
+<w:styles xmlns:mc="http://schemas.openxmlformats.org/markup-compatibility/2006" xmlns:r="http://schemas.openxmlformats.org/officeDocument/2006/relationships" xmlns:w="http://schemas.openxmlformats.org/wordprocessingml/2006/main" xmlns:w14="http://schemas.microsoft.com/office/word/2010/wordml" xmlns:w15="http://schemas.microsoft.com/office/word/2012/wordml" xmlns:w16cex="http://schemas.microsoft.com/office/word/2018/wordml/cex" xmlns:w16cid="http://schemas.microsoft.com/office/word/2016/wordml/cid" xmlns:w16="http://schemas.microsoft.com/office/word/2018/wordml" xmlns:w16du="http://schemas.microsoft.com/office/word/2023/wordml/word16du" xmlns:w16sdtdh="http://schemas.microsoft.com/office/word/2020/wordml/sdtdatahash" xmlns:w16sdtfl="http://schemas.microsoft.com/office/word/2024/wordml/sdtformatlock" xmlns:w16se="http://schemas.microsoft.com/office/word/2015/wordml/symex" mc:Ignorable="w14 w15 w16se w16cid w16 w16cex w16sdtdh w16sdtfl w16du">
   <w:docDefaults>
     <w:rPrDefault>
       <w:rPr>
@@ -5770,14 +5598,14 @@
     <w:lsdException w:name="Unresolved Mention" w:semiHidden="1" w:uiPriority="99" w:unhideWhenUsed="1"/>
     <w:lsdException w:name="Smart Link" w:semiHidden="1" w:uiPriority="99" w:unhideWhenUsed="1"/>
   </w:latentStyles>
-  <w:style w:type="paragraph" w:default="1" w:styleId="Normln">
+  <w:style w:type="paragraph" w:default="1" w:styleId="Normal">
     <w:name w:val="Normal"/>
     <w:qFormat/>
   </w:style>
-  <w:style w:type="paragraph" w:styleId="Nadpis1">
+  <w:style w:type="paragraph" w:styleId="Heading1">
     <w:name w:val="heading 1"/>
-    <w:basedOn w:val="Normln"/>
-    <w:next w:val="Zkladntext"/>
+    <w:basedOn w:val="Normal"/>
+    <w:next w:val="BodyText"/>
     <w:uiPriority w:val="9"/>
     <w:qFormat/>
     <w:pPr>
@@ -5795,10 +5623,10 @@
       <w:szCs w:val="32"/>
     </w:rPr>
   </w:style>
-  <w:style w:type="paragraph" w:styleId="Nadpis2">
+  <w:style w:type="paragraph" w:styleId="Heading2">
     <w:name w:val="heading 2"/>
-    <w:basedOn w:val="Normln"/>
-    <w:next w:val="Zkladntext"/>
+    <w:basedOn w:val="Normal"/>
+    <w:next w:val="BodyText"/>
     <w:uiPriority w:val="9"/>
     <w:unhideWhenUsed/>
     <w:qFormat/>
@@ -5817,10 +5645,10 @@
       <w:szCs w:val="28"/>
     </w:rPr>
   </w:style>
-  <w:style w:type="paragraph" w:styleId="Nadpis3">
+  <w:style w:type="paragraph" w:styleId="Heading3">
     <w:name w:val="heading 3"/>
-    <w:basedOn w:val="Normln"/>
-    <w:next w:val="Zkladntext"/>
+    <w:basedOn w:val="Normal"/>
+    <w:next w:val="BodyText"/>
     <w:uiPriority w:val="9"/>
     <w:unhideWhenUsed/>
     <w:qFormat/>
@@ -5837,10 +5665,10 @@
       <w:color w:val="4F81BD" w:themeColor="accent1"/>
     </w:rPr>
   </w:style>
-  <w:style w:type="paragraph" w:styleId="Nadpis4">
+  <w:style w:type="paragraph" w:styleId="Heading4">
     <w:name w:val="heading 4"/>
-    <w:basedOn w:val="Normln"/>
-    <w:next w:val="Zkladntext"/>
+    <w:basedOn w:val="Normal"/>
+    <w:next w:val="BodyText"/>
     <w:uiPriority w:val="9"/>
     <w:unhideWhenUsed/>
     <w:qFormat/>
@@ -5857,10 +5685,10 @@
       <w:color w:val="4F81BD" w:themeColor="accent1"/>
     </w:rPr>
   </w:style>
-  <w:style w:type="paragraph" w:styleId="Nadpis5">
+  <w:style w:type="paragraph" w:styleId="Heading5">
     <w:name w:val="heading 5"/>
-    <w:basedOn w:val="Normln"/>
-    <w:next w:val="Zkladntext"/>
+    <w:basedOn w:val="Normal"/>
+    <w:next w:val="BodyText"/>
     <w:uiPriority w:val="9"/>
     <w:unhideWhenUsed/>
     <w:qFormat/>
@@ -5876,10 +5704,10 @@
       <w:color w:val="4F81BD" w:themeColor="accent1"/>
     </w:rPr>
   </w:style>
-  <w:style w:type="paragraph" w:styleId="Nadpis6">
+  <w:style w:type="paragraph" w:styleId="Heading6">
     <w:name w:val="heading 6"/>
-    <w:basedOn w:val="Normln"/>
-    <w:next w:val="Zkladntext"/>
+    <w:basedOn w:val="Normal"/>
+    <w:next w:val="BodyText"/>
     <w:uiPriority w:val="9"/>
     <w:unhideWhenUsed/>
     <w:qFormat/>
@@ -5894,10 +5722,10 @@
       <w:color w:val="4F81BD" w:themeColor="accent1"/>
     </w:rPr>
   </w:style>
-  <w:style w:type="paragraph" w:styleId="Nadpis7">
+  <w:style w:type="paragraph" w:styleId="Heading7">
     <w:name w:val="heading 7"/>
-    <w:basedOn w:val="Normln"/>
-    <w:next w:val="Zkladntext"/>
+    <w:basedOn w:val="Normal"/>
+    <w:next w:val="BodyText"/>
     <w:uiPriority w:val="9"/>
     <w:unhideWhenUsed/>
     <w:qFormat/>
@@ -5912,10 +5740,10 @@
       <w:color w:val="4F81BD" w:themeColor="accent1"/>
     </w:rPr>
   </w:style>
-  <w:style w:type="paragraph" w:styleId="Nadpis8">
+  <w:style w:type="paragraph" w:styleId="Heading8">
     <w:name w:val="heading 8"/>
-    <w:basedOn w:val="Normln"/>
-    <w:next w:val="Zkladntext"/>
+    <w:basedOn w:val="Normal"/>
+    <w:next w:val="BodyText"/>
     <w:uiPriority w:val="9"/>
     <w:unhideWhenUsed/>
     <w:qFormat/>
@@ -5930,10 +5758,10 @@
       <w:color w:val="4F81BD" w:themeColor="accent1"/>
     </w:rPr>
   </w:style>
-  <w:style w:type="paragraph" w:styleId="Nadpis9">
+  <w:style w:type="paragraph" w:styleId="Heading9">
     <w:name w:val="heading 9"/>
-    <w:basedOn w:val="Normln"/>
-    <w:next w:val="Zkladntext"/>
+    <w:basedOn w:val="Normal"/>
+    <w:next w:val="BodyText"/>
     <w:uiPriority w:val="9"/>
     <w:unhideWhenUsed/>
     <w:qFormat/>
@@ -5948,13 +5776,13 @@
       <w:color w:val="4F81BD" w:themeColor="accent1"/>
     </w:rPr>
   </w:style>
-  <w:style w:type="character" w:default="1" w:styleId="Standardnpsmoodstavce">
+  <w:style w:type="character" w:default="1" w:styleId="DefaultParagraphFont">
     <w:name w:val="Default Paragraph Font"/>
     <w:uiPriority w:val="1"/>
     <w:semiHidden/>
     <w:unhideWhenUsed/>
   </w:style>
-  <w:style w:type="table" w:default="1" w:styleId="Normlntabulka">
+  <w:style w:type="table" w:default="1" w:styleId="TableNormal">
     <w:name w:val="Normal Table"/>
     <w:uiPriority w:val="99"/>
     <w:semiHidden/>
@@ -5969,15 +5797,15 @@
       </w:tblCellMar>
     </w:tblPr>
   </w:style>
-  <w:style w:type="numbering" w:default="1" w:styleId="Bezseznamu">
+  <w:style w:type="numbering" w:default="1" w:styleId="NoList">
     <w:name w:val="No List"/>
     <w:uiPriority w:val="99"/>
     <w:semiHidden/>
     <w:unhideWhenUsed/>
   </w:style>
-  <w:style w:type="paragraph" w:styleId="Zkladntext">
+  <w:style w:type="paragraph" w:styleId="BodyText">
     <w:name w:val="Body Text"/>
-    <w:basedOn w:val="Normln"/>
+    <w:basedOn w:val="Normal"/>
     <w:qFormat/>
     <w:rsid w:val="009F4950"/>
     <w:pPr>
@@ -5987,23 +5815,23 @@
   </w:style>
   <w:style w:type="paragraph" w:customStyle="1" w:styleId="FirstParagraph">
     <w:name w:val="First Paragraph"/>
-    <w:basedOn w:val="Zkladntext"/>
-    <w:next w:val="Zkladntext"/>
+    <w:basedOn w:val="BodyText"/>
+    <w:next w:val="BodyText"/>
     <w:qFormat/>
     <w:rsid w:val="009F4950"/>
   </w:style>
   <w:style w:type="paragraph" w:customStyle="1" w:styleId="Compact">
     <w:name w:val="Compact"/>
-    <w:basedOn w:val="Zkladntext"/>
+    <w:basedOn w:val="BodyText"/>
     <w:qFormat/>
     <w:pPr>
       <w:spacing w:before="36" w:after="36"/>
     </w:pPr>
   </w:style>
-  <w:style w:type="paragraph" w:styleId="Nzev">
+  <w:style w:type="paragraph" w:styleId="Title">
     <w:name w:val="Title"/>
-    <w:basedOn w:val="Normln"/>
-    <w:next w:val="Zkladntext"/>
+    <w:basedOn w:val="Normal"/>
+    <w:next w:val="BodyText"/>
     <w:qFormat/>
     <w:rsid w:val="009F4950"/>
     <w:pPr>
@@ -6020,10 +5848,10 @@
       <w:szCs w:val="36"/>
     </w:rPr>
   </w:style>
-  <w:style w:type="paragraph" w:styleId="Podnadpis">
+  <w:style w:type="paragraph" w:styleId="Subtitle">
     <w:name w:val="Subtitle"/>
-    <w:basedOn w:val="Nzev"/>
-    <w:next w:val="Zkladntext"/>
+    <w:basedOn w:val="Title"/>
+    <w:next w:val="BodyText"/>
     <w:qFormat/>
     <w:pPr>
       <w:spacing w:before="240" w:after="240"/>
@@ -6035,7 +5863,7 @@
   </w:style>
   <w:style w:type="paragraph" w:customStyle="1" w:styleId="Author">
     <w:name w:val="Author"/>
-    <w:next w:val="Zkladntext"/>
+    <w:next w:val="BodyText"/>
     <w:qFormat/>
     <w:pPr>
       <w:keepNext/>
@@ -6043,9 +5871,9 @@
       <w:jc w:val="center"/>
     </w:pPr>
   </w:style>
-  <w:style w:type="paragraph" w:styleId="Datum">
+  <w:style w:type="paragraph" w:styleId="Date">
     <w:name w:val="Date"/>
-    <w:next w:val="Zkladntext"/>
+    <w:next w:val="BodyText"/>
     <w:qFormat/>
     <w:pPr>
       <w:keepNext/>
@@ -6055,8 +5883,8 @@
   </w:style>
   <w:style w:type="paragraph" w:customStyle="1" w:styleId="Abstract">
     <w:name w:val="Abstract"/>
-    <w:basedOn w:val="Normln"/>
-    <w:next w:val="Zkladntext"/>
+    <w:basedOn w:val="Normal"/>
+    <w:next w:val="BodyText"/>
     <w:qFormat/>
     <w:pPr>
       <w:keepNext/>
@@ -6068,15 +5896,15 @@
       <w:szCs w:val="20"/>
     </w:rPr>
   </w:style>
-  <w:style w:type="paragraph" w:styleId="Bibliografie">
+  <w:style w:type="paragraph" w:styleId="Bibliography">
     <w:name w:val="Bibliography"/>
-    <w:basedOn w:val="Normln"/>
+    <w:basedOn w:val="Normal"/>
     <w:qFormat/>
   </w:style>
-  <w:style w:type="paragraph" w:styleId="Textvbloku">
+  <w:style w:type="paragraph" w:styleId="BlockText">
     <w:name w:val="Block Text"/>
-    <w:basedOn w:val="Zkladntext"/>
-    <w:next w:val="Zkladntext"/>
+    <w:basedOn w:val="BodyText"/>
+    <w:next w:val="BodyText"/>
     <w:uiPriority w:val="9"/>
     <w:unhideWhenUsed/>
     <w:qFormat/>
@@ -6085,9 +5913,9 @@
       <w:ind w:left="480" w:right="480"/>
     </w:pPr>
   </w:style>
-  <w:style w:type="paragraph" w:styleId="Textpoznpodarou">
+  <w:style w:type="paragraph" w:styleId="FootnoteText">
     <w:name w:val="footnote text"/>
-    <w:basedOn w:val="Normln"/>
+    <w:basedOn w:val="Normal"/>
     <w:uiPriority w:val="9"/>
     <w:unhideWhenUsed/>
     <w:qFormat/>
@@ -6123,7 +5951,7 @@
   </w:style>
   <w:style w:type="paragraph" w:customStyle="1" w:styleId="DefinitionTerm">
     <w:name w:val="Definition Term"/>
-    <w:basedOn w:val="Normln"/>
+    <w:basedOn w:val="Normal"/>
     <w:next w:val="Definition"/>
     <w:pPr>
       <w:keepNext/>
@@ -6136,12 +5964,12 @@
   </w:style>
   <w:style w:type="paragraph" w:customStyle="1" w:styleId="Definition">
     <w:name w:val="Definition"/>
-    <w:basedOn w:val="Normln"/>
-  </w:style>
-  <w:style w:type="paragraph" w:styleId="Titulek">
+    <w:basedOn w:val="Normal"/>
+  </w:style>
+  <w:style w:type="paragraph" w:styleId="Caption">
     <w:name w:val="caption"/>
-    <w:basedOn w:val="Normln"/>
-    <w:link w:val="TitulekChar"/>
+    <w:basedOn w:val="Normal"/>
+    <w:link w:val="CaptionChar"/>
     <w:pPr>
       <w:spacing w:after="120"/>
     </w:pPr>
@@ -6151,18 +5979,18 @@
   </w:style>
   <w:style w:type="paragraph" w:customStyle="1" w:styleId="TableCaption">
     <w:name w:val="Table Caption"/>
-    <w:basedOn w:val="Titulek"/>
+    <w:basedOn w:val="Caption"/>
     <w:pPr>
       <w:keepNext/>
     </w:pPr>
   </w:style>
   <w:style w:type="paragraph" w:customStyle="1" w:styleId="ImageCaption">
     <w:name w:val="Image Caption"/>
-    <w:basedOn w:val="Titulek"/>
+    <w:basedOn w:val="Caption"/>
   </w:style>
   <w:style w:type="paragraph" w:customStyle="1" w:styleId="Figure">
     <w:name w:val="Figure"/>
-    <w:basedOn w:val="Normln"/>
+    <w:basedOn w:val="Normal"/>
   </w:style>
   <w:style w:type="paragraph" w:customStyle="1" w:styleId="CaptionedFigure">
     <w:name w:val="Captioned Figure"/>
@@ -6171,14 +5999,14 @@
       <w:keepNext/>
     </w:pPr>
   </w:style>
-  <w:style w:type="character" w:customStyle="1" w:styleId="TitulekChar">
-    <w:name w:val="Titulek Char"/>
-    <w:basedOn w:val="Standardnpsmoodstavce"/>
-    <w:link w:val="Titulek"/>
+  <w:style w:type="character" w:customStyle="1" w:styleId="CaptionChar">
+    <w:name w:val="Caption Char"/>
+    <w:basedOn w:val="DefaultParagraphFont"/>
+    <w:link w:val="Caption"/>
   </w:style>
   <w:style w:type="character" w:customStyle="1" w:styleId="VerbatimChar">
     <w:name w:val="Verbatim Char"/>
-    <w:basedOn w:val="TitulekChar"/>
+    <w:basedOn w:val="CaptionChar"/>
     <w:link w:val="SourceCode"/>
     <w:rPr>
       <w:rFonts w:ascii="Consolas" w:hAnsi="Consolas"/>
@@ -6187,26 +6015,26 @@
   </w:style>
   <w:style w:type="character" w:customStyle="1" w:styleId="SectionNumber">
     <w:name w:val="Section Number"/>
-    <w:basedOn w:val="TitulekChar"/>
-  </w:style>
-  <w:style w:type="character" w:styleId="Znakapoznpodarou">
+    <w:basedOn w:val="CaptionChar"/>
+  </w:style>
+  <w:style w:type="character" w:styleId="FootnoteReference">
     <w:name w:val="footnote reference"/>
-    <w:basedOn w:val="TitulekChar"/>
+    <w:basedOn w:val="CaptionChar"/>
     <w:rPr>
       <w:vertAlign w:val="superscript"/>
     </w:rPr>
   </w:style>
-  <w:style w:type="character" w:styleId="Hypertextovodkaz">
+  <w:style w:type="character" w:styleId="Hyperlink">
     <w:name w:val="Hyperlink"/>
-    <w:basedOn w:val="TitulekChar"/>
+    <w:basedOn w:val="CaptionChar"/>
     <w:rPr>
       <w:color w:val="4F81BD" w:themeColor="accent1"/>
     </w:rPr>
   </w:style>
-  <w:style w:type="paragraph" w:styleId="Nadpisobsahu">
+  <w:style w:type="paragraph" w:styleId="TOCHeading">
     <w:name w:val="TOC Heading"/>
-    <w:basedOn w:val="Nadpis1"/>
-    <w:next w:val="Zkladntext"/>
+    <w:basedOn w:val="Heading1"/>
+    <w:next w:val="BodyText"/>
     <w:uiPriority w:val="39"/>
     <w:unhideWhenUsed/>
     <w:qFormat/>
@@ -6222,7 +6050,7 @@
   </w:style>
   <w:style w:type="paragraph" w:customStyle="1" w:styleId="SourceCode">
     <w:name w:val="Source Code"/>
-    <w:basedOn w:val="Normln"/>
+    <w:basedOn w:val="Normal"/>
     <w:link w:val="VerbatimChar"/>
     <w:pPr>
       <w:wordWrap w:val="0"/>
@@ -6516,10 +6344,10 @@
       <w:sz w:val="22"/>
     </w:rPr>
   </w:style>
-  <w:style w:type="paragraph" w:styleId="Zhlav">
+  <w:style w:type="paragraph" w:styleId="Header">
     <w:name w:val="header"/>
-    <w:basedOn w:val="Normln"/>
-    <w:link w:val="ZhlavChar"/>
+    <w:basedOn w:val="Normal"/>
+    <w:link w:val="HeaderChar"/>
     <w:unhideWhenUsed/>
     <w:rsid w:val="00A20F65"/>
     <w:pPr>
@@ -6530,16 +6358,16 @@
       <w:spacing w:after="0"/>
     </w:pPr>
   </w:style>
-  <w:style w:type="character" w:customStyle="1" w:styleId="ZhlavChar">
-    <w:name w:val="Záhlaví Char"/>
-    <w:basedOn w:val="Standardnpsmoodstavce"/>
-    <w:link w:val="Zhlav"/>
+  <w:style w:type="character" w:customStyle="1" w:styleId="HeaderChar">
+    <w:name w:val="Header Char"/>
+    <w:basedOn w:val="DefaultParagraphFont"/>
+    <w:link w:val="Header"/>
     <w:rsid w:val="00A20F65"/>
   </w:style>
-  <w:style w:type="paragraph" w:styleId="Zpat">
+  <w:style w:type="paragraph" w:styleId="Footer">
     <w:name w:val="footer"/>
-    <w:basedOn w:val="Normln"/>
-    <w:link w:val="ZpatChar"/>
+    <w:basedOn w:val="Normal"/>
+    <w:link w:val="FooterChar"/>
     <w:unhideWhenUsed/>
     <w:rsid w:val="00A20F65"/>
     <w:pPr>
@@ -6550,15 +6378,15 @@
       <w:spacing w:after="0"/>
     </w:pPr>
   </w:style>
-  <w:style w:type="character" w:customStyle="1" w:styleId="ZpatChar">
-    <w:name w:val="Zápatí Char"/>
-    <w:basedOn w:val="Standardnpsmoodstavce"/>
-    <w:link w:val="Zpat"/>
+  <w:style w:type="character" w:customStyle="1" w:styleId="FooterChar">
+    <w:name w:val="Footer Char"/>
+    <w:basedOn w:val="DefaultParagraphFont"/>
+    <w:link w:val="Footer"/>
     <w:rsid w:val="00A20F65"/>
   </w:style>
-  <w:style w:type="character" w:styleId="Zstupntext">
+  <w:style w:type="character" w:styleId="PlaceholderText">
     <w:name w:val="Placeholder Text"/>
-    <w:basedOn w:val="Standardnpsmoodstavce"/>
+    <w:basedOn w:val="DefaultParagraphFont"/>
     <w:semiHidden/>
     <w:rsid w:val="00646003"/>
     <w:rPr>
@@ -6569,7 +6397,7 @@
 </file>
 
 <file path=word/glossary/document.xml><?xml version="1.0" encoding="utf-8"?>
-<w:glossaryDocument xmlns:wpc="http://schemas.microsoft.com/office/word/2010/wordprocessingCanvas" xmlns:cx="http://schemas.microsoft.com/office/drawing/2014/chartex" xmlns:cx1="http://schemas.microsoft.com/office/drawing/2015/9/8/chartex" xmlns:cx2="http://schemas.microsoft.com/office/drawing/2015/10/21/chartex" xmlns:cx3="http://schemas.microsoft.com/office/drawing/2016/5/9/chartex" xmlns:cx4="http://schemas.microsoft.com/office/drawing/2016/5/10/chartex" xmlns:cx5="http://schemas.microsoft.com/office/drawing/2016/5/11/chartex" xmlns:cx6="http://schemas.microsoft.com/office/drawing/2016/5/12/chartex" xmlns:cx7="http://schemas.microsoft.com/office/drawing/2016/5/13/chartex" xmlns:cx8="http://schemas.microsoft.com/office/drawing/2016/5/14/chartex" xmlns:mc="http://schemas.openxmlformats.org/markup-compatibility/2006" xmlns:aink="http://schemas.microsoft.com/office/drawing/2016/ink" xmlns:am3d="http://schemas.microsoft.com/office/drawing/2017/model3d" xmlns:o="urn:schemas-microsoft-com:office:office" xmlns:r="http://schemas.openxmlformats.org/officeDocument/2006/relationships" xmlns:m="http://schemas.openxmlformats.org/officeDocument/2006/math" xmlns:v="urn:schemas-microsoft-com:vml" xmlns:wp14="http://schemas.microsoft.com/office/word/2010/wordprocessingDrawing" xmlns:wp="http://schemas.openxmlformats.org/drawingml/2006/wordprocessingDrawing" xmlns:w10="urn:schemas-microsoft-com:office:word" xmlns:w="http://schemas.openxmlformats.org/wordprocessingml/2006/main" xmlns:w14="http://schemas.microsoft.com/office/word/2010/wordml" xmlns:w15="http://schemas.microsoft.com/office/word/2012/wordml" xmlns:w16cex="http://schemas.microsoft.com/office/word/2018/wordml/cex" xmlns:w16cid="http://schemas.microsoft.com/office/word/2016/wordml/cid" xmlns:w16="http://schemas.microsoft.com/office/word/2018/wordml" xmlns:w16se="http://schemas.microsoft.com/office/word/2015/wordml/symex" xmlns:wpg="http://schemas.microsoft.com/office/word/2010/wordprocessingGroup" xmlns:wpi="http://schemas.microsoft.com/office/word/2010/wordprocessingInk" xmlns:wne="http://schemas.microsoft.com/office/word/2006/wordml" xmlns:wps="http://schemas.microsoft.com/office/word/2010/wordprocessingShape" mc:Ignorable="w14 w15 w16se w16cid w16 w16cex wp14">
+<w:glossaryDocument xmlns:wpc="http://schemas.microsoft.com/office/word/2010/wordprocessingCanvas" xmlns:cx="http://schemas.microsoft.com/office/drawing/2014/chartex" xmlns:cx1="http://schemas.microsoft.com/office/drawing/2015/9/8/chartex" xmlns:cx2="http://schemas.microsoft.com/office/drawing/2015/10/21/chartex" xmlns:cx3="http://schemas.microsoft.com/office/drawing/2016/5/9/chartex" xmlns:cx4="http://schemas.microsoft.com/office/drawing/2016/5/10/chartex" xmlns:cx5="http://schemas.microsoft.com/office/drawing/2016/5/11/chartex" xmlns:cx6="http://schemas.microsoft.com/office/drawing/2016/5/12/chartex" xmlns:cx7="http://schemas.microsoft.com/office/drawing/2016/5/13/chartex" xmlns:cx8="http://schemas.microsoft.com/office/drawing/2016/5/14/chartex" xmlns:mc="http://schemas.openxmlformats.org/markup-compatibility/2006" xmlns:aink="http://schemas.microsoft.com/office/drawing/2016/ink" xmlns:am3d="http://schemas.microsoft.com/office/drawing/2017/model3d" xmlns:o="urn:schemas-microsoft-com:office:office" xmlns:oel="http://schemas.microsoft.com/office/2019/extlst" xmlns:r="http://schemas.openxmlformats.org/officeDocument/2006/relationships" xmlns:m="http://schemas.openxmlformats.org/officeDocument/2006/math" xmlns:v="urn:schemas-microsoft-com:vml" xmlns:wp14="http://schemas.microsoft.com/office/word/2010/wordprocessingDrawing" xmlns:wp="http://schemas.openxmlformats.org/drawingml/2006/wordprocessingDrawing" xmlns:w10="urn:schemas-microsoft-com:office:word" xmlns:w="http://schemas.openxmlformats.org/wordprocessingml/2006/main" xmlns:w14="http://schemas.microsoft.com/office/word/2010/wordml" xmlns:w15="http://schemas.microsoft.com/office/word/2012/wordml" xmlns:w16cex="http://schemas.microsoft.com/office/word/2018/wordml/cex" xmlns:w16cid="http://schemas.microsoft.com/office/word/2016/wordml/cid" xmlns:w16="http://schemas.microsoft.com/office/word/2018/wordml" xmlns:w16du="http://schemas.microsoft.com/office/word/2023/wordml/word16du" xmlns:w16sdtdh="http://schemas.microsoft.com/office/word/2020/wordml/sdtdatahash" xmlns:w16sdtfl="http://schemas.microsoft.com/office/word/2024/wordml/sdtformatlock" xmlns:w16se="http://schemas.microsoft.com/office/word/2015/wordml/symex" xmlns:wpg="http://schemas.microsoft.com/office/word/2010/wordprocessingGroup" xmlns:wpi="http://schemas.microsoft.com/office/word/2010/wordprocessingInk" xmlns:wne="http://schemas.microsoft.com/office/word/2006/wordml" xmlns:wps="http://schemas.microsoft.com/office/word/2010/wordprocessingShape" mc:Ignorable="w14 w15 w16se w16cid w16 w16cex w16sdtdh w16sdtfl w16du wp14">
   <w:docParts>
     <w:docPart>
       <w:docPartPr>
@@ -6590,7 +6418,7 @@
         <w:p>
           <w:r>
             <w:rPr>
-              <w:rStyle w:val="Zstupntext"/>
+              <w:rStyle w:val="PlaceholderText"/>
             </w:rPr>
             <w:t>[Název]</w:t>
           </w:r>
@@ -6602,7 +6430,7 @@
 </file>
 
 <file path=word/glossary/fontTable.xml><?xml version="1.0" encoding="utf-8"?>
-<w:fonts xmlns:mc="http://schemas.openxmlformats.org/markup-compatibility/2006" xmlns:r="http://schemas.openxmlformats.org/officeDocument/2006/relationships" xmlns:w="http://schemas.openxmlformats.org/wordprocessingml/2006/main" xmlns:w14="http://schemas.microsoft.com/office/word/2010/wordml" xmlns:w15="http://schemas.microsoft.com/office/word/2012/wordml" xmlns:w16cex="http://schemas.microsoft.com/office/word/2018/wordml/cex" xmlns:w16cid="http://schemas.microsoft.com/office/word/2016/wordml/cid" xmlns:w16="http://schemas.microsoft.com/office/word/2018/wordml" xmlns:w16se="http://schemas.microsoft.com/office/word/2015/wordml/symex" mc:Ignorable="w14 w15 w16se w16cid w16 w16cex">
+<w:fonts xmlns:mc="http://schemas.openxmlformats.org/markup-compatibility/2006" xmlns:r="http://schemas.openxmlformats.org/officeDocument/2006/relationships" xmlns:w="http://schemas.openxmlformats.org/wordprocessingml/2006/main" xmlns:w14="http://schemas.microsoft.com/office/word/2010/wordml" xmlns:w15="http://schemas.microsoft.com/office/word/2012/wordml" xmlns:w16cex="http://schemas.microsoft.com/office/word/2018/wordml/cex" xmlns:w16cid="http://schemas.microsoft.com/office/word/2016/wordml/cid" xmlns:w16="http://schemas.microsoft.com/office/word/2018/wordml" xmlns:w16du="http://schemas.microsoft.com/office/word/2023/wordml/word16du" xmlns:w16sdtdh="http://schemas.microsoft.com/office/word/2020/wordml/sdtdatahash" xmlns:w16sdtfl="http://schemas.microsoft.com/office/word/2024/wordml/sdtformatlock" xmlns:w16se="http://schemas.microsoft.com/office/word/2015/wordml/symex" mc:Ignorable="w14 w15 w16se w16cid w16 w16cex w16sdtdh w16sdtfl w16du">
   <w:font w:name="Cambria">
     <w:panose1 w:val="02040503050406030204"/>
     <w:charset w:val="EE"/>
@@ -6622,14 +6450,14 @@
     <w:charset w:val="EE"/>
     <w:family w:val="swiss"/>
     <w:pitch w:val="variable"/>
-    <w:sig w:usb0="E4002EFF" w:usb1="C000247B" w:usb2="00000009" w:usb3="00000000" w:csb0="000001FF" w:csb1="00000000"/>
+    <w:sig w:usb0="E4002EFF" w:usb1="C200247B" w:usb2="00000009" w:usb3="00000000" w:csb0="000001FF" w:csb1="00000000"/>
   </w:font>
   <w:font w:name="Consolas">
     <w:panose1 w:val="020B0609020204030204"/>
     <w:charset w:val="EE"/>
     <w:family w:val="modern"/>
     <w:pitch w:val="fixed"/>
-    <w:sig w:usb0="E00006FF" w:usb1="0000FCFF" w:usb2="00000001" w:usb3="00000000" w:csb0="0000019F" w:csb1="00000000"/>
+    <w:sig w:usb0="E10006FF" w:usb1="4000FCFF" w:usb2="00000009" w:usb3="00000000" w:csb0="0000019F" w:csb1="00000000"/>
   </w:font>
   <w:font w:name="Segoe UI Emoji">
     <w:panose1 w:val="020B0502040204020203"/>
@@ -6638,18 +6466,25 @@
     <w:pitch w:val="variable"/>
     <w:sig w:usb0="00000003" w:usb1="02000000" w:usb2="00000000" w:usb3="00000000" w:csb0="00000001" w:csb1="00000000"/>
   </w:font>
-  <w:font w:name="Calibri Light">
-    <w:panose1 w:val="020F0302020204030204"/>
-    <w:charset w:val="EE"/>
+  <w:font w:name="Aptos">
+    <w:panose1 w:val="020B0004020202020204"/>
+    <w:charset w:val="00"/>
     <w:family w:val="swiss"/>
     <w:pitch w:val="variable"/>
-    <w:sig w:usb0="E4002EFF" w:usb1="C000247B" w:usb2="00000009" w:usb3="00000000" w:csb0="000001FF" w:csb1="00000000"/>
+    <w:sig w:usb0="20000287" w:usb1="00000003" w:usb2="00000000" w:usb3="00000000" w:csb0="0000019F" w:csb1="00000000"/>
+  </w:font>
+  <w:font w:name="Aptos Display">
+    <w:panose1 w:val="020B0004020202020204"/>
+    <w:charset w:val="00"/>
+    <w:family w:val="swiss"/>
+    <w:pitch w:val="variable"/>
+    <w:sig w:usb0="20000287" w:usb1="00000003" w:usb2="00000000" w:usb3="00000000" w:csb0="0000019F" w:csb1="00000000"/>
   </w:font>
 </w:fonts>
 </file>
 
 <file path=word/glossary/settings.xml><?xml version="1.0" encoding="utf-8"?>
-<w:settings xmlns:mc="http://schemas.openxmlformats.org/markup-compatibility/2006" xmlns:o="urn:schemas-microsoft-com:office:office" xmlns:r="http://schemas.openxmlformats.org/officeDocument/2006/relationships" xmlns:m="http://schemas.openxmlformats.org/officeDocument/2006/math" xmlns:v="urn:schemas-microsoft-com:vml" xmlns:w10="urn:schemas-microsoft-com:office:word" xmlns:w="http://schemas.openxmlformats.org/wordprocessingml/2006/main" xmlns:w14="http://schemas.microsoft.com/office/word/2010/wordml" xmlns:w15="http://schemas.microsoft.com/office/word/2012/wordml" xmlns:w16cex="http://schemas.microsoft.com/office/word/2018/wordml/cex" xmlns:w16cid="http://schemas.microsoft.com/office/word/2016/wordml/cid" xmlns:w16="http://schemas.microsoft.com/office/word/2018/wordml" xmlns:w16se="http://schemas.microsoft.com/office/word/2015/wordml/symex" xmlns:sl="http://schemas.openxmlformats.org/schemaLibrary/2006/main" mc:Ignorable="w14 w15 w16se w16cid w16 w16cex">
+<w:settings xmlns:mc="http://schemas.openxmlformats.org/markup-compatibility/2006" xmlns:o="urn:schemas-microsoft-com:office:office" xmlns:r="http://schemas.openxmlformats.org/officeDocument/2006/relationships" xmlns:m="http://schemas.openxmlformats.org/officeDocument/2006/math" xmlns:v="urn:schemas-microsoft-com:vml" xmlns:w10="urn:schemas-microsoft-com:office:word" xmlns:w="http://schemas.openxmlformats.org/wordprocessingml/2006/main" xmlns:w14="http://schemas.microsoft.com/office/word/2010/wordml" xmlns:w15="http://schemas.microsoft.com/office/word/2012/wordml" xmlns:w16cex="http://schemas.microsoft.com/office/word/2018/wordml/cex" xmlns:w16cid="http://schemas.microsoft.com/office/word/2016/wordml/cid" xmlns:w16="http://schemas.microsoft.com/office/word/2018/wordml" xmlns:w16du="http://schemas.microsoft.com/office/word/2023/wordml/word16du" xmlns:w16sdtdh="http://schemas.microsoft.com/office/word/2020/wordml/sdtdatahash" xmlns:w16sdtfl="http://schemas.microsoft.com/office/word/2024/wordml/sdtformatlock" xmlns:w16se="http://schemas.microsoft.com/office/word/2015/wordml/symex" xmlns:sl="http://schemas.openxmlformats.org/schemaLibrary/2006/main" mc:Ignorable="w14 w15 w16se w16cid w16 w16cex w16sdtdh w16sdtfl w16du">
   <w:view w:val="normal"/>
   <w:defaultTabStop w:val="708"/>
   <w:hyphenationZone w:val="425"/>
@@ -6669,6 +6504,8 @@
     <w:rsid w:val="008C1490"/>
     <w:rsid w:val="009418F8"/>
     <w:rsid w:val="00B55332"/>
+    <w:rsid w:val="00C272F2"/>
+    <w:rsid w:val="00EC6347"/>
   </w:rsids>
   <m:mathPr>
     <m:mathFont m:val="Cambria Math"/>
@@ -6685,14 +6522,14 @@
   </m:mathPr>
   <w:themeFontLang w:val="cs-CZ"/>
   <w:clrSchemeMapping w:bg1="light1" w:t1="dark1" w:bg2="light2" w:t2="dark2" w:accent1="accent1" w:accent2="accent2" w:accent3="accent3" w:accent4="accent4" w:accent5="accent5" w:accent6="accent6" w:hyperlink="hyperlink" w:followedHyperlink="followedHyperlink"/>
-  <w:decimalSymbol w:val=","/>
-  <w:listSeparator w:val=";"/>
+  <w:decimalSymbol w:val="."/>
+  <w:listSeparator w:val=","/>
   <w15:chartTrackingRefBased/>
 </w:settings>
 </file>
 
 <file path=word/glossary/styles.xml><?xml version="1.0" encoding="utf-8"?>
-<w:styles xmlns:mc="http://schemas.openxmlformats.org/markup-compatibility/2006" xmlns:r="http://schemas.openxmlformats.org/officeDocument/2006/relationships" xmlns:w="http://schemas.openxmlformats.org/wordprocessingml/2006/main" xmlns:w14="http://schemas.microsoft.com/office/word/2010/wordml" xmlns:w15="http://schemas.microsoft.com/office/word/2012/wordml" xmlns:w16cex="http://schemas.microsoft.com/office/word/2018/wordml/cex" xmlns:w16cid="http://schemas.microsoft.com/office/word/2016/wordml/cid" xmlns:w16="http://schemas.microsoft.com/office/word/2018/wordml" xmlns:w16se="http://schemas.microsoft.com/office/word/2015/wordml/symex" mc:Ignorable="w14 w15 w16se w16cid w16 w16cex">
+<w:styles xmlns:mc="http://schemas.openxmlformats.org/markup-compatibility/2006" xmlns:r="http://schemas.openxmlformats.org/officeDocument/2006/relationships" xmlns:w="http://schemas.openxmlformats.org/wordprocessingml/2006/main" xmlns:w14="http://schemas.microsoft.com/office/word/2010/wordml" xmlns:w15="http://schemas.microsoft.com/office/word/2012/wordml" xmlns:w16cex="http://schemas.microsoft.com/office/word/2018/wordml/cex" xmlns:w16cid="http://schemas.microsoft.com/office/word/2016/wordml/cid" xmlns:w16="http://schemas.microsoft.com/office/word/2018/wordml" xmlns:w16du="http://schemas.microsoft.com/office/word/2023/wordml/word16du" xmlns:w16sdtdh="http://schemas.microsoft.com/office/word/2020/wordml/sdtdatahash" xmlns:w16sdtfl="http://schemas.microsoft.com/office/word/2024/wordml/sdtformatlock" xmlns:w16se="http://schemas.microsoft.com/office/word/2015/wordml/symex" mc:Ignorable="w14 w15 w16se w16cid w16 w16cex w16sdtdh w16sdtfl w16du">
   <w:docDefaults>
     <w:rPrDefault>
       <w:rPr>
@@ -7086,7 +6923,7 @@
     <w:lsdException w:name="Unresolved Mention" w:semiHidden="1" w:unhideWhenUsed="1"/>
     <w:lsdException w:name="Smart Link" w:semiHidden="1" w:unhideWhenUsed="1"/>
   </w:latentStyles>
-  <w:style w:type="paragraph" w:default="1" w:styleId="Normln">
+  <w:style w:type="paragraph" w:default="1" w:styleId="Normal">
     <w:name w:val="Normal"/>
     <w:qFormat/>
     <w:rsid w:val="00B55332"/>
@@ -7096,13 +6933,13 @@
       <w:szCs w:val="3276"/>
     </w:rPr>
   </w:style>
-  <w:style w:type="character" w:default="1" w:styleId="Standardnpsmoodstavce">
+  <w:style w:type="character" w:default="1" w:styleId="DefaultParagraphFont">
     <w:name w:val="Default Paragraph Font"/>
     <w:uiPriority w:val="1"/>
     <w:semiHidden/>
     <w:unhideWhenUsed/>
   </w:style>
-  <w:style w:type="table" w:default="1" w:styleId="Normlntabulka">
+  <w:style w:type="table" w:default="1" w:styleId="TableNormal">
     <w:name w:val="Normal Table"/>
     <w:uiPriority w:val="99"/>
     <w:semiHidden/>
@@ -7117,15 +6954,15 @@
       </w:tblCellMar>
     </w:tblPr>
   </w:style>
-  <w:style w:type="numbering" w:default="1" w:styleId="Bezseznamu">
+  <w:style w:type="numbering" w:default="1" w:styleId="NoList">
     <w:name w:val="No List"/>
     <w:uiPriority w:val="99"/>
     <w:semiHidden/>
     <w:unhideWhenUsed/>
   </w:style>
-  <w:style w:type="character" w:styleId="Zstupntext">
+  <w:style w:type="character" w:styleId="PlaceholderText">
     <w:name w:val="Placeholder Text"/>
-    <w:basedOn w:val="Standardnpsmoodstavce"/>
+    <w:basedOn w:val="DefaultParagraphFont"/>
     <w:semiHidden/>
     <w:rsid w:val="00B55332"/>
     <w:rPr>
@@ -7136,7 +6973,7 @@
 </file>
 
 <file path=word/glossary/webSettings.xml><?xml version="1.0" encoding="utf-8"?>
-<w:webSettings xmlns:mc="http://schemas.openxmlformats.org/markup-compatibility/2006" xmlns:r="http://schemas.openxmlformats.org/officeDocument/2006/relationships" xmlns:w="http://schemas.openxmlformats.org/wordprocessingml/2006/main" xmlns:w14="http://schemas.microsoft.com/office/word/2010/wordml" xmlns:w15="http://schemas.microsoft.com/office/word/2012/wordml" xmlns:w16cex="http://schemas.microsoft.com/office/word/2018/wordml/cex" xmlns:w16cid="http://schemas.microsoft.com/office/word/2016/wordml/cid" xmlns:w16="http://schemas.microsoft.com/office/word/2018/wordml" xmlns:w16se="http://schemas.microsoft.com/office/word/2015/wordml/symex" mc:Ignorable="w14 w15 w16se w16cid w16 w16cex">
+<w:webSettings xmlns:mc="http://schemas.openxmlformats.org/markup-compatibility/2006" xmlns:r="http://schemas.openxmlformats.org/officeDocument/2006/relationships" xmlns:w="http://schemas.openxmlformats.org/wordprocessingml/2006/main" xmlns:w14="http://schemas.microsoft.com/office/word/2010/wordml" xmlns:w15="http://schemas.microsoft.com/office/word/2012/wordml" xmlns:w16cex="http://schemas.microsoft.com/office/word/2018/wordml/cex" xmlns:w16cid="http://schemas.microsoft.com/office/word/2016/wordml/cid" xmlns:w16="http://schemas.microsoft.com/office/word/2018/wordml" xmlns:w16du="http://schemas.microsoft.com/office/word/2023/wordml/word16du" xmlns:w16sdtdh="http://schemas.microsoft.com/office/word/2020/wordml/sdtdatahash" xmlns:w16sdtfl="http://schemas.microsoft.com/office/word/2024/wordml/sdtformatlock" xmlns:w16se="http://schemas.microsoft.com/office/word/2015/wordml/symex" mc:Ignorable="w14 w15 w16se w16cid w16 w16cex w16sdtdh w16sdtfl w16du">
   <w:optimizeForBrowser/>
   <w:allowPNG/>
 </w:webSettings>
@@ -7458,4 +7295,16 @@
   </a:objectDefaults>
   <a:extraClrSchemeLst/>
 </a:theme>
+</file>
+
+<file path=customXml/item1.xml><?xml version="1.0" encoding="utf-8"?>
+<b:Sources xmlns:b="http://schemas.openxmlformats.org/officeDocument/2006/bibliography" xmlns="http://schemas.openxmlformats.org/officeDocument/2006/bibliography" SelectedStyle="/APASixthEditionOfficeOnline.xsl" StyleName="APA" Version="6"/>
+</file>
+
+<file path=customXml/itemProps1.xml><?xml version="1.0" encoding="utf-8"?>
+<ds:datastoreItem xmlns:ds="http://schemas.openxmlformats.org/officeDocument/2006/customXml" ds:itemID="{39BF47B7-1754-3D41-A798-1D59D6AE2FCF}">
+  <ds:schemaRefs>
+    <ds:schemaRef ds:uri="http://schemas.openxmlformats.org/officeDocument/2006/bibliography"/>
+  </ds:schemaRefs>
+</ds:datastoreItem>
 </file>
</xml_diff>

<commit_message>
Update to metamodel version 17.1 (#6)
* Update to metamodel version 17.1
</commit_message>
<xml_diff>
--- a/src/reference.docx
+++ b/src/reference.docx
@@ -1,10 +1,10 @@
 
 <file path=word/document.xml><?xml version="1.0" encoding="utf-8"?>
-<w:document xmlns:wpc="http://schemas.microsoft.com/office/word/2010/wordprocessingCanvas" xmlns:cx="http://schemas.microsoft.com/office/drawing/2014/chartex" xmlns:cx1="http://schemas.microsoft.com/office/drawing/2015/9/8/chartex" xmlns:cx2="http://schemas.microsoft.com/office/drawing/2015/10/21/chartex" xmlns:cx3="http://schemas.microsoft.com/office/drawing/2016/5/9/chartex" xmlns:cx4="http://schemas.microsoft.com/office/drawing/2016/5/10/chartex" xmlns:cx5="http://schemas.microsoft.com/office/drawing/2016/5/11/chartex" xmlns:cx6="http://schemas.microsoft.com/office/drawing/2016/5/12/chartex" xmlns:cx7="http://schemas.microsoft.com/office/drawing/2016/5/13/chartex" xmlns:cx8="http://schemas.microsoft.com/office/drawing/2016/5/14/chartex" xmlns:mc="http://schemas.openxmlformats.org/markup-compatibility/2006" xmlns:aink="http://schemas.microsoft.com/office/drawing/2016/ink" xmlns:am3d="http://schemas.microsoft.com/office/drawing/2017/model3d" xmlns:o="urn:schemas-microsoft-com:office:office" xmlns:r="http://schemas.openxmlformats.org/officeDocument/2006/relationships" xmlns:m="http://schemas.openxmlformats.org/officeDocument/2006/math" xmlns:v="urn:schemas-microsoft-com:vml" xmlns:wp14="http://schemas.microsoft.com/office/word/2010/wordprocessingDrawing" xmlns:wp="http://schemas.openxmlformats.org/drawingml/2006/wordprocessingDrawing" xmlns:w10="urn:schemas-microsoft-com:office:word" xmlns:w="http://schemas.openxmlformats.org/wordprocessingml/2006/main" xmlns:w14="http://schemas.microsoft.com/office/word/2010/wordml" xmlns:w15="http://schemas.microsoft.com/office/word/2012/wordml" xmlns:w16cex="http://schemas.microsoft.com/office/word/2018/wordml/cex" xmlns:w16cid="http://schemas.microsoft.com/office/word/2016/wordml/cid" xmlns:w16="http://schemas.microsoft.com/office/word/2018/wordml" xmlns:w16se="http://schemas.microsoft.com/office/word/2015/wordml/symex" xmlns:wpg="http://schemas.microsoft.com/office/word/2010/wordprocessingGroup" xmlns:wpi="http://schemas.microsoft.com/office/word/2010/wordprocessingInk" xmlns:wne="http://schemas.microsoft.com/office/word/2006/wordml" xmlns:wps="http://schemas.microsoft.com/office/word/2010/wordprocessingShape" mc:Ignorable="w14 w15 w16se w16cid w16 w16cex wp14">
+<w:document xmlns:wpc="http://schemas.microsoft.com/office/word/2010/wordprocessingCanvas" xmlns:cx="http://schemas.microsoft.com/office/drawing/2014/chartex" xmlns:cx1="http://schemas.microsoft.com/office/drawing/2015/9/8/chartex" xmlns:cx2="http://schemas.microsoft.com/office/drawing/2015/10/21/chartex" xmlns:cx3="http://schemas.microsoft.com/office/drawing/2016/5/9/chartex" xmlns:cx4="http://schemas.microsoft.com/office/drawing/2016/5/10/chartex" xmlns:cx5="http://schemas.microsoft.com/office/drawing/2016/5/11/chartex" xmlns:cx6="http://schemas.microsoft.com/office/drawing/2016/5/12/chartex" xmlns:cx7="http://schemas.microsoft.com/office/drawing/2016/5/13/chartex" xmlns:cx8="http://schemas.microsoft.com/office/drawing/2016/5/14/chartex" xmlns:mc="http://schemas.openxmlformats.org/markup-compatibility/2006" xmlns:aink="http://schemas.microsoft.com/office/drawing/2016/ink" xmlns:am3d="http://schemas.microsoft.com/office/drawing/2017/model3d" xmlns:o="urn:schemas-microsoft-com:office:office" xmlns:oel="http://schemas.microsoft.com/office/2019/extlst" xmlns:r="http://schemas.openxmlformats.org/officeDocument/2006/relationships" xmlns:m="http://schemas.openxmlformats.org/officeDocument/2006/math" xmlns:v="urn:schemas-microsoft-com:vml" xmlns:wp14="http://schemas.microsoft.com/office/word/2010/wordprocessingDrawing" xmlns:wp="http://schemas.openxmlformats.org/drawingml/2006/wordprocessingDrawing" xmlns:w10="urn:schemas-microsoft-com:office:word" xmlns:w="http://schemas.openxmlformats.org/wordprocessingml/2006/main" xmlns:w14="http://schemas.microsoft.com/office/word/2010/wordml" xmlns:w15="http://schemas.microsoft.com/office/word/2012/wordml" xmlns:w16cex="http://schemas.microsoft.com/office/word/2018/wordml/cex" xmlns:w16cid="http://schemas.microsoft.com/office/word/2016/wordml/cid" xmlns:w16="http://schemas.microsoft.com/office/word/2018/wordml" xmlns:w16du="http://schemas.microsoft.com/office/word/2023/wordml/word16du" xmlns:w16sdtdh="http://schemas.microsoft.com/office/word/2020/wordml/sdtdatahash" xmlns:w16sdtfl="http://schemas.microsoft.com/office/word/2024/wordml/sdtformatlock" xmlns:w16se="http://schemas.microsoft.com/office/word/2015/wordml/symex" xmlns:wpg="http://schemas.microsoft.com/office/word/2010/wordprocessingGroup" xmlns:wpi="http://schemas.microsoft.com/office/word/2010/wordprocessingInk" xmlns:wne="http://schemas.microsoft.com/office/word/2006/wordml" xmlns:wps="http://schemas.microsoft.com/office/word/2010/wordprocessingShape" mc:Ignorable="w14 w15 w16se w16cid w16 w16cex w16sdtdh w16sdtfl w16du wp14">
   <w:body>
     <w:p>
       <w:pPr>
-        <w:pStyle w:val="Nzev"/>
+        <w:pStyle w:val="Title"/>
       </w:pPr>
       <w:r>
         <w:t>Project name</w:t>
@@ -73,10 +73,10 @@
             <w:r>
               <w:t>Albert Einstein (</w:t>
             </w:r>
-            <w:hyperlink r:id="rId7">
+            <w:hyperlink r:id="rId8">
               <w:r>
                 <w:rPr>
-                  <w:rStyle w:val="Hypertextovodkaz"/>
+                  <w:rStyle w:val="Hyperlink"/>
                 </w:rPr>
                 <w:t>albert.einstein@example.com</w:t>
               </w:r>
@@ -188,7 +188,7 @@
     </w:p>
     <w:p>
       <w:pPr>
-        <w:pStyle w:val="Nadpis3"/>
+        <w:pStyle w:val="Heading3"/>
       </w:pPr>
       <w:bookmarkStart w:id="0" w:name="summary"/>
       <w:r>
@@ -198,7 +198,7 @@
     </w:p>
     <w:p>
       <w:pPr>
-        <w:pStyle w:val="Nadpis4"/>
+        <w:pStyle w:val="Heading4"/>
       </w:pPr>
       <w:bookmarkStart w:id="1" w:name="answered-indication"/>
       <w:r>
@@ -301,7 +301,7 @@
     </w:tbl>
     <w:p>
       <w:pPr>
-        <w:pStyle w:val="Nadpis4"/>
+        <w:pStyle w:val="Heading4"/>
       </w:pPr>
       <w:bookmarkStart w:id="2" w:name="metrics"/>
       <w:bookmarkEnd w:id="1"/>
@@ -529,7 +529,7 @@
     </w:p>
     <w:p>
       <w:pPr>
-        <w:pStyle w:val="Nadpis1"/>
+        <w:pStyle w:val="Heading1"/>
       </w:pPr>
       <w:bookmarkStart w:id="3" w:name="i.-administrative-information"/>
       <w:r>
@@ -539,7 +539,7 @@
     </w:p>
     <w:p>
       <w:pPr>
-        <w:pStyle w:val="Nadpis3"/>
+        <w:pStyle w:val="Heading3"/>
       </w:pPr>
       <w:bookmarkStart w:id="4" w:name="summary-1"/>
       <w:r>
@@ -548,7 +548,7 @@
     </w:p>
     <w:p>
       <w:pPr>
-        <w:pStyle w:val="Nadpis4"/>
+        <w:pStyle w:val="Heading4"/>
       </w:pPr>
       <w:bookmarkStart w:id="5" w:name="answered-indication-1"/>
       <w:r>
@@ -651,7 +651,7 @@
     </w:tbl>
     <w:p>
       <w:pPr>
-        <w:pStyle w:val="Nadpis4"/>
+        <w:pStyle w:val="Heading4"/>
       </w:pPr>
       <w:bookmarkStart w:id="6" w:name="contributors"/>
       <w:bookmarkEnd w:id="4"/>
@@ -707,7 +707,7 @@
     </w:p>
     <w:p>
       <w:pPr>
-        <w:pStyle w:val="Zkladntext"/>
+        <w:pStyle w:val="BodyText"/>
       </w:pPr>
       <w:r>
         <w:t>Each person contributing to creating or executing the data management plan should be added as a contributor. A project probably should have a Contact Person, and a Data Curator.</w:t>
@@ -715,7 +715,7 @@
     </w:p>
     <w:p>
       <w:pPr>
-        <w:pStyle w:val="Nadpis4"/>
+        <w:pStyle w:val="Heading4"/>
       </w:pPr>
       <w:bookmarkStart w:id="7" w:name="answers-1-items"/>
       <w:bookmarkEnd w:id="6"/>
@@ -725,7 +725,7 @@
     </w:p>
     <w:p>
       <w:pPr>
-        <w:pStyle w:val="Nadpis4"/>
+        <w:pStyle w:val="Heading4"/>
       </w:pPr>
       <w:bookmarkStart w:id="8" w:name="a.1.-name"/>
       <w:bookmarkStart w:id="9" w:name="Xc16d4597e430a2ddbe2787ed419925ec83f4c3c"/>
@@ -781,7 +781,7 @@
     </w:p>
     <w:p>
       <w:pPr>
-        <w:pStyle w:val="Zkladntext"/>
+        <w:pStyle w:val="BodyText"/>
       </w:pPr>
       <w:r>
         <w:t>✔️ Marek Suchánek</w:t>
@@ -789,7 +789,7 @@
     </w:p>
     <w:p>
       <w:pPr>
-        <w:pStyle w:val="Nadpis4"/>
+        <w:pStyle w:val="Heading4"/>
       </w:pPr>
       <w:bookmarkStart w:id="10" w:name="a.2.-e-mail-address"/>
       <w:bookmarkEnd w:id="8"/>
@@ -844,7 +844,7 @@
     </w:p>
     <w:p>
       <w:pPr>
-        <w:pStyle w:val="Zkladntext"/>
+        <w:pStyle w:val="BodyText"/>
       </w:pPr>
       <w:r>
         <w:t>✔️ marek.suchanek@ds-wizard.org</w:t>
@@ -852,7 +852,7 @@
     </w:p>
     <w:p>
       <w:pPr>
-        <w:pStyle w:val="Nadpis4"/>
+        <w:pStyle w:val="Heading4"/>
       </w:pPr>
       <w:bookmarkStart w:id="11" w:name="a.3.-orcid-identifier"/>
       <w:bookmarkEnd w:id="10"/>
@@ -907,7 +907,7 @@
     </w:p>
     <w:p>
       <w:pPr>
-        <w:pStyle w:val="Zkladntext"/>
+        <w:pStyle w:val="BodyText"/>
       </w:pPr>
       <w:r>
         <w:t xml:space="preserve">❗ </w:t>
@@ -922,7 +922,7 @@
     </w:p>
     <w:p>
       <w:pPr>
-        <w:pStyle w:val="Nadpis4"/>
+        <w:pStyle w:val="Heading4"/>
       </w:pPr>
       <w:bookmarkStart w:id="12" w:name="a.5.-role"/>
       <w:bookmarkEnd w:id="11"/>
@@ -977,15 +977,15 @@
     </w:p>
     <w:p>
       <w:pPr>
-        <w:pStyle w:val="Zkladntext"/>
+        <w:pStyle w:val="BodyText"/>
       </w:pPr>
       <w:r>
         <w:t xml:space="preserve">Roles in a project should be given as they are defined by </w:t>
       </w:r>
-      <w:hyperlink r:id="rId8">
+      <w:hyperlink r:id="rId9">
         <w:r>
           <w:rPr>
-            <w:rStyle w:val="Hypertextovodkaz"/>
+            <w:rStyle w:val="Hyperlink"/>
           </w:rPr>
           <w:t>datacite</w:t>
         </w:r>
@@ -996,7 +996,7 @@
     </w:p>
     <w:p>
       <w:pPr>
-        <w:pStyle w:val="Zkladntext"/>
+        <w:pStyle w:val="BodyText"/>
       </w:pPr>
       <w:r>
         <w:t>You should specify at least one "Contact Person". If your project has a work package for data management, identify the leader of that work package as "Data Curator".</w:t>
@@ -1004,7 +1004,7 @@
     </w:p>
     <w:p>
       <w:pPr>
-        <w:pStyle w:val="Zkladntext"/>
+        <w:pStyle w:val="BodyText"/>
       </w:pPr>
       <w:r>
         <w:rPr>
@@ -1024,7 +1024,7 @@
     </w:p>
     <w:p>
       <w:pPr>
-        <w:pStyle w:val="Nadpis1"/>
+        <w:pStyle w:val="Heading1"/>
       </w:pPr>
       <w:bookmarkStart w:id="13" w:name="ii.-re-using-data"/>
       <w:r>
@@ -1042,7 +1042,7 @@
     </w:p>
     <w:p>
       <w:pPr>
-        <w:pStyle w:val="Zkladntext"/>
+        <w:pStyle w:val="BodyText"/>
       </w:pPr>
       <w:r>
         <w:t>It is not because we can generate massive amounts of data that we always need to do so. Creating data with public money is bringing with it the responsibility to treat those data well and (if potentially useful) make them available for re-use by others. And the circle is only complete if such data is actually re-used.</w:t>
@@ -1050,7 +1050,7 @@
     </w:p>
     <w:p>
       <w:pPr>
-        <w:pStyle w:val="Nadpis3"/>
+        <w:pStyle w:val="Heading3"/>
       </w:pPr>
       <w:bookmarkStart w:id="14" w:name="summary-2"/>
       <w:r>
@@ -1059,7 +1059,7 @@
     </w:p>
     <w:p>
       <w:pPr>
-        <w:pStyle w:val="Nadpis4"/>
+        <w:pStyle w:val="Heading4"/>
       </w:pPr>
       <w:bookmarkStart w:id="15" w:name="answered-indication-2"/>
       <w:r>
@@ -1162,7 +1162,7 @@
     </w:tbl>
     <w:p>
       <w:pPr>
-        <w:pStyle w:val="Nadpis4"/>
+        <w:pStyle w:val="Heading4"/>
       </w:pPr>
       <w:bookmarkStart w:id="16" w:name="is-there-any-pre-existing-data"/>
       <w:bookmarkEnd w:id="14"/>
@@ -1218,7 +1218,7 @@
     </w:p>
     <w:p>
       <w:pPr>
-        <w:pStyle w:val="Zkladntext"/>
+        <w:pStyle w:val="BodyText"/>
       </w:pPr>
       <w:r>
         <w:t xml:space="preserve">📖 </w:t>
@@ -1233,10 +1233,10 @@
       <w:r>
         <w:t xml:space="preserve"> </w:t>
       </w:r>
-      <w:hyperlink r:id="rId9">
+      <w:hyperlink r:id="rId10">
         <w:r>
           <w:rPr>
-            <w:rStyle w:val="Hypertextovodkaz"/>
+            <w:rStyle w:val="Hyperlink"/>
             <w:i/>
             <w:iCs/>
           </w:rPr>
@@ -1246,7 +1246,7 @@
     </w:p>
     <w:p>
       <w:pPr>
-        <w:pStyle w:val="Zkladntext"/>
+        <w:pStyle w:val="BodyText"/>
       </w:pPr>
       <w:r>
         <w:t xml:space="preserve">🔗 </w:t>
@@ -1261,10 +1261,10 @@
       <w:r>
         <w:t xml:space="preserve"> </w:t>
       </w:r>
-      <w:hyperlink r:id="rId10">
+      <w:hyperlink r:id="rId11">
         <w:r>
           <w:rPr>
-            <w:rStyle w:val="Hypertextovodkaz"/>
+            <w:rStyle w:val="Hyperlink"/>
             <w:i/>
             <w:iCs/>
           </w:rPr>
@@ -1274,10 +1274,10 @@
       <w:r>
         <w:t xml:space="preserve">, </w:t>
       </w:r>
-      <w:hyperlink r:id="rId11">
+      <w:hyperlink r:id="rId12">
         <w:r>
           <w:rPr>
-            <w:rStyle w:val="Hypertextovodkaz"/>
+            <w:rStyle w:val="Hyperlink"/>
             <w:i/>
             <w:iCs/>
           </w:rPr>
@@ -1287,7 +1287,7 @@
     </w:p>
     <w:p>
       <w:pPr>
-        <w:pStyle w:val="Zkladntext"/>
+        <w:pStyle w:val="BodyText"/>
       </w:pPr>
       <w:r>
         <w:t>Are there any data sets available in the world that are relevant to your planned research?</w:t>
@@ -1295,7 +1295,7 @@
     </w:p>
     <w:p>
       <w:pPr>
-        <w:pStyle w:val="Zkladntext"/>
+        <w:pStyle w:val="BodyText"/>
       </w:pPr>
       <w:r>
         <w:t>✔️ b. Yes</w:t>
@@ -1303,7 +1303,7 @@
     </w:p>
     <w:p>
       <w:pPr>
-        <w:pStyle w:val="Nadpis4"/>
+        <w:pStyle w:val="Heading4"/>
       </w:pPr>
       <w:bookmarkStart w:id="17" w:name="X584b10d6c8a4d0b4c4067a6aa4bd5b8ae80fae4"/>
       <w:r>
@@ -1357,7 +1357,7 @@
     </w:p>
     <w:p>
       <w:pPr>
-        <w:pStyle w:val="Zkladntext"/>
+        <w:pStyle w:val="BodyText"/>
       </w:pPr>
       <w:r>
         <w:t xml:space="preserve">📖 </w:t>
@@ -1372,10 +1372,10 @@
       <w:r>
         <w:t xml:space="preserve"> </w:t>
       </w:r>
-      <w:hyperlink r:id="rId12">
+      <w:hyperlink r:id="rId13">
         <w:r>
           <w:rPr>
-            <w:rStyle w:val="Hypertextovodkaz"/>
+            <w:rStyle w:val="Hyperlink"/>
             <w:i/>
             <w:iCs/>
           </w:rPr>
@@ -1385,7 +1385,7 @@
     </w:p>
     <w:p>
       <w:pPr>
-        <w:pStyle w:val="Zkladntext"/>
+        <w:pStyle w:val="BodyText"/>
       </w:pPr>
       <w:r>
         <w:t>Will you be referring to any earlier measured data, reference data, or data that should be mined from existing literature? Your own data as well as data from others?</w:t>
@@ -1393,7 +1393,7 @@
     </w:p>
     <w:p>
       <w:pPr>
-        <w:pStyle w:val="Zkladntext"/>
+        <w:pStyle w:val="BodyText"/>
       </w:pPr>
       <w:r>
         <w:t>✔️ b. Yes</w:t>
@@ -1401,7 +1401,7 @@
     </w:p>
     <w:p>
       <w:pPr>
-        <w:pStyle w:val="Nadpis4"/>
+        <w:pStyle w:val="Heading4"/>
       </w:pPr>
       <w:bookmarkStart w:id="18" w:name="X375fd2279f5b9d536cf7822822a27bfb06b6447"/>
       <w:r>
@@ -1445,7 +1445,7 @@
     </w:p>
     <w:p>
       <w:pPr>
-        <w:pStyle w:val="Zkladntext"/>
+        <w:pStyle w:val="BodyText"/>
       </w:pPr>
       <w:r>
         <w:t xml:space="preserve">📖 </w:t>
@@ -1460,10 +1460,10 @@
       <w:r>
         <w:t xml:space="preserve"> </w:t>
       </w:r>
-      <w:hyperlink r:id="rId13">
+      <w:hyperlink r:id="rId14">
         <w:r>
           <w:rPr>
-            <w:rStyle w:val="Hypertextovodkaz"/>
+            <w:rStyle w:val="Hyperlink"/>
             <w:i/>
             <w:iCs/>
           </w:rPr>
@@ -1473,7 +1473,7 @@
     </w:p>
     <w:p>
       <w:pPr>
-        <w:pStyle w:val="Zkladntext"/>
+        <w:pStyle w:val="BodyText"/>
       </w:pPr>
       <w:r>
         <w:lastRenderedPageBreak/>
@@ -1482,7 +1482,7 @@
     </w:p>
     <w:p>
       <w:pPr>
-        <w:pStyle w:val="Nadpis4"/>
+        <w:pStyle w:val="Heading4"/>
       </w:pPr>
       <w:bookmarkStart w:id="19" w:name="answers-1-items-1"/>
       <w:bookmarkEnd w:id="18"/>
@@ -1492,7 +1492,7 @@
     </w:p>
     <w:p>
       <w:pPr>
-        <w:pStyle w:val="Nadpis4"/>
+        <w:pStyle w:val="Heading4"/>
       </w:pPr>
       <w:bookmarkStart w:id="20" w:name="Xc0e9de7ed320e207238cf337c8e7c9d1b6f74c9"/>
       <w:bookmarkStart w:id="21" w:name="X301d1ea611557b4ca204af8a206a0f12d110edb"/>
@@ -1538,7 +1538,7 @@
     </w:p>
     <w:p>
       <w:pPr>
-        <w:pStyle w:val="Zkladntext"/>
+        <w:pStyle w:val="BodyText"/>
       </w:pPr>
       <w:r>
         <w:t>Give the name of the database or dataset. You will be shown suggestions of data bases from FAIRSharing, but you can also type the name of a dataset that is not in FAIRsharing</w:t>
@@ -1546,7 +1546,7 @@
     </w:p>
     <w:p>
       <w:pPr>
-        <w:pStyle w:val="Zkladntext"/>
+        <w:pStyle w:val="BodyText"/>
       </w:pPr>
       <w:r>
         <w:t>✔️ Very interesting dataset</w:t>
@@ -1554,7 +1554,7 @@
     </w:p>
     <w:p>
       <w:pPr>
-        <w:pStyle w:val="Nadpis4"/>
+        <w:pStyle w:val="Heading4"/>
       </w:pPr>
       <w:bookmarkStart w:id="22" w:name="X8e29a106a187eb0642fe8d5279bb8cf9b22fb57"/>
       <w:bookmarkEnd w:id="20"/>
@@ -1599,7 +1599,7 @@
     </w:p>
     <w:p>
       <w:pPr>
-        <w:pStyle w:val="Zkladntext"/>
+        <w:pStyle w:val="BodyText"/>
       </w:pPr>
       <w:r>
         <w:t>Specify a URL or a persistent identifier (e.g. DOI) for the database or dataset. If possible, refer exactly to the version that you are using.</w:t>
@@ -1607,7 +1607,7 @@
     </w:p>
     <w:p>
       <w:pPr>
-        <w:pStyle w:val="Zkladntext"/>
+        <w:pStyle w:val="BodyText"/>
       </w:pPr>
       <w:r>
         <w:t>✔️ RandomDB</w:t>
@@ -1615,7 +1615,7 @@
     </w:p>
     <w:p>
       <w:pPr>
-        <w:pStyle w:val="Nadpis4"/>
+        <w:pStyle w:val="Heading4"/>
       </w:pPr>
       <w:bookmarkStart w:id="23" w:name="Xebf69fe190281a62f68675642e32d8f88e09446"/>
       <w:bookmarkEnd w:id="22"/>
@@ -1640,7 +1640,7 @@
     </w:p>
     <w:p>
       <w:pPr>
-        <w:pStyle w:val="Nadpis4"/>
+        <w:pStyle w:val="Heading4"/>
       </w:pPr>
       <w:bookmarkStart w:id="24" w:name="X4c4a291ddbd3915fc560e947d093efc6801c788"/>
       <w:bookmarkEnd w:id="23"/>
@@ -1685,7 +1685,7 @@
     </w:p>
     <w:p>
       <w:pPr>
-        <w:pStyle w:val="Zkladntext"/>
+        <w:pStyle w:val="BodyText"/>
       </w:pPr>
       <w:r>
         <w:t xml:space="preserve">🔗 </w:t>
@@ -1700,10 +1700,10 @@
       <w:r>
         <w:t xml:space="preserve"> </w:t>
       </w:r>
-      <w:hyperlink r:id="rId14">
+      <w:hyperlink r:id="rId15">
         <w:r>
           <w:rPr>
-            <w:rStyle w:val="Hypertextovodkaz"/>
+            <w:rStyle w:val="Hyperlink"/>
             <w:i/>
             <w:iCs/>
           </w:rPr>
@@ -1713,7 +1713,7 @@
     </w:p>
     <w:p>
       <w:pPr>
-        <w:pStyle w:val="Zkladntext"/>
+        <w:pStyle w:val="BodyText"/>
       </w:pPr>
       <w:r>
         <w:t xml:space="preserve">Although there is no world-wide rule for the application of copyright on data sets (copyright only applies to things that require a so-called "creative step"), it is wise to check for an explicit permission to use a data set and not to assume that data can be used freely just because you can access it. Note that copyright laws explicitly </w:t>
@@ -1741,7 +1741,7 @@
     </w:p>
     <w:p>
       <w:pPr>
-        <w:pStyle w:val="Zkladntext"/>
+        <w:pStyle w:val="BodyText"/>
       </w:pPr>
       <w:r>
         <w:t>✔️ b. They are freely available with obligation to quote the source (e.g. CC-BY)</w:t>
@@ -1749,7 +1749,7 @@
     </w:p>
     <w:p>
       <w:pPr>
-        <w:pStyle w:val="Nadpis1"/>
+        <w:pStyle w:val="Heading1"/>
       </w:pPr>
       <w:bookmarkStart w:id="25" w:name="iv.-processing-data"/>
       <w:bookmarkEnd w:id="13"/>
@@ -1772,7 +1772,7 @@
     </w:p>
     <w:p>
       <w:pPr>
-        <w:pStyle w:val="Nadpis3"/>
+        <w:pStyle w:val="Heading3"/>
       </w:pPr>
       <w:bookmarkStart w:id="26" w:name="summary-4"/>
       <w:r>
@@ -1781,7 +1781,7 @@
     </w:p>
     <w:p>
       <w:pPr>
-        <w:pStyle w:val="Nadpis4"/>
+        <w:pStyle w:val="Heading4"/>
       </w:pPr>
       <w:bookmarkStart w:id="27" w:name="answered-indication-4"/>
       <w:r>
@@ -1884,7 +1884,7 @@
     </w:tbl>
     <w:p>
       <w:pPr>
-        <w:pStyle w:val="Nadpis4"/>
+        <w:pStyle w:val="Heading4"/>
       </w:pPr>
       <w:bookmarkStart w:id="28" w:name="metrics-2"/>
       <w:bookmarkEnd w:id="27"/>
@@ -1993,7 +1993,7 @@
     </w:tbl>
     <w:p>
       <w:pPr>
-        <w:pStyle w:val="Nadpis4"/>
+        <w:pStyle w:val="Heading4"/>
       </w:pPr>
       <w:bookmarkStart w:id="29" w:name="X6c3d2499b5757d9a9805c23b602212ee0a9cfeb"/>
       <w:bookmarkEnd w:id="26"/>
@@ -2039,7 +2039,7 @@
     </w:p>
     <w:p>
       <w:pPr>
-        <w:pStyle w:val="Zkladntext"/>
+        <w:pStyle w:val="BodyText"/>
       </w:pPr>
       <w:r>
         <w:t xml:space="preserve">Will you be using a working space that is shared between all the people working on the data in the project? Sometimes such a system is called a </w:t>
@@ -2057,7 +2057,7 @@
     </w:p>
     <w:p>
       <w:pPr>
-        <w:pStyle w:val="Zkladntext"/>
+        <w:pStyle w:val="BodyText"/>
       </w:pPr>
       <w:r>
         <w:t>✔️ a. No</w:t>
@@ -2065,7 +2065,7 @@
     </w:p>
     <w:p>
       <w:pPr>
-        <w:pStyle w:val="Nadpis4"/>
+        <w:pStyle w:val="Heading4"/>
       </w:pPr>
       <w:bookmarkStart w:id="30" w:name="X9cdcb3be6232614d01849efa9cee7c3a7fe5fd0"/>
       <w:r>
@@ -2099,7 +2099,7 @@
     </w:p>
     <w:p>
       <w:pPr>
-        <w:pStyle w:val="Zkladntext"/>
+        <w:pStyle w:val="BodyText"/>
       </w:pPr>
       <w:r>
         <w:t>✔️ b. Yes, protected against both equipment failure and human error</w:t>
@@ -2107,7 +2107,7 @@
     </w:p>
     <w:p>
       <w:pPr>
-        <w:pStyle w:val="Nadpis4"/>
+        <w:pStyle w:val="Heading4"/>
       </w:pPr>
       <w:bookmarkStart w:id="31" w:name="X8d59062b5528917c569e4bb263189686898b5d8"/>
       <w:bookmarkEnd w:id="29"/>
@@ -2143,7 +2143,7 @@
     </w:p>
     <w:p>
       <w:pPr>
-        <w:pStyle w:val="Zkladntext"/>
+        <w:pStyle w:val="BodyText"/>
       </w:pPr>
       <w:r>
         <w:t>It is a good idea to pre-define how data will be organised in the project work space, and to set conventions for how any data files and folders will be named.</w:t>
@@ -2151,7 +2151,7 @@
     </w:p>
     <w:p>
       <w:pPr>
-        <w:pStyle w:val="Zkladntext"/>
+        <w:pStyle w:val="BodyText"/>
       </w:pPr>
       <w:r>
         <w:t xml:space="preserve">❗ </w:t>
@@ -2166,7 +2166,7 @@
     </w:p>
     <w:p>
       <w:pPr>
-        <w:pStyle w:val="Nadpis4"/>
+        <w:pStyle w:val="Heading4"/>
       </w:pPr>
       <w:bookmarkStart w:id="32" w:name="workflow-development"/>
       <w:bookmarkEnd w:id="31"/>
@@ -2184,7 +2184,7 @@
     </w:p>
     <w:p>
       <w:pPr>
-        <w:pStyle w:val="Zkladntext"/>
+        <w:pStyle w:val="BodyText"/>
       </w:pPr>
       <w:r>
         <w:lastRenderedPageBreak/>
@@ -2193,7 +2193,7 @@
     </w:p>
     <w:p>
       <w:pPr>
-        <w:pStyle w:val="Nadpis4"/>
+        <w:pStyle w:val="Heading4"/>
       </w:pPr>
       <w:bookmarkStart w:id="33" w:name="X8138edc684f2763b2092a317c8b02563015428a"/>
       <w:bookmarkEnd w:id="32"/>
@@ -2218,7 +2218,7 @@
     </w:p>
     <w:p>
       <w:pPr>
-        <w:pStyle w:val="Nadpis4"/>
+        <w:pStyle w:val="Heading4"/>
       </w:pPr>
       <w:bookmarkStart w:id="34" w:name="X5fcdea77589c0b6b6d5c6c9fa030e9189e1aa77"/>
       <w:bookmarkEnd w:id="33"/>
@@ -2253,7 +2253,7 @@
     </w:p>
     <w:p>
       <w:pPr>
-        <w:pStyle w:val="Zkladntext"/>
+        <w:pStyle w:val="BodyText"/>
       </w:pPr>
       <w:r>
         <w:t>✔️ a. Explore</w:t>
@@ -2261,7 +2261,7 @@
     </w:p>
     <w:p>
       <w:pPr>
-        <w:pStyle w:val="Nadpis4"/>
+        <w:pStyle w:val="Heading4"/>
       </w:pPr>
       <w:bookmarkStart w:id="35" w:name="Xa51d0d2ea026781d0a0f5872adffad76390fa2c"/>
       <w:r>
@@ -2295,7 +2295,7 @@
     </w:p>
     <w:p>
       <w:pPr>
-        <w:pStyle w:val="Zkladntext"/>
+        <w:pStyle w:val="BodyText"/>
       </w:pPr>
       <w:r>
         <w:t>There are surprisingly many complications that can cause (slight) inconsistencies between results when workflows are run on different compute infrastructures. A good way to make sure this does not bite you is to run a subset of all jobs on all different infrastructure to check the consistency.</w:t>
@@ -2303,7 +2303,7 @@
     </w:p>
     <w:p>
       <w:pPr>
-        <w:pStyle w:val="Zkladntext"/>
+        <w:pStyle w:val="BodyText"/>
       </w:pPr>
       <w:r>
         <w:t>✔️ b. Yes</w:t>
@@ -2311,7 +2311,7 @@
     </w:p>
     <w:p>
       <w:pPr>
-        <w:pStyle w:val="Nadpis4"/>
+        <w:pStyle w:val="Heading4"/>
       </w:pPr>
       <w:bookmarkStart w:id="36" w:name="X6c78a688433fe65ab2f9d4d35fe801e8494a11c"/>
       <w:bookmarkEnd w:id="35"/>
@@ -2346,7 +2346,7 @@
     </w:p>
     <w:p>
       <w:pPr>
-        <w:pStyle w:val="Zkladntext"/>
+        <w:pStyle w:val="BodyText"/>
       </w:pPr>
       <w:r>
         <w:t>Surrounding all tools in your data processing and analysis workflows with the 'boilerplate' code necessary on the computer system you are using is tedious and error prone. Especially if you are using the same tools in multiple different work flows and/or on multiple different computer architectures. Automated instrumentation, e.g. by using a workflow management system, can prevent many mistakes.</w:t>
@@ -2354,7 +2354,7 @@
     </w:p>
     <w:p>
       <w:pPr>
-        <w:pStyle w:val="Zkladntext"/>
+        <w:pStyle w:val="BodyText"/>
       </w:pPr>
       <w:r>
         <w:t>✔️ a. No</w:t>
@@ -2362,7 +2362,7 @@
     </w:p>
     <w:p>
       <w:pPr>
-        <w:pStyle w:val="Nadpis4"/>
+        <w:pStyle w:val="Heading4"/>
       </w:pPr>
       <w:bookmarkStart w:id="37" w:name="X391db5e734d82e6917f19bcbdb18bb0ac6fb4c0"/>
       <w:bookmarkEnd w:id="36"/>
@@ -2397,7 +2397,7 @@
     </w:p>
     <w:p>
       <w:pPr>
-        <w:pStyle w:val="Zkladntext"/>
+        <w:pStyle w:val="BodyText"/>
       </w:pPr>
       <w:r>
         <w:t>Validation of results without a golden standard is very hard. One way of doing it is to develop two solutions for a problem (two independent workflows or two independently developed tools) to check whether the results are identical or comparable.</w:t>
@@ -2405,7 +2405,7 @@
     </w:p>
     <w:p>
       <w:pPr>
-        <w:pStyle w:val="Zkladntext"/>
+        <w:pStyle w:val="BodyText"/>
       </w:pPr>
       <w:r>
         <w:t>✔️ b. Yes</w:t>
@@ -2413,7 +2413,7 @@
     </w:p>
     <w:p>
       <w:pPr>
-        <w:pStyle w:val="Nadpis4"/>
+        <w:pStyle w:val="Heading4"/>
       </w:pPr>
       <w:bookmarkStart w:id="38" w:name="X584458674d7c38d3dd6e4993a12d293d8fdbb40"/>
       <w:bookmarkEnd w:id="37"/>
@@ -2448,7 +2448,7 @@
     </w:p>
     <w:p>
       <w:pPr>
-        <w:pStyle w:val="Zkladntext"/>
+        <w:pStyle w:val="BodyText"/>
       </w:pPr>
       <w:r>
         <w:lastRenderedPageBreak/>
@@ -2464,10 +2464,10 @@
       <w:r>
         <w:t xml:space="preserve"> </w:t>
       </w:r>
-      <w:hyperlink r:id="rId15">
+      <w:hyperlink r:id="rId16">
         <w:r>
           <w:rPr>
-            <w:rStyle w:val="Hypertextovodkaz"/>
+            <w:rStyle w:val="Hyperlink"/>
             <w:i/>
             <w:iCs/>
           </w:rPr>
@@ -2477,7 +2477,7 @@
     </w:p>
     <w:p>
       <w:pPr>
-        <w:pStyle w:val="Zkladntext"/>
+        <w:pStyle w:val="BodyText"/>
       </w:pPr>
       <w:r>
         <w:t>Running a small subset of the data repeatedly can be useful to catch unexpected problems that would otherwise be very hard to detect.</w:t>
@@ -2485,7 +2485,7 @@
     </w:p>
     <w:p>
       <w:pPr>
-        <w:pStyle w:val="Zkladntext"/>
+        <w:pStyle w:val="BodyText"/>
       </w:pPr>
       <w:r>
         <w:t>✔️ b. Yes</w:t>
@@ -2493,7 +2493,7 @@
     </w:p>
     <w:p>
       <w:pPr>
-        <w:pStyle w:val="Nadpis4"/>
+        <w:pStyle w:val="Heading4"/>
       </w:pPr>
       <w:bookmarkStart w:id="39" w:name="X3577f66812acb323b1998a4444da8e2d48badcc"/>
       <w:bookmarkEnd w:id="34"/>
@@ -2512,7 +2512,7 @@
     </w:p>
     <w:p>
       <w:pPr>
-        <w:pStyle w:val="Zkladntext"/>
+        <w:pStyle w:val="BodyText"/>
       </w:pPr>
       <w:r>
         <w:t>✔️ a. No</w:t>
@@ -2520,7 +2520,7 @@
     </w:p>
     <w:p>
       <w:pPr>
-        <w:pStyle w:val="Nadpis4"/>
+        <w:pStyle w:val="Heading4"/>
       </w:pPr>
       <w:bookmarkStart w:id="40" w:name="X08b1998e72b1edcf3bc76483422caed958f4cd3"/>
       <w:bookmarkEnd w:id="39"/>
@@ -2565,7 +2565,7 @@
     </w:p>
     <w:p>
       <w:pPr>
-        <w:pStyle w:val="Zkladntext"/>
+        <w:pStyle w:val="BodyText"/>
       </w:pPr>
       <w:r>
         <w:t>There are many factors that can contribute to the risk of information loss or information leaks. They are often part of the behavior of the people that are involved in the project, but can also be steered by properly planned infrastructure.</w:t>
@@ -2573,7 +2573,7 @@
     </w:p>
     <w:p>
       <w:pPr>
-        <w:pStyle w:val="Zkladntext"/>
+        <w:pStyle w:val="BodyText"/>
       </w:pPr>
       <w:r>
         <w:t xml:space="preserve">❗ </w:t>
@@ -2588,7 +2588,7 @@
     </w:p>
     <w:p>
       <w:pPr>
-        <w:pStyle w:val="Nadpis4"/>
+        <w:pStyle w:val="Heading4"/>
       </w:pPr>
       <w:bookmarkStart w:id="41" w:name="do-you-have-a-contingency-plan"/>
       <w:bookmarkEnd w:id="40"/>
@@ -2606,7 +2606,7 @@
     </w:p>
     <w:p>
       <w:pPr>
-        <w:pStyle w:val="Zkladntext"/>
+        <w:pStyle w:val="BodyText"/>
       </w:pPr>
       <w:r>
         <w:t>✔️ a. We will wait until the problem is fixed</w:t>
@@ -2621,7 +2621,7 @@
     </w:p>
     <w:p>
       <w:pPr>
-        <w:pStyle w:val="Nadpis1"/>
+        <w:pStyle w:val="Heading1"/>
       </w:pPr>
       <w:bookmarkStart w:id="42" w:name="v.-interpreting-data"/>
       <w:r>
@@ -2639,7 +2639,7 @@
     </w:p>
     <w:p>
       <w:pPr>
-        <w:pStyle w:val="Nadpis3"/>
+        <w:pStyle w:val="Heading3"/>
       </w:pPr>
       <w:bookmarkStart w:id="43" w:name="summary-5"/>
       <w:r>
@@ -2648,7 +2648,7 @@
     </w:p>
     <w:p>
       <w:pPr>
-        <w:pStyle w:val="Nadpis4"/>
+        <w:pStyle w:val="Heading4"/>
       </w:pPr>
       <w:bookmarkStart w:id="44" w:name="answered-indication-5"/>
       <w:r>
@@ -2751,7 +2751,7 @@
     </w:tbl>
     <w:p>
       <w:pPr>
-        <w:pStyle w:val="Nadpis4"/>
+        <w:pStyle w:val="Heading4"/>
       </w:pPr>
       <w:bookmarkStart w:id="45" w:name="metrics-3"/>
       <w:bookmarkEnd w:id="44"/>
@@ -2832,7 +2832,7 @@
     </w:tbl>
     <w:p>
       <w:pPr>
-        <w:pStyle w:val="Nadpis4"/>
+        <w:pStyle w:val="Heading4"/>
       </w:pPr>
       <w:bookmarkStart w:id="46" w:name="Xea3c249504abc08f8fd320ff617f81dd214ea1e"/>
       <w:bookmarkEnd w:id="43"/>
@@ -2851,7 +2851,7 @@
     </w:p>
     <w:p>
       <w:pPr>
-        <w:pStyle w:val="Zkladntext"/>
+        <w:pStyle w:val="BodyText"/>
       </w:pPr>
       <w:r>
         <w:t>If you have data in many different structures, integrating the data may be more challenging.</w:t>
@@ -2859,7 +2859,7 @@
     </w:p>
     <w:p>
       <w:pPr>
-        <w:pStyle w:val="Zkladntext"/>
+        <w:pStyle w:val="BodyText"/>
       </w:pPr>
       <w:r>
         <w:t xml:space="preserve">❗ </w:t>
@@ -2874,7 +2874,7 @@
     </w:p>
     <w:p>
       <w:pPr>
-        <w:pStyle w:val="Nadpis4"/>
+        <w:pStyle w:val="Heading4"/>
       </w:pPr>
       <w:bookmarkStart w:id="47" w:name="Xe81061cce9d7f7c72dc5648c5ed060de142aa95"/>
       <w:bookmarkEnd w:id="46"/>
@@ -2892,7 +2892,7 @@
     </w:p>
     <w:p>
       <w:pPr>
-        <w:pStyle w:val="Zkladntext"/>
+        <w:pStyle w:val="BodyText"/>
       </w:pPr>
       <w:r>
         <w:t>This is an advanced subject that you may want to skip if this is not an issue for you. On the other hand, if this is your expertise we would like your help in improving the questions in this section.</w:t>
@@ -2900,7 +2900,7 @@
     </w:p>
     <w:p>
       <w:pPr>
-        <w:pStyle w:val="Zkladntext"/>
+        <w:pStyle w:val="BodyText"/>
       </w:pPr>
       <w:r>
         <w:t>✔️ a. No</w:t>
@@ -2908,7 +2908,7 @@
     </w:p>
     <w:p>
       <w:pPr>
-        <w:pStyle w:val="Nadpis4"/>
+        <w:pStyle w:val="Heading4"/>
       </w:pPr>
       <w:bookmarkStart w:id="48" w:name="Xbdddbea4bad26b7a4aa08a184698f09d4d5de9e"/>
       <w:bookmarkEnd w:id="47"/>
@@ -2926,7 +2926,7 @@
     </w:p>
     <w:p>
       <w:pPr>
-        <w:pStyle w:val="Nadpis4"/>
+        <w:pStyle w:val="Heading4"/>
       </w:pPr>
       <w:bookmarkStart w:id="49" w:name="will-you-be-using-common-ontologies"/>
       <w:bookmarkEnd w:id="48"/>
@@ -2944,7 +2944,7 @@
     </w:p>
     <w:p>
       <w:pPr>
-        <w:pStyle w:val="Nadpis4"/>
+        <w:pStyle w:val="Heading4"/>
       </w:pPr>
       <w:bookmarkStart w:id="50" w:name="Xd23dc2cb8c1e4b31ad71cb04d8ae9f0cfaac6cb"/>
       <w:bookmarkEnd w:id="49"/>
@@ -2962,7 +2962,7 @@
     </w:p>
     <w:p>
       <w:pPr>
-        <w:pStyle w:val="Nadpis4"/>
+        <w:pStyle w:val="Heading4"/>
       </w:pPr>
       <w:bookmarkStart w:id="51" w:name="X57e91ed789d19fb103868c749baf27a5008c764"/>
       <w:bookmarkEnd w:id="50"/>
@@ -2981,7 +2981,7 @@
     </w:p>
     <w:p>
       <w:pPr>
-        <w:pStyle w:val="Nadpis4"/>
+        <w:pStyle w:val="Heading4"/>
       </w:pPr>
       <w:bookmarkStart w:id="52" w:name="Xf82bc4e83a263413b91eb10885393742c90dd78"/>
       <w:bookmarkEnd w:id="51"/>
@@ -2999,7 +2999,7 @@
     </w:p>
     <w:p>
       <w:pPr>
-        <w:pStyle w:val="Nadpis4"/>
+        <w:pStyle w:val="Heading4"/>
       </w:pPr>
       <w:bookmarkStart w:id="53" w:name="X4c80df1f8234164578884282249913c98c68dfd"/>
       <w:bookmarkEnd w:id="52"/>
@@ -3017,7 +3017,7 @@
     </w:p>
     <w:p>
       <w:pPr>
-        <w:pStyle w:val="Nadpis4"/>
+        <w:pStyle w:val="Heading4"/>
       </w:pPr>
       <w:bookmarkStart w:id="54" w:name="X1e5b4e9ec5258b60fa0f0b23d2463f73ffb1bd7"/>
       <w:bookmarkEnd w:id="53"/>
@@ -3042,10 +3042,10 @@
       <w:r>
         <w:t xml:space="preserve"> </w:t>
       </w:r>
-      <w:hyperlink r:id="rId16">
+      <w:hyperlink r:id="rId17">
         <w:r>
           <w:rPr>
-            <w:rStyle w:val="Hypertextovodkaz"/>
+            <w:rStyle w:val="Hyperlink"/>
             <w:i/>
             <w:iCs/>
           </w:rPr>
@@ -3055,7 +3055,7 @@
     </w:p>
     <w:p>
       <w:pPr>
-        <w:pStyle w:val="Zkladntext"/>
+        <w:pStyle w:val="BodyText"/>
       </w:pPr>
       <w:r>
         <w:t>✔️ a. No</w:t>
@@ -3070,7 +3070,7 @@
     </w:p>
     <w:p>
       <w:pPr>
-        <w:pStyle w:val="Nadpis1"/>
+        <w:pStyle w:val="Heading1"/>
       </w:pPr>
       <w:bookmarkStart w:id="55" w:name="vi.-preserving-data"/>
       <w:r>
@@ -3088,7 +3088,7 @@
     </w:p>
     <w:p>
       <w:pPr>
-        <w:pStyle w:val="Nadpis3"/>
+        <w:pStyle w:val="Heading3"/>
       </w:pPr>
       <w:bookmarkStart w:id="56" w:name="summary-6"/>
       <w:r>
@@ -3097,7 +3097,7 @@
     </w:p>
     <w:p>
       <w:pPr>
-        <w:pStyle w:val="Nadpis4"/>
+        <w:pStyle w:val="Heading4"/>
       </w:pPr>
       <w:bookmarkStart w:id="57" w:name="answered-indication-6"/>
       <w:r>
@@ -3200,7 +3200,7 @@
     </w:tbl>
     <w:p>
       <w:pPr>
-        <w:pStyle w:val="Nadpis4"/>
+        <w:pStyle w:val="Heading4"/>
       </w:pPr>
       <w:bookmarkStart w:id="58" w:name="metrics-4"/>
       <w:bookmarkEnd w:id="57"/>
@@ -3365,7 +3365,7 @@
     </w:tbl>
     <w:p>
       <w:pPr>
-        <w:pStyle w:val="Nadpis4"/>
+        <w:pStyle w:val="Heading4"/>
       </w:pPr>
       <w:bookmarkStart w:id="59" w:name="X988de40c278035602bd6093aa8ea9a95d84c7fd"/>
       <w:bookmarkEnd w:id="56"/>
@@ -3421,7 +3421,7 @@
     </w:p>
     <w:p>
       <w:pPr>
-        <w:pStyle w:val="Zkladntext"/>
+        <w:pStyle w:val="BodyText"/>
       </w:pPr>
       <w:r>
         <w:t>Add all the data sets you will be producing. Give each a short name, sufficient for yourself to know what data it is about. It is useful to think about a data set as some collection of data that will be ending up in the same place.</w:t>
@@ -3429,7 +3429,7 @@
     </w:p>
     <w:p>
       <w:pPr>
-        <w:pStyle w:val="Zkladntext"/>
+        <w:pStyle w:val="BodyText"/>
       </w:pPr>
       <w:r>
         <w:t xml:space="preserve">❗ </w:t>
@@ -3444,7 +3444,7 @@
     </w:p>
     <w:p>
       <w:pPr>
-        <w:pStyle w:val="Nadpis4"/>
+        <w:pStyle w:val="Heading4"/>
       </w:pPr>
       <w:bookmarkStart w:id="60" w:name="X3dbbc2e204472a6379e8b6f9847f955a4f2798f"/>
       <w:bookmarkEnd w:id="59"/>
@@ -3479,7 +3479,7 @@
     </w:p>
     <w:p>
       <w:pPr>
-        <w:pStyle w:val="Zkladntext"/>
+        <w:pStyle w:val="BodyText"/>
       </w:pPr>
       <w:r>
         <w:t xml:space="preserve">📖 </w:t>
@@ -3494,10 +3494,10 @@
       <w:r>
         <w:t xml:space="preserve"> </w:t>
       </w:r>
-      <w:hyperlink r:id="rId17">
+      <w:hyperlink r:id="rId18">
         <w:r>
           <w:rPr>
-            <w:rStyle w:val="Hypertextovodkaz"/>
+            <w:rStyle w:val="Hyperlink"/>
             <w:i/>
             <w:iCs/>
           </w:rPr>
@@ -3507,7 +3507,7 @@
     </w:p>
     <w:p>
       <w:pPr>
-        <w:pStyle w:val="Zkladntext"/>
+        <w:pStyle w:val="BodyText"/>
       </w:pPr>
       <w:r>
         <w:t>Much of the raw data you have will need to be archived for your own later use somewhere. This is often done off-line on tape, not on the disks of the compute facility. Please note that this does not refer to the data publication.</w:t>
@@ -3515,7 +3515,7 @@
     </w:p>
     <w:p>
       <w:pPr>
-        <w:pStyle w:val="Zkladntext"/>
+        <w:pStyle w:val="BodyText"/>
       </w:pPr>
       <w:r>
         <w:t>✔️ b. Yes</w:t>
@@ -3523,7 +3523,7 @@
     </w:p>
     <w:p>
       <w:pPr>
-        <w:pStyle w:val="Nadpis4"/>
+        <w:pStyle w:val="Heading4"/>
       </w:pPr>
       <w:bookmarkStart w:id="61" w:name="Xd821dbfce3168de019d01db4c4adbfaf8f2e19e"/>
       <w:r>
@@ -3547,10 +3547,10 @@
       <w:r>
         <w:t xml:space="preserve"> </w:t>
       </w:r>
-      <w:hyperlink r:id="rId18">
+      <w:hyperlink r:id="rId19">
         <w:r>
           <w:rPr>
-            <w:rStyle w:val="Hypertextovodkaz"/>
+            <w:rStyle w:val="Hyperlink"/>
             <w:i/>
             <w:iCs/>
           </w:rPr>
@@ -3560,7 +3560,7 @@
     </w:p>
     <w:p>
       <w:pPr>
-        <w:pStyle w:val="Zkladntext"/>
+        <w:pStyle w:val="BodyText"/>
       </w:pPr>
       <w:r>
         <w:t>✔️ b. Yes</w:t>
@@ -3568,7 +3568,7 @@
     </w:p>
     <w:p>
       <w:pPr>
-        <w:pStyle w:val="Nadpis4"/>
+        <w:pStyle w:val="Heading4"/>
       </w:pPr>
       <w:bookmarkStart w:id="62" w:name="b.1.b.1.-do-you-need-frequent-backups"/>
       <w:r>
@@ -3586,7 +3586,7 @@
     </w:p>
     <w:p>
       <w:pPr>
-        <w:pStyle w:val="Zkladntext"/>
+        <w:pStyle w:val="BodyText"/>
       </w:pPr>
       <w:r>
         <w:t>✔️ b. Yes, data changes frequently</w:t>
@@ -3594,7 +3594,7 @@
     </w:p>
     <w:p>
       <w:pPr>
-        <w:pStyle w:val="Nadpis4"/>
+        <w:pStyle w:val="Heading4"/>
       </w:pPr>
       <w:bookmarkStart w:id="63" w:name="Xcfb3cf91541e8e3d230432c3a4bc0afb913a214"/>
       <w:bookmarkEnd w:id="62"/>
@@ -3612,7 +3612,7 @@
     </w:p>
     <w:p>
       <w:pPr>
-        <w:pStyle w:val="Zkladntext"/>
+        <w:pStyle w:val="BodyText"/>
       </w:pPr>
       <w:r>
         <w:rPr>
@@ -3624,7 +3624,7 @@
     </w:p>
     <w:p>
       <w:pPr>
-        <w:pStyle w:val="Zkladntext"/>
+        <w:pStyle w:val="BodyText"/>
       </w:pPr>
       <w:r>
         <w:t>This puts other demands on the possibility to restore files. Make sure this is covered</w:t>
@@ -3632,7 +3632,7 @@
     </w:p>
     <w:p>
       <w:pPr>
-        <w:pStyle w:val="Nadpis4"/>
+        <w:pStyle w:val="Heading4"/>
       </w:pPr>
       <w:bookmarkStart w:id="64" w:name="X8269ee5b82120913e58bc3509fe55bb4d5f6267"/>
       <w:bookmarkEnd w:id="61"/>
@@ -3651,7 +3651,7 @@
     </w:p>
     <w:p>
       <w:pPr>
-        <w:pStyle w:val="Nadpis4"/>
+        <w:pStyle w:val="Heading4"/>
       </w:pPr>
       <w:bookmarkStart w:id="65" w:name="X076a0c65f5a612dbfcaf9c9085f7b54ad9204ce"/>
       <w:bookmarkEnd w:id="64"/>
@@ -3686,7 +3686,7 @@
     </w:p>
     <w:p>
       <w:pPr>
-        <w:pStyle w:val="Zkladntext"/>
+        <w:pStyle w:val="BodyText"/>
       </w:pPr>
       <w:r>
         <w:t>✔️ a. No</w:t>
@@ -3694,7 +3694,7 @@
     </w:p>
     <w:p>
       <w:pPr>
-        <w:pStyle w:val="Nadpis4"/>
+        <w:pStyle w:val="Heading4"/>
       </w:pPr>
       <w:bookmarkStart w:id="66" w:name="X51ece24d2c0f7ec6e310909dcc63f438b7bbd21"/>
       <w:bookmarkEnd w:id="65"/>
@@ -3729,7 +3729,7 @@
     </w:p>
     <w:p>
       <w:pPr>
-        <w:pStyle w:val="Zkladntext"/>
+        <w:pStyle w:val="BodyText"/>
       </w:pPr>
       <w:r>
         <w:t>✔️ a. No</w:t>
@@ -3737,7 +3737,7 @@
     </w:p>
     <w:p>
       <w:pPr>
-        <w:pStyle w:val="Nadpis4"/>
+        <w:pStyle w:val="Heading4"/>
       </w:pPr>
       <w:bookmarkStart w:id="67" w:name="Xef057df3d8274c3526ebf93cb3677b392923297"/>
       <w:bookmarkEnd w:id="66"/>
@@ -3762,10 +3762,10 @@
       <w:r>
         <w:t xml:space="preserve"> </w:t>
       </w:r>
-      <w:hyperlink r:id="rId19">
+      <w:hyperlink r:id="rId20">
         <w:r>
           <w:rPr>
-            <w:rStyle w:val="Hypertextovodkaz"/>
+            <w:rStyle w:val="Hyperlink"/>
             <w:i/>
             <w:iCs/>
           </w:rPr>
@@ -3775,7 +3775,7 @@
     </w:p>
     <w:p>
       <w:pPr>
-        <w:pStyle w:val="Zkladntext"/>
+        <w:pStyle w:val="BodyText"/>
       </w:pPr>
       <w:r>
         <w:t>✔️ a. No</w:t>
@@ -3783,7 +3783,7 @@
     </w:p>
     <w:p>
       <w:pPr>
-        <w:pStyle w:val="Nadpis4"/>
+        <w:pStyle w:val="Heading4"/>
       </w:pPr>
       <w:bookmarkStart w:id="68" w:name="X73a04a064ee3d82323da5cc6e173e92bd199550"/>
       <w:bookmarkEnd w:id="67"/>
@@ -3808,7 +3808,7 @@
     </w:p>
     <w:p>
       <w:pPr>
-        <w:pStyle w:val="Nadpis4"/>
+        <w:pStyle w:val="Heading4"/>
       </w:pPr>
       <w:bookmarkStart w:id="69" w:name="X93aef7b3abab0ca5474e11140b3923659edf3ed"/>
       <w:bookmarkEnd w:id="68"/>
@@ -3833,10 +3833,10 @@
       <w:r>
         <w:t xml:space="preserve"> </w:t>
       </w:r>
-      <w:hyperlink r:id="rId20">
+      <w:hyperlink r:id="rId21">
         <w:r>
           <w:rPr>
-            <w:rStyle w:val="Hypertextovodkaz"/>
+            <w:rStyle w:val="Hyperlink"/>
             <w:i/>
             <w:iCs/>
           </w:rPr>
@@ -3846,7 +3846,7 @@
     </w:p>
     <w:p>
       <w:pPr>
-        <w:pStyle w:val="Zkladntext"/>
+        <w:pStyle w:val="BodyText"/>
       </w:pPr>
       <w:r>
         <w:t xml:space="preserve">❗ </w:t>
@@ -3861,7 +3861,7 @@
     </w:p>
     <w:p>
       <w:pPr>
-        <w:pStyle w:val="Nadpis4"/>
+        <w:pStyle w:val="Heading4"/>
       </w:pPr>
       <w:bookmarkStart w:id="70" w:name="Xdd917f17f1c19869567a0bec33469b3d0100c0b"/>
       <w:bookmarkEnd w:id="69"/>
@@ -3897,7 +3897,7 @@
     </w:p>
     <w:p>
       <w:pPr>
-        <w:pStyle w:val="Zkladntext"/>
+        <w:pStyle w:val="BodyText"/>
       </w:pPr>
       <w:r>
         <w:t xml:space="preserve">📖 </w:t>
@@ -3912,10 +3912,10 @@
       <w:r>
         <w:t xml:space="preserve"> </w:t>
       </w:r>
-      <w:hyperlink r:id="rId21">
+      <w:hyperlink r:id="rId22">
         <w:r>
           <w:rPr>
-            <w:rStyle w:val="Hypertextovodkaz"/>
+            <w:rStyle w:val="Hyperlink"/>
             <w:i/>
             <w:iCs/>
           </w:rPr>
@@ -3925,7 +3925,7 @@
     </w:p>
     <w:p>
       <w:pPr>
-        <w:pStyle w:val="Zkladntext"/>
+        <w:pStyle w:val="BodyText"/>
       </w:pPr>
       <w:r>
         <w:t>See also all questions about keeping metadata and data formats. Make sure the metadata is kept close to the data in the archive, and that community supported data formats are used for all long term archiving.</w:t>
@@ -3933,7 +3933,7 @@
     </w:p>
     <w:p>
       <w:pPr>
-        <w:pStyle w:val="Zkladntext"/>
+        <w:pStyle w:val="BodyText"/>
       </w:pPr>
       <w:r>
         <w:t>✔️ b. Yes</w:t>
@@ -3941,7 +3941,7 @@
     </w:p>
     <w:p>
       <w:pPr>
-        <w:pStyle w:val="Nadpis4"/>
+        <w:pStyle w:val="Heading4"/>
       </w:pPr>
       <w:bookmarkStart w:id="71" w:name="Xe1fe98f4321058ad82c8c28f1531013ae593059"/>
       <w:bookmarkEnd w:id="60"/>
@@ -3977,7 +3977,7 @@
     </w:p>
     <w:p>
       <w:pPr>
-        <w:pStyle w:val="Zkladntext"/>
+        <w:pStyle w:val="BodyText"/>
       </w:pPr>
       <w:r>
         <w:t xml:space="preserve">📖 </w:t>
@@ -3992,10 +3992,10 @@
       <w:r>
         <w:t xml:space="preserve"> </w:t>
       </w:r>
-      <w:hyperlink r:id="rId22">
+      <w:hyperlink r:id="rId23">
         <w:r>
           <w:rPr>
-            <w:rStyle w:val="Hypertextovodkaz"/>
+            <w:rStyle w:val="Hyperlink"/>
             <w:i/>
             <w:iCs/>
           </w:rPr>
@@ -4005,7 +4005,7 @@
     </w:p>
     <w:p>
       <w:pPr>
-        <w:pStyle w:val="Zkladntext"/>
+        <w:pStyle w:val="BodyText"/>
       </w:pPr>
       <w:r>
         <w:t>Will you be storing (in cold storage) copies of your own data for a longer period after the project has ended? Possibly as a continuation of archival as part of data storage strategy during the project? Data archival is distinct from data publishing, an archive is usually strictly limited in who can access the data.</w:t>
@@ -4013,7 +4013,7 @@
     </w:p>
     <w:p>
       <w:pPr>
-        <w:pStyle w:val="Zkladntext"/>
+        <w:pStyle w:val="BodyText"/>
       </w:pPr>
       <w:r>
         <w:t>✔️ a. No</w:t>
@@ -4021,7 +4021,7 @@
     </w:p>
     <w:p>
       <w:pPr>
-        <w:pStyle w:val="Nadpis4"/>
+        <w:pStyle w:val="Heading4"/>
       </w:pPr>
       <w:bookmarkStart w:id="72" w:name="X23c1fcf891c4106060dda739a4bbd2e3c93dcc1"/>
       <w:bookmarkEnd w:id="71"/>
@@ -4066,7 +4066,7 @@
     </w:p>
     <w:p>
       <w:pPr>
-        <w:pStyle w:val="Zkladntext"/>
+        <w:pStyle w:val="BodyText"/>
       </w:pPr>
       <w:r>
         <w:t>✔️ b. Yes</w:t>
@@ -4074,7 +4074,7 @@
     </w:p>
     <w:p>
       <w:pPr>
-        <w:pStyle w:val="Nadpis4"/>
+        <w:pStyle w:val="Heading4"/>
       </w:pPr>
       <w:bookmarkStart w:id="73" w:name="Xb7a635454eb849ad400810fdd4d5e8c4b56f10f"/>
       <w:r>
@@ -4118,7 +4118,7 @@
     </w:p>
     <w:p>
       <w:pPr>
-        <w:pStyle w:val="Zkladntext"/>
+        <w:pStyle w:val="BodyText"/>
       </w:pPr>
       <w:r>
         <w:t>✔️ b. These costs will be carried by (one of) the departments involved in the project</w:t>
@@ -4126,7 +4126,7 @@
     </w:p>
     <w:p>
       <w:pPr>
-        <w:pStyle w:val="Nadpis4"/>
+        <w:pStyle w:val="Heading4"/>
       </w:pPr>
       <w:bookmarkStart w:id="74" w:name="X929f72d611920846a877959a81168843b15efcd"/>
       <w:bookmarkEnd w:id="72"/>
@@ -4145,7 +4145,7 @@
     </w:p>
     <w:p>
       <w:pPr>
-        <w:pStyle w:val="Zkladntext"/>
+        <w:pStyle w:val="BodyText"/>
       </w:pPr>
       <w:r>
         <w:t>✔️ a. No</w:t>
@@ -4153,7 +4153,7 @@
     </w:p>
     <w:p>
       <w:pPr>
-        <w:pStyle w:val="Nadpis4"/>
+        <w:pStyle w:val="Heading4"/>
       </w:pPr>
       <w:bookmarkStart w:id="75" w:name="X4701496f217130535552de29aa7c81872e5d585"/>
       <w:bookmarkEnd w:id="74"/>
@@ -4198,7 +4198,7 @@
     </w:p>
     <w:p>
       <w:pPr>
-        <w:pStyle w:val="Zkladntext"/>
+        <w:pStyle w:val="BodyText"/>
       </w:pPr>
       <w:r>
         <w:t>✔️ b. Yes</w:t>
@@ -4206,7 +4206,7 @@
     </w:p>
     <w:p>
       <w:pPr>
-        <w:pStyle w:val="Nadpis4"/>
+        <w:pStyle w:val="Heading4"/>
       </w:pPr>
       <w:bookmarkStart w:id="76" w:name="X2360bf7211ef6fdad5fe8bee438cf2a973f3145"/>
       <w:bookmarkEnd w:id="75"/>
@@ -4225,7 +4225,7 @@
     </w:p>
     <w:p>
       <w:pPr>
-        <w:pStyle w:val="Zkladntext"/>
+        <w:pStyle w:val="BodyText"/>
       </w:pPr>
       <w:r>
         <w:t>✔️ a. No</w:t>
@@ -4233,7 +4233,7 @@
     </w:p>
     <w:p>
       <w:pPr>
-        <w:pStyle w:val="Nadpis4"/>
+        <w:pStyle w:val="Heading4"/>
       </w:pPr>
       <w:bookmarkStart w:id="77" w:name="Xd95f2f757fc6f3b73a64e4471d492b4d57cc9e7"/>
       <w:bookmarkEnd w:id="76"/>
@@ -4251,7 +4251,7 @@
     </w:p>
     <w:p>
       <w:pPr>
-        <w:pStyle w:val="Nadpis4"/>
+        <w:pStyle w:val="Heading4"/>
       </w:pPr>
       <w:bookmarkStart w:id="78" w:name="Xf4c13a356b7ba918b73c9a4e296daeb564f6e2c"/>
       <w:bookmarkEnd w:id="77"/>
@@ -4269,7 +4269,7 @@
     </w:p>
     <w:p>
       <w:pPr>
-        <w:pStyle w:val="Zkladntext"/>
+        <w:pStyle w:val="BodyText"/>
       </w:pPr>
       <w:r>
         <w:t xml:space="preserve">❗ </w:t>
@@ -4284,7 +4284,7 @@
     </w:p>
     <w:p>
       <w:pPr>
-        <w:pStyle w:val="Nadpis4"/>
+        <w:pStyle w:val="Heading4"/>
       </w:pPr>
       <w:bookmarkStart w:id="79" w:name="will-reference-data-be-created"/>
       <w:bookmarkEnd w:id="78"/>
@@ -4309,10 +4309,10 @@
       <w:r>
         <w:t xml:space="preserve"> </w:t>
       </w:r>
-      <w:hyperlink r:id="rId23">
+      <w:hyperlink r:id="rId24">
         <w:r>
           <w:rPr>
-            <w:rStyle w:val="Hypertextovodkaz"/>
+            <w:rStyle w:val="Hyperlink"/>
             <w:i/>
             <w:iCs/>
           </w:rPr>
@@ -4322,7 +4322,7 @@
     </w:p>
     <w:p>
       <w:pPr>
-        <w:pStyle w:val="Zkladntext"/>
+        <w:pStyle w:val="BodyText"/>
       </w:pPr>
       <w:r>
         <w:t>Will any of the data that you will be creating form a reference data set for future research (by others)?</w:t>
@@ -4330,7 +4330,7 @@
     </w:p>
     <w:p>
       <w:pPr>
-        <w:pStyle w:val="Zkladntext"/>
+        <w:pStyle w:val="BodyText"/>
       </w:pPr>
       <w:r>
         <w:t>Much of todays data is used in comparison with reference data. You may be comparing your own data with a "standard set" which is maintained as a collection by someone else. Or you could be determining differences to a standard (for example in bioinformatics, a genome is often compared with a reference genome to identify genomic variants). Will you be creating any data that will be reference data for other researchers?</w:t>
@@ -4338,7 +4338,7 @@
     </w:p>
     <w:p>
       <w:pPr>
-        <w:pStyle w:val="Zkladntext"/>
+        <w:pStyle w:val="BodyText"/>
       </w:pPr>
       <w:r>
         <w:t>✔️ a. No</w:t>
@@ -4353,7 +4353,7 @@
     </w:p>
     <w:p>
       <w:pPr>
-        <w:pStyle w:val="Nadpis1"/>
+        <w:pStyle w:val="Heading1"/>
       </w:pPr>
       <w:bookmarkStart w:id="80" w:name="vii.-giving-access-to-data"/>
       <w:r>
@@ -4371,7 +4371,7 @@
     </w:p>
     <w:p>
       <w:pPr>
-        <w:pStyle w:val="Nadpis3"/>
+        <w:pStyle w:val="Heading3"/>
       </w:pPr>
       <w:bookmarkStart w:id="81" w:name="summary-7"/>
       <w:r>
@@ -4380,7 +4380,7 @@
     </w:p>
     <w:p>
       <w:pPr>
-        <w:pStyle w:val="Nadpis4"/>
+        <w:pStyle w:val="Heading4"/>
       </w:pPr>
       <w:bookmarkStart w:id="82" w:name="answered-indication-7"/>
       <w:r>
@@ -4483,7 +4483,7 @@
     </w:tbl>
     <w:p>
       <w:pPr>
-        <w:pStyle w:val="Nadpis4"/>
+        <w:pStyle w:val="Heading4"/>
       </w:pPr>
       <w:bookmarkStart w:id="83" w:name="metrics-5"/>
       <w:bookmarkEnd w:id="82"/>
@@ -4564,7 +4564,7 @@
     </w:tbl>
     <w:p>
       <w:pPr>
-        <w:pStyle w:val="Nadpis4"/>
+        <w:pStyle w:val="Heading4"/>
       </w:pPr>
       <w:bookmarkStart w:id="84" w:name="X0898c3f205f0b8755bf9b31fd9f0c45ed6fbeb5"/>
       <w:bookmarkEnd w:id="81"/>
@@ -4610,7 +4610,7 @@
     </w:p>
     <w:p>
       <w:pPr>
-        <w:pStyle w:val="Zkladntext"/>
+        <w:pStyle w:val="BodyText"/>
       </w:pPr>
       <w:r>
         <w:t xml:space="preserve">📖 </w:t>
@@ -4625,10 +4625,10 @@
       <w:r>
         <w:t xml:space="preserve"> </w:t>
       </w:r>
-      <w:hyperlink r:id="rId24">
+      <w:hyperlink r:id="rId25">
         <w:r>
           <w:rPr>
-            <w:rStyle w:val="Hypertextovodkaz"/>
+            <w:rStyle w:val="Hyperlink"/>
             <w:i/>
             <w:iCs/>
           </w:rPr>
@@ -4638,7 +4638,7 @@
     </w:p>
     <w:p>
       <w:pPr>
-        <w:pStyle w:val="Zkladntext"/>
+        <w:pStyle w:val="BodyText"/>
       </w:pPr>
       <w:r>
         <w:t>The FAIR principles do not contain any direction towards "Openness". This is done on purpose, because there can be compelling reasons not to make data "Open", such as privacy, other sensitive data, or intellectual property protection.</w:t>
@@ -4646,7 +4646,7 @@
     </w:p>
     <w:p>
       <w:pPr>
-        <w:pStyle w:val="Zkladntext"/>
+        <w:pStyle w:val="BodyText"/>
       </w:pPr>
       <w:r>
         <w:t>The true goal of funding agencies is to create the maximum value for society from their investments. They therefore often add "As open as possible, as closed as necessary" to the requirements for funding.</w:t>
@@ -4654,7 +4654,7 @@
     </w:p>
     <w:p>
       <w:pPr>
-        <w:pStyle w:val="Zkladntext"/>
+        <w:pStyle w:val="BodyText"/>
       </w:pPr>
       <w:r>
         <w:t>✔️ b. Yes</w:t>
@@ -4662,7 +4662,7 @@
     </w:p>
     <w:p>
       <w:pPr>
-        <w:pStyle w:val="Nadpis4"/>
+        <w:pStyle w:val="Heading4"/>
       </w:pPr>
       <w:bookmarkStart w:id="85" w:name="Xe3dc6f452954fd10e8d7dc65de7a97ec3b06b2e"/>
       <w:bookmarkEnd w:id="84"/>
@@ -4717,7 +4717,7 @@
     </w:p>
     <w:p>
       <w:pPr>
-        <w:pStyle w:val="Zkladntext"/>
+        <w:pStyle w:val="BodyText"/>
       </w:pPr>
       <w:r>
         <w:t>Some data may be subject to a temporary embargo, or need to stay closed for specific reasons.</w:t>
@@ -4725,7 +4725,7 @@
     </w:p>
     <w:p>
       <w:pPr>
-        <w:pStyle w:val="Zkladntext"/>
+        <w:pStyle w:val="BodyText"/>
       </w:pPr>
       <w:r>
         <w:t>✔️ a. No</w:t>
@@ -4733,7 +4733,7 @@
     </w:p>
     <w:p>
       <w:pPr>
-        <w:pStyle w:val="Nadpis4"/>
+        <w:pStyle w:val="Heading4"/>
       </w:pPr>
       <w:bookmarkStart w:id="86" w:name="Xa55680014ecfff203c2f6ebca22c8ff6e59aefd"/>
       <w:r>
@@ -4787,7 +4787,7 @@
     </w:p>
     <w:p>
       <w:pPr>
-        <w:pStyle w:val="Zkladntext"/>
+        <w:pStyle w:val="BodyText"/>
       </w:pPr>
       <w:r>
         <w:t>✔️ a. No</w:t>
@@ -4795,7 +4795,7 @@
     </w:p>
     <w:p>
       <w:pPr>
-        <w:pStyle w:val="Nadpis4"/>
+        <w:pStyle w:val="Heading4"/>
       </w:pPr>
       <w:bookmarkStart w:id="87" w:name="X42e64d87183da129b03597976b25985de831c6d"/>
       <w:bookmarkEnd w:id="86"/>
@@ -4840,7 +4840,7 @@
     </w:p>
     <w:p>
       <w:pPr>
-        <w:pStyle w:val="Zkladntext"/>
+        <w:pStyle w:val="BodyText"/>
       </w:pPr>
       <w:r>
         <w:lastRenderedPageBreak/>
@@ -4849,7 +4849,7 @@
     </w:p>
     <w:p>
       <w:pPr>
-        <w:pStyle w:val="Nadpis4"/>
+        <w:pStyle w:val="Heading4"/>
       </w:pPr>
       <w:bookmarkStart w:id="88" w:name="Xf0065e710a32a50741693c88aa01f7e1f79c936"/>
       <w:bookmarkEnd w:id="87"/>
@@ -4894,7 +4894,7 @@
     </w:p>
     <w:p>
       <w:pPr>
-        <w:pStyle w:val="Zkladntext"/>
+        <w:pStyle w:val="BodyText"/>
       </w:pPr>
       <w:r>
         <w:t>✔️ b. Yes, papers need to be submitted first</w:t>
@@ -4902,7 +4902,7 @@
     </w:p>
     <w:p>
       <w:pPr>
-        <w:pStyle w:val="Nadpis4"/>
+        <w:pStyle w:val="Heading4"/>
       </w:pPr>
       <w:bookmarkStart w:id="89" w:name="a.4.-will-you-use-a-limited-embargo"/>
       <w:bookmarkEnd w:id="88"/>
@@ -4947,7 +4947,7 @@
     </w:p>
     <w:p>
       <w:pPr>
-        <w:pStyle w:val="Zkladntext"/>
+        <w:pStyle w:val="BodyText"/>
       </w:pPr>
       <w:r>
         <w:t>✔️ c. Yes, data that is not legally restrained will be released after a fixed time period, unconditionally</w:t>
@@ -4955,7 +4955,7 @@
     </w:p>
     <w:p>
       <w:pPr>
-        <w:pStyle w:val="Nadpis4"/>
+        <w:pStyle w:val="Heading4"/>
       </w:pPr>
       <w:bookmarkStart w:id="90" w:name="X212ec0308097c507b5df9e33ff6be621f3a23d6"/>
       <w:r>
@@ -4999,7 +4999,7 @@
     </w:p>
     <w:p>
       <w:pPr>
-        <w:pStyle w:val="Zkladntext"/>
+        <w:pStyle w:val="BodyText"/>
       </w:pPr>
       <w:r>
         <w:t>After what period will restrictions on the reuse of data (except ethical and legal restrictions) fall away?</w:t>
@@ -5007,7 +5007,7 @@
     </w:p>
     <w:p>
       <w:pPr>
-        <w:pStyle w:val="Zkladntext"/>
+        <w:pStyle w:val="BodyText"/>
       </w:pPr>
       <w:r>
         <w:t>✔️ 10 days</w:t>
@@ -5018,9 +5018,8 @@
       <w:bookmarkEnd w:id="90"/>
     </w:p>
     <w:sectPr>
-      <w:headerReference w:type="default" r:id="rId25"/>
-      <w:footerReference w:type="default" r:id="rId26"/>
-      <w:headerReference w:type="first" r:id="rId27"/>
+      <w:headerReference w:type="default" r:id="rId26"/>
+      <w:footerReference w:type="default" r:id="rId27"/>
       <w:pgSz w:w="12240" w:h="15840"/>
       <w:pgMar w:top="1608" w:right="1417" w:bottom="1417" w:left="1417" w:header="708" w:footer="708" w:gutter="0"/>
       <w:cols w:space="708"/>
@@ -5032,7 +5031,7 @@
 </file>
 
 <file path=word/endnotes.xml><?xml version="1.0" encoding="utf-8"?>
-<w:endnotes xmlns:wpc="http://schemas.microsoft.com/office/word/2010/wordprocessingCanvas" xmlns:cx="http://schemas.microsoft.com/office/drawing/2014/chartex" xmlns:cx1="http://schemas.microsoft.com/office/drawing/2015/9/8/chartex" xmlns:cx2="http://schemas.microsoft.com/office/drawing/2015/10/21/chartex" xmlns:cx3="http://schemas.microsoft.com/office/drawing/2016/5/9/chartex" xmlns:cx4="http://schemas.microsoft.com/office/drawing/2016/5/10/chartex" xmlns:cx5="http://schemas.microsoft.com/office/drawing/2016/5/11/chartex" xmlns:cx6="http://schemas.microsoft.com/office/drawing/2016/5/12/chartex" xmlns:cx7="http://schemas.microsoft.com/office/drawing/2016/5/13/chartex" xmlns:cx8="http://schemas.microsoft.com/office/drawing/2016/5/14/chartex" xmlns:mc="http://schemas.openxmlformats.org/markup-compatibility/2006" xmlns:aink="http://schemas.microsoft.com/office/drawing/2016/ink" xmlns:am3d="http://schemas.microsoft.com/office/drawing/2017/model3d" xmlns:o="urn:schemas-microsoft-com:office:office" xmlns:r="http://schemas.openxmlformats.org/officeDocument/2006/relationships" xmlns:m="http://schemas.openxmlformats.org/officeDocument/2006/math" xmlns:v="urn:schemas-microsoft-com:vml" xmlns:wp14="http://schemas.microsoft.com/office/word/2010/wordprocessingDrawing" xmlns:wp="http://schemas.openxmlformats.org/drawingml/2006/wordprocessingDrawing" xmlns:w10="urn:schemas-microsoft-com:office:word" xmlns:w="http://schemas.openxmlformats.org/wordprocessingml/2006/main" xmlns:w14="http://schemas.microsoft.com/office/word/2010/wordml" xmlns:w15="http://schemas.microsoft.com/office/word/2012/wordml" xmlns:w16cex="http://schemas.microsoft.com/office/word/2018/wordml/cex" xmlns:w16cid="http://schemas.microsoft.com/office/word/2016/wordml/cid" xmlns:w16="http://schemas.microsoft.com/office/word/2018/wordml" xmlns:w16se="http://schemas.microsoft.com/office/word/2015/wordml/symex" xmlns:wpg="http://schemas.microsoft.com/office/word/2010/wordprocessingGroup" xmlns:wpi="http://schemas.microsoft.com/office/word/2010/wordprocessingInk" xmlns:wne="http://schemas.microsoft.com/office/word/2006/wordml" xmlns:wps="http://schemas.microsoft.com/office/word/2010/wordprocessingShape" mc:Ignorable="w14 w15 w16se w16cid w16 w16cex wp14">
+<w:endnotes xmlns:wpc="http://schemas.microsoft.com/office/word/2010/wordprocessingCanvas" xmlns:cx="http://schemas.microsoft.com/office/drawing/2014/chartex" xmlns:cx1="http://schemas.microsoft.com/office/drawing/2015/9/8/chartex" xmlns:cx2="http://schemas.microsoft.com/office/drawing/2015/10/21/chartex" xmlns:cx3="http://schemas.microsoft.com/office/drawing/2016/5/9/chartex" xmlns:cx4="http://schemas.microsoft.com/office/drawing/2016/5/10/chartex" xmlns:cx5="http://schemas.microsoft.com/office/drawing/2016/5/11/chartex" xmlns:cx6="http://schemas.microsoft.com/office/drawing/2016/5/12/chartex" xmlns:cx7="http://schemas.microsoft.com/office/drawing/2016/5/13/chartex" xmlns:cx8="http://schemas.microsoft.com/office/drawing/2016/5/14/chartex" xmlns:mc="http://schemas.openxmlformats.org/markup-compatibility/2006" xmlns:aink="http://schemas.microsoft.com/office/drawing/2016/ink" xmlns:am3d="http://schemas.microsoft.com/office/drawing/2017/model3d" xmlns:o="urn:schemas-microsoft-com:office:office" xmlns:oel="http://schemas.microsoft.com/office/2019/extlst" xmlns:r="http://schemas.openxmlformats.org/officeDocument/2006/relationships" xmlns:m="http://schemas.openxmlformats.org/officeDocument/2006/math" xmlns:v="urn:schemas-microsoft-com:vml" xmlns:wp14="http://schemas.microsoft.com/office/word/2010/wordprocessingDrawing" xmlns:wp="http://schemas.openxmlformats.org/drawingml/2006/wordprocessingDrawing" xmlns:w10="urn:schemas-microsoft-com:office:word" xmlns:w="http://schemas.openxmlformats.org/wordprocessingml/2006/main" xmlns:w14="http://schemas.microsoft.com/office/word/2010/wordml" xmlns:w15="http://schemas.microsoft.com/office/word/2012/wordml" xmlns:w16cex="http://schemas.microsoft.com/office/word/2018/wordml/cex" xmlns:w16cid="http://schemas.microsoft.com/office/word/2016/wordml/cid" xmlns:w16="http://schemas.microsoft.com/office/word/2018/wordml" xmlns:w16du="http://schemas.microsoft.com/office/word/2023/wordml/word16du" xmlns:w16sdtdh="http://schemas.microsoft.com/office/word/2020/wordml/sdtdatahash" xmlns:w16sdtfl="http://schemas.microsoft.com/office/word/2024/wordml/sdtformatlock" xmlns:w16se="http://schemas.microsoft.com/office/word/2015/wordml/symex" xmlns:wpg="http://schemas.microsoft.com/office/word/2010/wordprocessingGroup" xmlns:wpi="http://schemas.microsoft.com/office/word/2010/wordprocessingInk" xmlns:wne="http://schemas.microsoft.com/office/word/2006/wordml" xmlns:wps="http://schemas.microsoft.com/office/word/2010/wordprocessingShape" mc:Ignorable="w14 w15 w16se w16cid w16 w16cex w16sdtdh w16sdtfl w16du wp14">
   <w:endnote w:type="separator" w:id="-1">
     <w:p>
       <w:pPr>
@@ -5057,10 +5056,10 @@
 </file>
 
 <file path=word/footer1.xml><?xml version="1.0" encoding="utf-8"?>
-<w:ftr xmlns:wpc="http://schemas.microsoft.com/office/word/2010/wordprocessingCanvas" xmlns:cx="http://schemas.microsoft.com/office/drawing/2014/chartex" xmlns:cx1="http://schemas.microsoft.com/office/drawing/2015/9/8/chartex" xmlns:cx2="http://schemas.microsoft.com/office/drawing/2015/10/21/chartex" xmlns:cx3="http://schemas.microsoft.com/office/drawing/2016/5/9/chartex" xmlns:cx4="http://schemas.microsoft.com/office/drawing/2016/5/10/chartex" xmlns:cx5="http://schemas.microsoft.com/office/drawing/2016/5/11/chartex" xmlns:cx6="http://schemas.microsoft.com/office/drawing/2016/5/12/chartex" xmlns:cx7="http://schemas.microsoft.com/office/drawing/2016/5/13/chartex" xmlns:cx8="http://schemas.microsoft.com/office/drawing/2016/5/14/chartex" xmlns:mc="http://schemas.openxmlformats.org/markup-compatibility/2006" xmlns:aink="http://schemas.microsoft.com/office/drawing/2016/ink" xmlns:am3d="http://schemas.microsoft.com/office/drawing/2017/model3d" xmlns:o="urn:schemas-microsoft-com:office:office" xmlns:r="http://schemas.openxmlformats.org/officeDocument/2006/relationships" xmlns:m="http://schemas.openxmlformats.org/officeDocument/2006/math" xmlns:v="urn:schemas-microsoft-com:vml" xmlns:wp14="http://schemas.microsoft.com/office/word/2010/wordprocessingDrawing" xmlns:wp="http://schemas.openxmlformats.org/drawingml/2006/wordprocessingDrawing" xmlns:w10="urn:schemas-microsoft-com:office:word" xmlns:w="http://schemas.openxmlformats.org/wordprocessingml/2006/main" xmlns:w14="http://schemas.microsoft.com/office/word/2010/wordml" xmlns:w15="http://schemas.microsoft.com/office/word/2012/wordml" xmlns:w16cex="http://schemas.microsoft.com/office/word/2018/wordml/cex" xmlns:w16cid="http://schemas.microsoft.com/office/word/2016/wordml/cid" xmlns:w16="http://schemas.microsoft.com/office/word/2018/wordml" xmlns:w16se="http://schemas.microsoft.com/office/word/2015/wordml/symex" xmlns:wpg="http://schemas.microsoft.com/office/word/2010/wordprocessingGroup" xmlns:wpi="http://schemas.microsoft.com/office/word/2010/wordprocessingInk" xmlns:wne="http://schemas.microsoft.com/office/word/2006/wordml" xmlns:wps="http://schemas.microsoft.com/office/word/2010/wordprocessingShape" mc:Ignorable="w14 w15 w16se w16cid w16 w16cex wp14">
+<w:ftr xmlns:wpc="http://schemas.microsoft.com/office/word/2010/wordprocessingCanvas" xmlns:cx="http://schemas.microsoft.com/office/drawing/2014/chartex" xmlns:cx1="http://schemas.microsoft.com/office/drawing/2015/9/8/chartex" xmlns:cx2="http://schemas.microsoft.com/office/drawing/2015/10/21/chartex" xmlns:cx3="http://schemas.microsoft.com/office/drawing/2016/5/9/chartex" xmlns:cx4="http://schemas.microsoft.com/office/drawing/2016/5/10/chartex" xmlns:cx5="http://schemas.microsoft.com/office/drawing/2016/5/11/chartex" xmlns:cx6="http://schemas.microsoft.com/office/drawing/2016/5/12/chartex" xmlns:cx7="http://schemas.microsoft.com/office/drawing/2016/5/13/chartex" xmlns:cx8="http://schemas.microsoft.com/office/drawing/2016/5/14/chartex" xmlns:mc="http://schemas.openxmlformats.org/markup-compatibility/2006" xmlns:aink="http://schemas.microsoft.com/office/drawing/2016/ink" xmlns:am3d="http://schemas.microsoft.com/office/drawing/2017/model3d" xmlns:o="urn:schemas-microsoft-com:office:office" xmlns:oel="http://schemas.microsoft.com/office/2019/extlst" xmlns:r="http://schemas.openxmlformats.org/officeDocument/2006/relationships" xmlns:m="http://schemas.openxmlformats.org/officeDocument/2006/math" xmlns:v="urn:schemas-microsoft-com:vml" xmlns:wp14="http://schemas.microsoft.com/office/word/2010/wordprocessingDrawing" xmlns:wp="http://schemas.openxmlformats.org/drawingml/2006/wordprocessingDrawing" xmlns:w10="urn:schemas-microsoft-com:office:word" xmlns:w="http://schemas.openxmlformats.org/wordprocessingml/2006/main" xmlns:w14="http://schemas.microsoft.com/office/word/2010/wordml" xmlns:w15="http://schemas.microsoft.com/office/word/2012/wordml" xmlns:w16cex="http://schemas.microsoft.com/office/word/2018/wordml/cex" xmlns:w16cid="http://schemas.microsoft.com/office/word/2016/wordml/cid" xmlns:w16="http://schemas.microsoft.com/office/word/2018/wordml" xmlns:w16du="http://schemas.microsoft.com/office/word/2023/wordml/word16du" xmlns:w16sdtdh="http://schemas.microsoft.com/office/word/2020/wordml/sdtdatahash" xmlns:w16sdtfl="http://schemas.microsoft.com/office/word/2024/wordml/sdtformatlock" xmlns:w16se="http://schemas.microsoft.com/office/word/2015/wordml/symex" xmlns:wpg="http://schemas.microsoft.com/office/word/2010/wordprocessingGroup" xmlns:wpi="http://schemas.microsoft.com/office/word/2010/wordprocessingInk" xmlns:wne="http://schemas.microsoft.com/office/word/2006/wordml" xmlns:wps="http://schemas.microsoft.com/office/word/2010/wordprocessingShape" mc:Ignorable="w14 w15 w16se w16cid w16 w16cex w16sdtdh w16sdtfl w16du wp14">
   <w:p>
     <w:pPr>
-      <w:pStyle w:val="Zpat"/>
+      <w:pStyle w:val="Footer"/>
       <w:pBdr>
         <w:top w:val="single" w:sz="18" w:space="5" w:color="E36C0A" w:themeColor="accent6" w:themeShade="BF"/>
       </w:pBdr>
@@ -5089,33 +5088,20 @@
     <w:r>
       <w:t xml:space="preserve"> / </w:t>
     </w:r>
-    <w:r>
-      <w:fldChar w:fldCharType="begin"/>
-    </w:r>
-    <w:r>
-      <w:instrText xml:space="preserve"> NUMPAGES   \* MERGEFORMAT </w:instrText>
-    </w:r>
-    <w:r>
-      <w:fldChar w:fldCharType="separate"/>
-    </w:r>
-    <w:r>
-      <w:rPr>
-        <w:noProof/>
-      </w:rPr>
-      <w:t>16</w:t>
-    </w:r>
-    <w:r>
-      <w:rPr>
-        <w:noProof/>
-      </w:rPr>
-      <w:fldChar w:fldCharType="end"/>
-    </w:r>
+    <w:fldSimple w:instr=" NUMPAGES   \* MERGEFORMAT ">
+      <w:r>
+        <w:rPr>
+          <w:noProof/>
+        </w:rPr>
+        <w:t>16</w:t>
+      </w:r>
+    </w:fldSimple>
   </w:p>
 </w:ftr>
 </file>
 
 <file path=word/footnotes.xml><?xml version="1.0" encoding="utf-8"?>
-<w:footnotes xmlns:wpc="http://schemas.microsoft.com/office/word/2010/wordprocessingCanvas" xmlns:cx="http://schemas.microsoft.com/office/drawing/2014/chartex" xmlns:cx1="http://schemas.microsoft.com/office/drawing/2015/9/8/chartex" xmlns:cx2="http://schemas.microsoft.com/office/drawing/2015/10/21/chartex" xmlns:cx3="http://schemas.microsoft.com/office/drawing/2016/5/9/chartex" xmlns:cx4="http://schemas.microsoft.com/office/drawing/2016/5/10/chartex" xmlns:cx5="http://schemas.microsoft.com/office/drawing/2016/5/11/chartex" xmlns:cx6="http://schemas.microsoft.com/office/drawing/2016/5/12/chartex" xmlns:cx7="http://schemas.microsoft.com/office/drawing/2016/5/13/chartex" xmlns:cx8="http://schemas.microsoft.com/office/drawing/2016/5/14/chartex" xmlns:mc="http://schemas.openxmlformats.org/markup-compatibility/2006" xmlns:aink="http://schemas.microsoft.com/office/drawing/2016/ink" xmlns:am3d="http://schemas.microsoft.com/office/drawing/2017/model3d" xmlns:o="urn:schemas-microsoft-com:office:office" xmlns:r="http://schemas.openxmlformats.org/officeDocument/2006/relationships" xmlns:m="http://schemas.openxmlformats.org/officeDocument/2006/math" xmlns:v="urn:schemas-microsoft-com:vml" xmlns:wp14="http://schemas.microsoft.com/office/word/2010/wordprocessingDrawing" xmlns:wp="http://schemas.openxmlformats.org/drawingml/2006/wordprocessingDrawing" xmlns:w10="urn:schemas-microsoft-com:office:word" xmlns:w="http://schemas.openxmlformats.org/wordprocessingml/2006/main" xmlns:w14="http://schemas.microsoft.com/office/word/2010/wordml" xmlns:w15="http://schemas.microsoft.com/office/word/2012/wordml" xmlns:w16cex="http://schemas.microsoft.com/office/word/2018/wordml/cex" xmlns:w16cid="http://schemas.microsoft.com/office/word/2016/wordml/cid" xmlns:w16="http://schemas.microsoft.com/office/word/2018/wordml" xmlns:w16se="http://schemas.microsoft.com/office/word/2015/wordml/symex" xmlns:wpg="http://schemas.microsoft.com/office/word/2010/wordprocessingGroup" xmlns:wpi="http://schemas.microsoft.com/office/word/2010/wordprocessingInk" xmlns:wne="http://schemas.microsoft.com/office/word/2006/wordml" xmlns:wps="http://schemas.microsoft.com/office/word/2010/wordprocessingShape" mc:Ignorable="w14 w15 w16se w16cid w16 w16cex wp14">
+<w:footnotes xmlns:wpc="http://schemas.microsoft.com/office/word/2010/wordprocessingCanvas" xmlns:cx="http://schemas.microsoft.com/office/drawing/2014/chartex" xmlns:cx1="http://schemas.microsoft.com/office/drawing/2015/9/8/chartex" xmlns:cx2="http://schemas.microsoft.com/office/drawing/2015/10/21/chartex" xmlns:cx3="http://schemas.microsoft.com/office/drawing/2016/5/9/chartex" xmlns:cx4="http://schemas.microsoft.com/office/drawing/2016/5/10/chartex" xmlns:cx5="http://schemas.microsoft.com/office/drawing/2016/5/11/chartex" xmlns:cx6="http://schemas.microsoft.com/office/drawing/2016/5/12/chartex" xmlns:cx7="http://schemas.microsoft.com/office/drawing/2016/5/13/chartex" xmlns:cx8="http://schemas.microsoft.com/office/drawing/2016/5/14/chartex" xmlns:mc="http://schemas.openxmlformats.org/markup-compatibility/2006" xmlns:aink="http://schemas.microsoft.com/office/drawing/2016/ink" xmlns:am3d="http://schemas.microsoft.com/office/drawing/2017/model3d" xmlns:o="urn:schemas-microsoft-com:office:office" xmlns:oel="http://schemas.microsoft.com/office/2019/extlst" xmlns:r="http://schemas.openxmlformats.org/officeDocument/2006/relationships" xmlns:m="http://schemas.openxmlformats.org/officeDocument/2006/math" xmlns:v="urn:schemas-microsoft-com:vml" xmlns:wp14="http://schemas.microsoft.com/office/word/2010/wordprocessingDrawing" xmlns:wp="http://schemas.openxmlformats.org/drawingml/2006/wordprocessingDrawing" xmlns:w10="urn:schemas-microsoft-com:office:word" xmlns:w="http://schemas.openxmlformats.org/wordprocessingml/2006/main" xmlns:w14="http://schemas.microsoft.com/office/word/2010/wordml" xmlns:w15="http://schemas.microsoft.com/office/word/2012/wordml" xmlns:w16cex="http://schemas.microsoft.com/office/word/2018/wordml/cex" xmlns:w16cid="http://schemas.microsoft.com/office/word/2016/wordml/cid" xmlns:w16="http://schemas.microsoft.com/office/word/2018/wordml" xmlns:w16du="http://schemas.microsoft.com/office/word/2023/wordml/word16du" xmlns:w16sdtdh="http://schemas.microsoft.com/office/word/2020/wordml/sdtdatahash" xmlns:w16sdtfl="http://schemas.microsoft.com/office/word/2024/wordml/sdtformatlock" xmlns:w16se="http://schemas.microsoft.com/office/word/2015/wordml/symex" xmlns:wpg="http://schemas.microsoft.com/office/word/2010/wordprocessingGroup" xmlns:wpi="http://schemas.microsoft.com/office/word/2010/wordprocessingInk" xmlns:wne="http://schemas.microsoft.com/office/word/2006/wordml" xmlns:wps="http://schemas.microsoft.com/office/word/2010/wordprocessingShape" mc:Ignorable="w14 w15 w16se w16cid w16 w16cex w16sdtdh w16sdtfl w16du wp14">
   <w:footnote w:type="separator" w:id="-1">
     <w:p>
       <w:r>
@@ -5134,84 +5120,14 @@
 </file>
 
 <file path=word/header1.xml><?xml version="1.0" encoding="utf-8"?>
-<w:hdr xmlns:wpc="http://schemas.microsoft.com/office/word/2010/wordprocessingCanvas" xmlns:cx="http://schemas.microsoft.com/office/drawing/2014/chartex" xmlns:cx1="http://schemas.microsoft.com/office/drawing/2015/9/8/chartex" xmlns:cx2="http://schemas.microsoft.com/office/drawing/2015/10/21/chartex" xmlns:cx3="http://schemas.microsoft.com/office/drawing/2016/5/9/chartex" xmlns:cx4="http://schemas.microsoft.com/office/drawing/2016/5/10/chartex" xmlns:cx5="http://schemas.microsoft.com/office/drawing/2016/5/11/chartex" xmlns:cx6="http://schemas.microsoft.com/office/drawing/2016/5/12/chartex" xmlns:cx7="http://schemas.microsoft.com/office/drawing/2016/5/13/chartex" xmlns:cx8="http://schemas.microsoft.com/office/drawing/2016/5/14/chartex" xmlns:mc="http://schemas.openxmlformats.org/markup-compatibility/2006" xmlns:aink="http://schemas.microsoft.com/office/drawing/2016/ink" xmlns:am3d="http://schemas.microsoft.com/office/drawing/2017/model3d" xmlns:o="urn:schemas-microsoft-com:office:office" xmlns:r="http://schemas.openxmlformats.org/officeDocument/2006/relationships" xmlns:m="http://schemas.openxmlformats.org/officeDocument/2006/math" xmlns:v="urn:schemas-microsoft-com:vml" xmlns:wp14="http://schemas.microsoft.com/office/word/2010/wordprocessingDrawing" xmlns:wp="http://schemas.openxmlformats.org/drawingml/2006/wordprocessingDrawing" xmlns:w10="urn:schemas-microsoft-com:office:word" xmlns:w="http://schemas.openxmlformats.org/wordprocessingml/2006/main" xmlns:w14="http://schemas.microsoft.com/office/word/2010/wordml" xmlns:w15="http://schemas.microsoft.com/office/word/2012/wordml" xmlns:w16cex="http://schemas.microsoft.com/office/word/2018/wordml/cex" xmlns:w16cid="http://schemas.microsoft.com/office/word/2016/wordml/cid" xmlns:w16="http://schemas.microsoft.com/office/word/2018/wordml" xmlns:w16se="http://schemas.microsoft.com/office/word/2015/wordml/symex" xmlns:wpg="http://schemas.microsoft.com/office/word/2010/wordprocessingGroup" xmlns:wpi="http://schemas.microsoft.com/office/word/2010/wordprocessingInk" xmlns:wne="http://schemas.microsoft.com/office/word/2006/wordml" xmlns:wps="http://schemas.microsoft.com/office/word/2010/wordprocessingShape" mc:Ignorable="w14 w15 w16se w16cid w16 w16cex wp14">
+<w:hdr xmlns:wpc="http://schemas.microsoft.com/office/word/2010/wordprocessingCanvas" xmlns:cx="http://schemas.microsoft.com/office/drawing/2014/chartex" xmlns:cx1="http://schemas.microsoft.com/office/drawing/2015/9/8/chartex" xmlns:cx2="http://schemas.microsoft.com/office/drawing/2015/10/21/chartex" xmlns:cx3="http://schemas.microsoft.com/office/drawing/2016/5/9/chartex" xmlns:cx4="http://schemas.microsoft.com/office/drawing/2016/5/10/chartex" xmlns:cx5="http://schemas.microsoft.com/office/drawing/2016/5/11/chartex" xmlns:cx6="http://schemas.microsoft.com/office/drawing/2016/5/12/chartex" xmlns:cx7="http://schemas.microsoft.com/office/drawing/2016/5/13/chartex" xmlns:cx8="http://schemas.microsoft.com/office/drawing/2016/5/14/chartex" xmlns:mc="http://schemas.openxmlformats.org/markup-compatibility/2006" xmlns:aink="http://schemas.microsoft.com/office/drawing/2016/ink" xmlns:am3d="http://schemas.microsoft.com/office/drawing/2017/model3d" xmlns:o="urn:schemas-microsoft-com:office:office" xmlns:oel="http://schemas.microsoft.com/office/2019/extlst" xmlns:r="http://schemas.openxmlformats.org/officeDocument/2006/relationships" xmlns:m="http://schemas.openxmlformats.org/officeDocument/2006/math" xmlns:v="urn:schemas-microsoft-com:vml" xmlns:wp14="http://schemas.microsoft.com/office/word/2010/wordprocessingDrawing" xmlns:wp="http://schemas.openxmlformats.org/drawingml/2006/wordprocessingDrawing" xmlns:w10="urn:schemas-microsoft-com:office:word" xmlns:w="http://schemas.openxmlformats.org/wordprocessingml/2006/main" xmlns:w14="http://schemas.microsoft.com/office/word/2010/wordml" xmlns:w15="http://schemas.microsoft.com/office/word/2012/wordml" xmlns:w16cex="http://schemas.microsoft.com/office/word/2018/wordml/cex" xmlns:w16cid="http://schemas.microsoft.com/office/word/2016/wordml/cid" xmlns:w16="http://schemas.microsoft.com/office/word/2018/wordml" xmlns:w16du="http://schemas.microsoft.com/office/word/2023/wordml/word16du" xmlns:w16sdtdh="http://schemas.microsoft.com/office/word/2020/wordml/sdtdatahash" xmlns:w16sdtfl="http://schemas.microsoft.com/office/word/2024/wordml/sdtformatlock" xmlns:w16se="http://schemas.microsoft.com/office/word/2015/wordml/symex" xmlns:wpg="http://schemas.microsoft.com/office/word/2010/wordprocessingGroup" xmlns:wpi="http://schemas.microsoft.com/office/word/2010/wordprocessingInk" xmlns:wne="http://schemas.microsoft.com/office/word/2006/wordml" xmlns:wps="http://schemas.microsoft.com/office/word/2010/wordprocessingShape" mc:Ignorable="w14 w15 w16se w16cid w16 w16cex w16sdtdh w16sdtfl w16du wp14">
   <w:p>
     <w:pPr>
-      <w:pStyle w:val="Zhlav"/>
+      <w:pStyle w:val="Header"/>
       <w:pBdr>
         <w:bottom w:val="single" w:sz="18" w:space="1" w:color="E36C0A" w:themeColor="accent6" w:themeShade="BF"/>
       </w:pBdr>
     </w:pPr>
-    <w:r>
-      <w:rPr>
-        <w:noProof/>
-      </w:rPr>
-      <w:drawing>
-        <wp:anchor distT="0" distB="0" distL="114300" distR="114300" simplePos="0" relativeHeight="251658240" behindDoc="1" locked="0" layoutInCell="1" allowOverlap="1" wp14:anchorId="75C5E114" wp14:editId="4C2C0D19">
-          <wp:simplePos x="0" y="0"/>
-          <wp:positionH relativeFrom="column">
-            <wp:posOffset>52705</wp:posOffset>
-          </wp:positionH>
-          <wp:positionV relativeFrom="paragraph">
-            <wp:posOffset>-175260</wp:posOffset>
-          </wp:positionV>
-          <wp:extent cx="1097280" cy="493395"/>
-          <wp:effectExtent l="0" t="0" r="0" b="0"/>
-          <wp:wrapTight wrapText="bothSides">
-            <wp:wrapPolygon edited="0">
-              <wp:start x="4125" y="4170"/>
-              <wp:lineTo x="1875" y="17514"/>
-              <wp:lineTo x="4125" y="17514"/>
-              <wp:lineTo x="19125" y="15012"/>
-              <wp:lineTo x="19500" y="5838"/>
-              <wp:lineTo x="6375" y="4170"/>
-              <wp:lineTo x="4125" y="4170"/>
-            </wp:wrapPolygon>
-          </wp:wrapTight>
-          <wp:docPr id="3" name="Obrázek 3"/>
-          <wp:cNvGraphicFramePr>
-            <a:graphicFrameLocks xmlns:a="http://schemas.openxmlformats.org/drawingml/2006/main" noChangeAspect="1"/>
-          </wp:cNvGraphicFramePr>
-          <a:graphic xmlns:a="http://schemas.openxmlformats.org/drawingml/2006/main">
-            <a:graphicData uri="http://schemas.openxmlformats.org/drawingml/2006/picture">
-              <pic:pic xmlns:pic="http://schemas.openxmlformats.org/drawingml/2006/picture">
-                <pic:nvPicPr>
-                  <pic:cNvPr id="1" name="Obrázek 1"/>
-                  <pic:cNvPicPr/>
-                </pic:nvPicPr>
-                <pic:blipFill>
-                  <a:blip r:embed="rId1">
-                    <a:extLst>
-                      <a:ext uri="{28A0092B-C50C-407E-A947-70E740481C1C}">
-                        <a14:useLocalDpi xmlns:a14="http://schemas.microsoft.com/office/drawing/2010/main" val="0"/>
-                      </a:ext>
-                    </a:extLst>
-                  </a:blip>
-                  <a:stretch>
-                    <a:fillRect/>
-                  </a:stretch>
-                </pic:blipFill>
-                <pic:spPr>
-                  <a:xfrm>
-                    <a:off x="0" y="0"/>
-                    <a:ext cx="1097280" cy="493395"/>
-                  </a:xfrm>
-                  <a:prstGeom prst="rect">
-                    <a:avLst/>
-                  </a:prstGeom>
-                </pic:spPr>
-              </pic:pic>
-            </a:graphicData>
-          </a:graphic>
-          <wp14:sizeRelH relativeFrom="page">
-            <wp14:pctWidth>0</wp14:pctWidth>
-          </wp14:sizeRelH>
-          <wp14:sizeRelV relativeFrom="page">
-            <wp14:pctHeight>0</wp14:pctHeight>
-          </wp14:sizeRelV>
-        </wp:anchor>
-      </w:drawing>
-    </w:r>
     <w:r>
       <w:tab/>
     </w:r>
@@ -5229,7 +5145,6 @@
         <w:dataBinding w:prefixMappings="xmlns:ns0='http://purl.org/dc/elements/1.1/' xmlns:ns1='http://schemas.openxmlformats.org/package/2006/metadata/core-properties' " w:xpath="/ns1:coreProperties[1]/ns0:title[1]" w:storeItemID="{6C3C8BC8-F283-45AE-878A-BAB7291924A1}"/>
         <w:text/>
       </w:sdtPr>
-      <w:sdtEndPr/>
       <w:sdtContent>
         <w:r>
           <w:t>Example experiment</w:t>
@@ -5243,95 +5158,8 @@
 </w:hdr>
 </file>
 
-<file path=word/header2.xml><?xml version="1.0" encoding="utf-8"?>
-<w:hdr xmlns:wpc="http://schemas.microsoft.com/office/word/2010/wordprocessingCanvas" xmlns:cx="http://schemas.microsoft.com/office/drawing/2014/chartex" xmlns:cx1="http://schemas.microsoft.com/office/drawing/2015/9/8/chartex" xmlns:cx2="http://schemas.microsoft.com/office/drawing/2015/10/21/chartex" xmlns:cx3="http://schemas.microsoft.com/office/drawing/2016/5/9/chartex" xmlns:cx4="http://schemas.microsoft.com/office/drawing/2016/5/10/chartex" xmlns:cx5="http://schemas.microsoft.com/office/drawing/2016/5/11/chartex" xmlns:cx6="http://schemas.microsoft.com/office/drawing/2016/5/12/chartex" xmlns:cx7="http://schemas.microsoft.com/office/drawing/2016/5/13/chartex" xmlns:cx8="http://schemas.microsoft.com/office/drawing/2016/5/14/chartex" xmlns:mc="http://schemas.openxmlformats.org/markup-compatibility/2006" xmlns:aink="http://schemas.microsoft.com/office/drawing/2016/ink" xmlns:am3d="http://schemas.microsoft.com/office/drawing/2017/model3d" xmlns:o="urn:schemas-microsoft-com:office:office" xmlns:r="http://schemas.openxmlformats.org/officeDocument/2006/relationships" xmlns:m="http://schemas.openxmlformats.org/officeDocument/2006/math" xmlns:v="urn:schemas-microsoft-com:vml" xmlns:wp14="http://schemas.microsoft.com/office/word/2010/wordprocessingDrawing" xmlns:wp="http://schemas.openxmlformats.org/drawingml/2006/wordprocessingDrawing" xmlns:w10="urn:schemas-microsoft-com:office:word" xmlns:w="http://schemas.openxmlformats.org/wordprocessingml/2006/main" xmlns:w14="http://schemas.microsoft.com/office/word/2010/wordml" xmlns:w15="http://schemas.microsoft.com/office/word/2012/wordml" xmlns:w16cex="http://schemas.microsoft.com/office/word/2018/wordml/cex" xmlns:w16cid="http://schemas.microsoft.com/office/word/2016/wordml/cid" xmlns:w16="http://schemas.microsoft.com/office/word/2018/wordml" xmlns:w16se="http://schemas.microsoft.com/office/word/2015/wordml/symex" xmlns:wpg="http://schemas.microsoft.com/office/word/2010/wordprocessingGroup" xmlns:wpi="http://schemas.microsoft.com/office/word/2010/wordprocessingInk" xmlns:wne="http://schemas.microsoft.com/office/word/2006/wordml" xmlns:wps="http://schemas.microsoft.com/office/word/2010/wordprocessingShape" mc:Ignorable="w14 w15 w16se w16cid w16 w16cex wp14">
-  <w:p>
-    <w:pPr>
-      <w:pStyle w:val="Zhlav"/>
-    </w:pPr>
-    <w:r>
-      <w:rPr>
-        <w:noProof/>
-      </w:rPr>
-      <w:drawing>
-        <wp:anchor distT="0" distB="0" distL="114300" distR="114300" simplePos="0" relativeHeight="251660288" behindDoc="1" locked="0" layoutInCell="1" allowOverlap="1" wp14:anchorId="48F3FA60" wp14:editId="2710E3BA">
-          <wp:simplePos x="0" y="0"/>
-          <wp:positionH relativeFrom="margin">
-            <wp:align>center</wp:align>
-          </wp:positionH>
-          <wp:positionV relativeFrom="paragraph">
-            <wp:posOffset>2705100</wp:posOffset>
-          </wp:positionV>
-          <wp:extent cx="3634740" cy="1635125"/>
-          <wp:effectExtent l="0" t="0" r="0" b="0"/>
-          <wp:wrapTight wrapText="bothSides">
-            <wp:wrapPolygon edited="0">
-              <wp:start x="4868" y="5285"/>
-              <wp:lineTo x="4415" y="9814"/>
-              <wp:lineTo x="3962" y="12331"/>
-              <wp:lineTo x="3962" y="13841"/>
-              <wp:lineTo x="2377" y="15602"/>
-              <wp:lineTo x="2377" y="16357"/>
-              <wp:lineTo x="2943" y="16357"/>
-              <wp:lineTo x="18566" y="14596"/>
-              <wp:lineTo x="18453" y="13841"/>
-              <wp:lineTo x="18906" y="9814"/>
-              <wp:lineTo x="19472" y="7046"/>
-              <wp:lineTo x="18340" y="6795"/>
-              <wp:lineTo x="5547" y="5285"/>
-              <wp:lineTo x="4868" y="5285"/>
-            </wp:wrapPolygon>
-          </wp:wrapTight>
-          <wp:docPr id="4" name="Obrázek 4"/>
-          <wp:cNvGraphicFramePr>
-            <a:graphicFrameLocks xmlns:a="http://schemas.openxmlformats.org/drawingml/2006/main" noChangeAspect="1"/>
-          </wp:cNvGraphicFramePr>
-          <a:graphic xmlns:a="http://schemas.openxmlformats.org/drawingml/2006/main">
-            <a:graphicData uri="http://schemas.openxmlformats.org/drawingml/2006/picture">
-              <pic:pic xmlns:pic="http://schemas.openxmlformats.org/drawingml/2006/picture">
-                <pic:nvPicPr>
-                  <pic:cNvPr id="4" name="Obrázek 4"/>
-                  <pic:cNvPicPr/>
-                </pic:nvPicPr>
-                <pic:blipFill>
-                  <a:blip r:embed="rId1">
-                    <a:extLst>
-                      <a:ext uri="{28A0092B-C50C-407E-A947-70E740481C1C}">
-                        <a14:useLocalDpi xmlns:a14="http://schemas.microsoft.com/office/drawing/2010/main" val="0"/>
-                      </a:ext>
-                    </a:extLst>
-                  </a:blip>
-                  <a:stretch>
-                    <a:fillRect/>
-                  </a:stretch>
-                </pic:blipFill>
-                <pic:spPr>
-                  <a:xfrm>
-                    <a:off x="0" y="0"/>
-                    <a:ext cx="3634740" cy="1635125"/>
-                  </a:xfrm>
-                  <a:prstGeom prst="rect">
-                    <a:avLst/>
-                  </a:prstGeom>
-                </pic:spPr>
-              </pic:pic>
-            </a:graphicData>
-          </a:graphic>
-          <wp14:sizeRelH relativeFrom="page">
-            <wp14:pctWidth>0</wp14:pctWidth>
-          </wp14:sizeRelH>
-          <wp14:sizeRelV relativeFrom="page">
-            <wp14:pctHeight>0</wp14:pctHeight>
-          </wp14:sizeRelV>
-        </wp:anchor>
-      </w:drawing>
-    </w:r>
-  </w:p>
-</w:hdr>
-</file>
-
 <file path=word/numbering.xml><?xml version="1.0" encoding="utf-8"?>
-<w:numbering xmlns:wpc="http://schemas.microsoft.com/office/word/2010/wordprocessingCanvas" xmlns:cx="http://schemas.microsoft.com/office/drawing/2014/chartex" xmlns:cx1="http://schemas.microsoft.com/office/drawing/2015/9/8/chartex" xmlns:cx2="http://schemas.microsoft.com/office/drawing/2015/10/21/chartex" xmlns:cx3="http://schemas.microsoft.com/office/drawing/2016/5/9/chartex" xmlns:cx4="http://schemas.microsoft.com/office/drawing/2016/5/10/chartex" xmlns:cx5="http://schemas.microsoft.com/office/drawing/2016/5/11/chartex" xmlns:cx6="http://schemas.microsoft.com/office/drawing/2016/5/12/chartex" xmlns:cx7="http://schemas.microsoft.com/office/drawing/2016/5/13/chartex" xmlns:cx8="http://schemas.microsoft.com/office/drawing/2016/5/14/chartex" xmlns:mc="http://schemas.openxmlformats.org/markup-compatibility/2006" xmlns:aink="http://schemas.microsoft.com/office/drawing/2016/ink" xmlns:am3d="http://schemas.microsoft.com/office/drawing/2017/model3d" xmlns:o="urn:schemas-microsoft-com:office:office" xmlns:r="http://schemas.openxmlformats.org/officeDocument/2006/relationships" xmlns:m="http://schemas.openxmlformats.org/officeDocument/2006/math" xmlns:v="urn:schemas-microsoft-com:vml" xmlns:wp14="http://schemas.microsoft.com/office/word/2010/wordprocessingDrawing" xmlns:wp="http://schemas.openxmlformats.org/drawingml/2006/wordprocessingDrawing" xmlns:w10="urn:schemas-microsoft-com:office:word" xmlns:w="http://schemas.openxmlformats.org/wordprocessingml/2006/main" xmlns:w14="http://schemas.microsoft.com/office/word/2010/wordml" xmlns:w15="http://schemas.microsoft.com/office/word/2012/wordml" xmlns:w16cex="http://schemas.microsoft.com/office/word/2018/wordml/cex" xmlns:w16cid="http://schemas.microsoft.com/office/word/2016/wordml/cid" xmlns:w16="http://schemas.microsoft.com/office/word/2018/wordml" xmlns:w16se="http://schemas.microsoft.com/office/word/2015/wordml/symex" xmlns:wpg="http://schemas.microsoft.com/office/word/2010/wordprocessingGroup" xmlns:wpi="http://schemas.microsoft.com/office/word/2010/wordprocessingInk" xmlns:wne="http://schemas.microsoft.com/office/word/2006/wordml" xmlns:wps="http://schemas.microsoft.com/office/word/2010/wordprocessingShape" mc:Ignorable="w14 w15 w16se w16cid w16 w16cex wp14">
+<w:numbering xmlns:wpc="http://schemas.microsoft.com/office/word/2010/wordprocessingCanvas" xmlns:cx="http://schemas.microsoft.com/office/drawing/2014/chartex" xmlns:cx1="http://schemas.microsoft.com/office/drawing/2015/9/8/chartex" xmlns:cx2="http://schemas.microsoft.com/office/drawing/2015/10/21/chartex" xmlns:cx3="http://schemas.microsoft.com/office/drawing/2016/5/9/chartex" xmlns:cx4="http://schemas.microsoft.com/office/drawing/2016/5/10/chartex" xmlns:cx5="http://schemas.microsoft.com/office/drawing/2016/5/11/chartex" xmlns:cx6="http://schemas.microsoft.com/office/drawing/2016/5/12/chartex" xmlns:cx7="http://schemas.microsoft.com/office/drawing/2016/5/13/chartex" xmlns:cx8="http://schemas.microsoft.com/office/drawing/2016/5/14/chartex" xmlns:mc="http://schemas.openxmlformats.org/markup-compatibility/2006" xmlns:aink="http://schemas.microsoft.com/office/drawing/2016/ink" xmlns:am3d="http://schemas.microsoft.com/office/drawing/2017/model3d" xmlns:o="urn:schemas-microsoft-com:office:office" xmlns:oel="http://schemas.microsoft.com/office/2019/extlst" xmlns:r="http://schemas.openxmlformats.org/officeDocument/2006/relationships" xmlns:m="http://schemas.openxmlformats.org/officeDocument/2006/math" xmlns:v="urn:schemas-microsoft-com:vml" xmlns:wp14="http://schemas.microsoft.com/office/word/2010/wordprocessingDrawing" xmlns:wp="http://schemas.openxmlformats.org/drawingml/2006/wordprocessingDrawing" xmlns:w10="urn:schemas-microsoft-com:office:word" xmlns:w="http://schemas.openxmlformats.org/wordprocessingml/2006/main" xmlns:w14="http://schemas.microsoft.com/office/word/2010/wordml" xmlns:w15="http://schemas.microsoft.com/office/word/2012/wordml" xmlns:w16cex="http://schemas.microsoft.com/office/word/2018/wordml/cex" xmlns:w16cid="http://schemas.microsoft.com/office/word/2016/wordml/cid" xmlns:w16="http://schemas.microsoft.com/office/word/2018/wordml" xmlns:w16du="http://schemas.microsoft.com/office/word/2023/wordml/word16du" xmlns:w16sdtdh="http://schemas.microsoft.com/office/word/2020/wordml/sdtdatahash" xmlns:w16sdtfl="http://schemas.microsoft.com/office/word/2024/wordml/sdtformatlock" xmlns:w16se="http://schemas.microsoft.com/office/word/2015/wordml/symex" xmlns:wpg="http://schemas.microsoft.com/office/word/2010/wordprocessingGroup" xmlns:wpi="http://schemas.microsoft.com/office/word/2010/wordprocessingInk" xmlns:wne="http://schemas.microsoft.com/office/word/2006/wordml" xmlns:wps="http://schemas.microsoft.com/office/word/2010/wordprocessingShape" mc:Ignorable="w14 w15 w16se w16cid w16 w16cex w16sdtdh w16sdtfl w16du wp14">
   <w:abstractNum w:abstractNumId="0" w15:restartNumberingAfterBreak="0">
     <w:nsid w:val="0000A990"/>
     <w:multiLevelType w:val="multilevel"/>
@@ -5409,14 +5237,14 @@
       </w:pPr>
     </w:lvl>
   </w:abstractNum>
-  <w:num w:numId="1">
+  <w:num w:numId="1" w16cid:durableId="2104451501">
     <w:abstractNumId w:val="0"/>
   </w:num>
 </w:numbering>
 </file>
 
 <file path=word/styles.xml><?xml version="1.0" encoding="utf-8"?>
-<w:styles xmlns:mc="http://schemas.openxmlformats.org/markup-compatibility/2006" xmlns:r="http://schemas.openxmlformats.org/officeDocument/2006/relationships" xmlns:w="http://schemas.openxmlformats.org/wordprocessingml/2006/main" xmlns:w14="http://schemas.microsoft.com/office/word/2010/wordml" xmlns:w15="http://schemas.microsoft.com/office/word/2012/wordml" xmlns:w16cex="http://schemas.microsoft.com/office/word/2018/wordml/cex" xmlns:w16cid="http://schemas.microsoft.com/office/word/2016/wordml/cid" xmlns:w16="http://schemas.microsoft.com/office/word/2018/wordml" xmlns:w16se="http://schemas.microsoft.com/office/word/2015/wordml/symex" mc:Ignorable="w14 w15 w16se w16cid w16 w16cex">
+<w:styles xmlns:mc="http://schemas.openxmlformats.org/markup-compatibility/2006" xmlns:r="http://schemas.openxmlformats.org/officeDocument/2006/relationships" xmlns:w="http://schemas.openxmlformats.org/wordprocessingml/2006/main" xmlns:w14="http://schemas.microsoft.com/office/word/2010/wordml" xmlns:w15="http://schemas.microsoft.com/office/word/2012/wordml" xmlns:w16cex="http://schemas.microsoft.com/office/word/2018/wordml/cex" xmlns:w16cid="http://schemas.microsoft.com/office/word/2016/wordml/cid" xmlns:w16="http://schemas.microsoft.com/office/word/2018/wordml" xmlns:w16du="http://schemas.microsoft.com/office/word/2023/wordml/word16du" xmlns:w16sdtdh="http://schemas.microsoft.com/office/word/2020/wordml/sdtdatahash" xmlns:w16sdtfl="http://schemas.microsoft.com/office/word/2024/wordml/sdtformatlock" xmlns:w16se="http://schemas.microsoft.com/office/word/2015/wordml/symex" mc:Ignorable="w14 w15 w16se w16cid w16 w16cex w16sdtdh w16sdtfl w16du">
   <w:docDefaults>
     <w:rPrDefault>
       <w:rPr>
@@ -5770,14 +5598,14 @@
     <w:lsdException w:name="Unresolved Mention" w:semiHidden="1" w:uiPriority="99" w:unhideWhenUsed="1"/>
     <w:lsdException w:name="Smart Link" w:semiHidden="1" w:uiPriority="99" w:unhideWhenUsed="1"/>
   </w:latentStyles>
-  <w:style w:type="paragraph" w:default="1" w:styleId="Normln">
+  <w:style w:type="paragraph" w:default="1" w:styleId="Normal">
     <w:name w:val="Normal"/>
     <w:qFormat/>
   </w:style>
-  <w:style w:type="paragraph" w:styleId="Nadpis1">
+  <w:style w:type="paragraph" w:styleId="Heading1">
     <w:name w:val="heading 1"/>
-    <w:basedOn w:val="Normln"/>
-    <w:next w:val="Zkladntext"/>
+    <w:basedOn w:val="Normal"/>
+    <w:next w:val="BodyText"/>
     <w:uiPriority w:val="9"/>
     <w:qFormat/>
     <w:pPr>
@@ -5795,10 +5623,10 @@
       <w:szCs w:val="32"/>
     </w:rPr>
   </w:style>
-  <w:style w:type="paragraph" w:styleId="Nadpis2">
+  <w:style w:type="paragraph" w:styleId="Heading2">
     <w:name w:val="heading 2"/>
-    <w:basedOn w:val="Normln"/>
-    <w:next w:val="Zkladntext"/>
+    <w:basedOn w:val="Normal"/>
+    <w:next w:val="BodyText"/>
     <w:uiPriority w:val="9"/>
     <w:unhideWhenUsed/>
     <w:qFormat/>
@@ -5817,10 +5645,10 @@
       <w:szCs w:val="28"/>
     </w:rPr>
   </w:style>
-  <w:style w:type="paragraph" w:styleId="Nadpis3">
+  <w:style w:type="paragraph" w:styleId="Heading3">
     <w:name w:val="heading 3"/>
-    <w:basedOn w:val="Normln"/>
-    <w:next w:val="Zkladntext"/>
+    <w:basedOn w:val="Normal"/>
+    <w:next w:val="BodyText"/>
     <w:uiPriority w:val="9"/>
     <w:unhideWhenUsed/>
     <w:qFormat/>
@@ -5837,10 +5665,10 @@
       <w:color w:val="4F81BD" w:themeColor="accent1"/>
     </w:rPr>
   </w:style>
-  <w:style w:type="paragraph" w:styleId="Nadpis4">
+  <w:style w:type="paragraph" w:styleId="Heading4">
     <w:name w:val="heading 4"/>
-    <w:basedOn w:val="Normln"/>
-    <w:next w:val="Zkladntext"/>
+    <w:basedOn w:val="Normal"/>
+    <w:next w:val="BodyText"/>
     <w:uiPriority w:val="9"/>
     <w:unhideWhenUsed/>
     <w:qFormat/>
@@ -5857,10 +5685,10 @@
       <w:color w:val="4F81BD" w:themeColor="accent1"/>
     </w:rPr>
   </w:style>
-  <w:style w:type="paragraph" w:styleId="Nadpis5">
+  <w:style w:type="paragraph" w:styleId="Heading5">
     <w:name w:val="heading 5"/>
-    <w:basedOn w:val="Normln"/>
-    <w:next w:val="Zkladntext"/>
+    <w:basedOn w:val="Normal"/>
+    <w:next w:val="BodyText"/>
     <w:uiPriority w:val="9"/>
     <w:unhideWhenUsed/>
     <w:qFormat/>
@@ -5876,10 +5704,10 @@
       <w:color w:val="4F81BD" w:themeColor="accent1"/>
     </w:rPr>
   </w:style>
-  <w:style w:type="paragraph" w:styleId="Nadpis6">
+  <w:style w:type="paragraph" w:styleId="Heading6">
     <w:name w:val="heading 6"/>
-    <w:basedOn w:val="Normln"/>
-    <w:next w:val="Zkladntext"/>
+    <w:basedOn w:val="Normal"/>
+    <w:next w:val="BodyText"/>
     <w:uiPriority w:val="9"/>
     <w:unhideWhenUsed/>
     <w:qFormat/>
@@ -5894,10 +5722,10 @@
       <w:color w:val="4F81BD" w:themeColor="accent1"/>
     </w:rPr>
   </w:style>
-  <w:style w:type="paragraph" w:styleId="Nadpis7">
+  <w:style w:type="paragraph" w:styleId="Heading7">
     <w:name w:val="heading 7"/>
-    <w:basedOn w:val="Normln"/>
-    <w:next w:val="Zkladntext"/>
+    <w:basedOn w:val="Normal"/>
+    <w:next w:val="BodyText"/>
     <w:uiPriority w:val="9"/>
     <w:unhideWhenUsed/>
     <w:qFormat/>
@@ -5912,10 +5740,10 @@
       <w:color w:val="4F81BD" w:themeColor="accent1"/>
     </w:rPr>
   </w:style>
-  <w:style w:type="paragraph" w:styleId="Nadpis8">
+  <w:style w:type="paragraph" w:styleId="Heading8">
     <w:name w:val="heading 8"/>
-    <w:basedOn w:val="Normln"/>
-    <w:next w:val="Zkladntext"/>
+    <w:basedOn w:val="Normal"/>
+    <w:next w:val="BodyText"/>
     <w:uiPriority w:val="9"/>
     <w:unhideWhenUsed/>
     <w:qFormat/>
@@ -5930,10 +5758,10 @@
       <w:color w:val="4F81BD" w:themeColor="accent1"/>
     </w:rPr>
   </w:style>
-  <w:style w:type="paragraph" w:styleId="Nadpis9">
+  <w:style w:type="paragraph" w:styleId="Heading9">
     <w:name w:val="heading 9"/>
-    <w:basedOn w:val="Normln"/>
-    <w:next w:val="Zkladntext"/>
+    <w:basedOn w:val="Normal"/>
+    <w:next w:val="BodyText"/>
     <w:uiPriority w:val="9"/>
     <w:unhideWhenUsed/>
     <w:qFormat/>
@@ -5948,13 +5776,13 @@
       <w:color w:val="4F81BD" w:themeColor="accent1"/>
     </w:rPr>
   </w:style>
-  <w:style w:type="character" w:default="1" w:styleId="Standardnpsmoodstavce">
+  <w:style w:type="character" w:default="1" w:styleId="DefaultParagraphFont">
     <w:name w:val="Default Paragraph Font"/>
     <w:uiPriority w:val="1"/>
     <w:semiHidden/>
     <w:unhideWhenUsed/>
   </w:style>
-  <w:style w:type="table" w:default="1" w:styleId="Normlntabulka">
+  <w:style w:type="table" w:default="1" w:styleId="TableNormal">
     <w:name w:val="Normal Table"/>
     <w:uiPriority w:val="99"/>
     <w:semiHidden/>
@@ -5969,15 +5797,15 @@
       </w:tblCellMar>
     </w:tblPr>
   </w:style>
-  <w:style w:type="numbering" w:default="1" w:styleId="Bezseznamu">
+  <w:style w:type="numbering" w:default="1" w:styleId="NoList">
     <w:name w:val="No List"/>
     <w:uiPriority w:val="99"/>
     <w:semiHidden/>
     <w:unhideWhenUsed/>
   </w:style>
-  <w:style w:type="paragraph" w:styleId="Zkladntext">
+  <w:style w:type="paragraph" w:styleId="BodyText">
     <w:name w:val="Body Text"/>
-    <w:basedOn w:val="Normln"/>
+    <w:basedOn w:val="Normal"/>
     <w:qFormat/>
     <w:rsid w:val="009F4950"/>
     <w:pPr>
@@ -5987,23 +5815,23 @@
   </w:style>
   <w:style w:type="paragraph" w:customStyle="1" w:styleId="FirstParagraph">
     <w:name w:val="First Paragraph"/>
-    <w:basedOn w:val="Zkladntext"/>
-    <w:next w:val="Zkladntext"/>
+    <w:basedOn w:val="BodyText"/>
+    <w:next w:val="BodyText"/>
     <w:qFormat/>
     <w:rsid w:val="009F4950"/>
   </w:style>
   <w:style w:type="paragraph" w:customStyle="1" w:styleId="Compact">
     <w:name w:val="Compact"/>
-    <w:basedOn w:val="Zkladntext"/>
+    <w:basedOn w:val="BodyText"/>
     <w:qFormat/>
     <w:pPr>
       <w:spacing w:before="36" w:after="36"/>
     </w:pPr>
   </w:style>
-  <w:style w:type="paragraph" w:styleId="Nzev">
+  <w:style w:type="paragraph" w:styleId="Title">
     <w:name w:val="Title"/>
-    <w:basedOn w:val="Normln"/>
-    <w:next w:val="Zkladntext"/>
+    <w:basedOn w:val="Normal"/>
+    <w:next w:val="BodyText"/>
     <w:qFormat/>
     <w:rsid w:val="009F4950"/>
     <w:pPr>
@@ -6020,10 +5848,10 @@
       <w:szCs w:val="36"/>
     </w:rPr>
   </w:style>
-  <w:style w:type="paragraph" w:styleId="Podnadpis">
+  <w:style w:type="paragraph" w:styleId="Subtitle">
     <w:name w:val="Subtitle"/>
-    <w:basedOn w:val="Nzev"/>
-    <w:next w:val="Zkladntext"/>
+    <w:basedOn w:val="Title"/>
+    <w:next w:val="BodyText"/>
     <w:qFormat/>
     <w:pPr>
       <w:spacing w:before="240" w:after="240"/>
@@ -6035,7 +5863,7 @@
   </w:style>
   <w:style w:type="paragraph" w:customStyle="1" w:styleId="Author">
     <w:name w:val="Author"/>
-    <w:next w:val="Zkladntext"/>
+    <w:next w:val="BodyText"/>
     <w:qFormat/>
     <w:pPr>
       <w:keepNext/>
@@ -6043,9 +5871,9 @@
       <w:jc w:val="center"/>
     </w:pPr>
   </w:style>
-  <w:style w:type="paragraph" w:styleId="Datum">
+  <w:style w:type="paragraph" w:styleId="Date">
     <w:name w:val="Date"/>
-    <w:next w:val="Zkladntext"/>
+    <w:next w:val="BodyText"/>
     <w:qFormat/>
     <w:pPr>
       <w:keepNext/>
@@ -6055,8 +5883,8 @@
   </w:style>
   <w:style w:type="paragraph" w:customStyle="1" w:styleId="Abstract">
     <w:name w:val="Abstract"/>
-    <w:basedOn w:val="Normln"/>
-    <w:next w:val="Zkladntext"/>
+    <w:basedOn w:val="Normal"/>
+    <w:next w:val="BodyText"/>
     <w:qFormat/>
     <w:pPr>
       <w:keepNext/>
@@ -6068,15 +5896,15 @@
       <w:szCs w:val="20"/>
     </w:rPr>
   </w:style>
-  <w:style w:type="paragraph" w:styleId="Bibliografie">
+  <w:style w:type="paragraph" w:styleId="Bibliography">
     <w:name w:val="Bibliography"/>
-    <w:basedOn w:val="Normln"/>
+    <w:basedOn w:val="Normal"/>
     <w:qFormat/>
   </w:style>
-  <w:style w:type="paragraph" w:styleId="Textvbloku">
+  <w:style w:type="paragraph" w:styleId="BlockText">
     <w:name w:val="Block Text"/>
-    <w:basedOn w:val="Zkladntext"/>
-    <w:next w:val="Zkladntext"/>
+    <w:basedOn w:val="BodyText"/>
+    <w:next w:val="BodyText"/>
     <w:uiPriority w:val="9"/>
     <w:unhideWhenUsed/>
     <w:qFormat/>
@@ -6085,9 +5913,9 @@
       <w:ind w:left="480" w:right="480"/>
     </w:pPr>
   </w:style>
-  <w:style w:type="paragraph" w:styleId="Textpoznpodarou">
+  <w:style w:type="paragraph" w:styleId="FootnoteText">
     <w:name w:val="footnote text"/>
-    <w:basedOn w:val="Normln"/>
+    <w:basedOn w:val="Normal"/>
     <w:uiPriority w:val="9"/>
     <w:unhideWhenUsed/>
     <w:qFormat/>
@@ -6123,7 +5951,7 @@
   </w:style>
   <w:style w:type="paragraph" w:customStyle="1" w:styleId="DefinitionTerm">
     <w:name w:val="Definition Term"/>
-    <w:basedOn w:val="Normln"/>
+    <w:basedOn w:val="Normal"/>
     <w:next w:val="Definition"/>
     <w:pPr>
       <w:keepNext/>
@@ -6136,12 +5964,12 @@
   </w:style>
   <w:style w:type="paragraph" w:customStyle="1" w:styleId="Definition">
     <w:name w:val="Definition"/>
-    <w:basedOn w:val="Normln"/>
-  </w:style>
-  <w:style w:type="paragraph" w:styleId="Titulek">
+    <w:basedOn w:val="Normal"/>
+  </w:style>
+  <w:style w:type="paragraph" w:styleId="Caption">
     <w:name w:val="caption"/>
-    <w:basedOn w:val="Normln"/>
-    <w:link w:val="TitulekChar"/>
+    <w:basedOn w:val="Normal"/>
+    <w:link w:val="CaptionChar"/>
     <w:pPr>
       <w:spacing w:after="120"/>
     </w:pPr>
@@ -6151,18 +5979,18 @@
   </w:style>
   <w:style w:type="paragraph" w:customStyle="1" w:styleId="TableCaption">
     <w:name w:val="Table Caption"/>
-    <w:basedOn w:val="Titulek"/>
+    <w:basedOn w:val="Caption"/>
     <w:pPr>
       <w:keepNext/>
     </w:pPr>
   </w:style>
   <w:style w:type="paragraph" w:customStyle="1" w:styleId="ImageCaption">
     <w:name w:val="Image Caption"/>
-    <w:basedOn w:val="Titulek"/>
+    <w:basedOn w:val="Caption"/>
   </w:style>
   <w:style w:type="paragraph" w:customStyle="1" w:styleId="Figure">
     <w:name w:val="Figure"/>
-    <w:basedOn w:val="Normln"/>
+    <w:basedOn w:val="Normal"/>
   </w:style>
   <w:style w:type="paragraph" w:customStyle="1" w:styleId="CaptionedFigure">
     <w:name w:val="Captioned Figure"/>
@@ -6171,14 +5999,14 @@
       <w:keepNext/>
     </w:pPr>
   </w:style>
-  <w:style w:type="character" w:customStyle="1" w:styleId="TitulekChar">
-    <w:name w:val="Titulek Char"/>
-    <w:basedOn w:val="Standardnpsmoodstavce"/>
-    <w:link w:val="Titulek"/>
+  <w:style w:type="character" w:customStyle="1" w:styleId="CaptionChar">
+    <w:name w:val="Caption Char"/>
+    <w:basedOn w:val="DefaultParagraphFont"/>
+    <w:link w:val="Caption"/>
   </w:style>
   <w:style w:type="character" w:customStyle="1" w:styleId="VerbatimChar">
     <w:name w:val="Verbatim Char"/>
-    <w:basedOn w:val="TitulekChar"/>
+    <w:basedOn w:val="CaptionChar"/>
     <w:link w:val="SourceCode"/>
     <w:rPr>
       <w:rFonts w:ascii="Consolas" w:hAnsi="Consolas"/>
@@ -6187,26 +6015,26 @@
   </w:style>
   <w:style w:type="character" w:customStyle="1" w:styleId="SectionNumber">
     <w:name w:val="Section Number"/>
-    <w:basedOn w:val="TitulekChar"/>
-  </w:style>
-  <w:style w:type="character" w:styleId="Znakapoznpodarou">
+    <w:basedOn w:val="CaptionChar"/>
+  </w:style>
+  <w:style w:type="character" w:styleId="FootnoteReference">
     <w:name w:val="footnote reference"/>
-    <w:basedOn w:val="TitulekChar"/>
+    <w:basedOn w:val="CaptionChar"/>
     <w:rPr>
       <w:vertAlign w:val="superscript"/>
     </w:rPr>
   </w:style>
-  <w:style w:type="character" w:styleId="Hypertextovodkaz">
+  <w:style w:type="character" w:styleId="Hyperlink">
     <w:name w:val="Hyperlink"/>
-    <w:basedOn w:val="TitulekChar"/>
+    <w:basedOn w:val="CaptionChar"/>
     <w:rPr>
       <w:color w:val="4F81BD" w:themeColor="accent1"/>
     </w:rPr>
   </w:style>
-  <w:style w:type="paragraph" w:styleId="Nadpisobsahu">
+  <w:style w:type="paragraph" w:styleId="TOCHeading">
     <w:name w:val="TOC Heading"/>
-    <w:basedOn w:val="Nadpis1"/>
-    <w:next w:val="Zkladntext"/>
+    <w:basedOn w:val="Heading1"/>
+    <w:next w:val="BodyText"/>
     <w:uiPriority w:val="39"/>
     <w:unhideWhenUsed/>
     <w:qFormat/>
@@ -6222,7 +6050,7 @@
   </w:style>
   <w:style w:type="paragraph" w:customStyle="1" w:styleId="SourceCode">
     <w:name w:val="Source Code"/>
-    <w:basedOn w:val="Normln"/>
+    <w:basedOn w:val="Normal"/>
     <w:link w:val="VerbatimChar"/>
     <w:pPr>
       <w:wordWrap w:val="0"/>
@@ -6516,10 +6344,10 @@
       <w:sz w:val="22"/>
     </w:rPr>
   </w:style>
-  <w:style w:type="paragraph" w:styleId="Zhlav">
+  <w:style w:type="paragraph" w:styleId="Header">
     <w:name w:val="header"/>
-    <w:basedOn w:val="Normln"/>
-    <w:link w:val="ZhlavChar"/>
+    <w:basedOn w:val="Normal"/>
+    <w:link w:val="HeaderChar"/>
     <w:unhideWhenUsed/>
     <w:rsid w:val="00A20F65"/>
     <w:pPr>
@@ -6530,16 +6358,16 @@
       <w:spacing w:after="0"/>
     </w:pPr>
   </w:style>
-  <w:style w:type="character" w:customStyle="1" w:styleId="ZhlavChar">
-    <w:name w:val="Záhlaví Char"/>
-    <w:basedOn w:val="Standardnpsmoodstavce"/>
-    <w:link w:val="Zhlav"/>
+  <w:style w:type="character" w:customStyle="1" w:styleId="HeaderChar">
+    <w:name w:val="Header Char"/>
+    <w:basedOn w:val="DefaultParagraphFont"/>
+    <w:link w:val="Header"/>
     <w:rsid w:val="00A20F65"/>
   </w:style>
-  <w:style w:type="paragraph" w:styleId="Zpat">
+  <w:style w:type="paragraph" w:styleId="Footer">
     <w:name w:val="footer"/>
-    <w:basedOn w:val="Normln"/>
-    <w:link w:val="ZpatChar"/>
+    <w:basedOn w:val="Normal"/>
+    <w:link w:val="FooterChar"/>
     <w:unhideWhenUsed/>
     <w:rsid w:val="00A20F65"/>
     <w:pPr>
@@ -6550,15 +6378,15 @@
       <w:spacing w:after="0"/>
     </w:pPr>
   </w:style>
-  <w:style w:type="character" w:customStyle="1" w:styleId="ZpatChar">
-    <w:name w:val="Zápatí Char"/>
-    <w:basedOn w:val="Standardnpsmoodstavce"/>
-    <w:link w:val="Zpat"/>
+  <w:style w:type="character" w:customStyle="1" w:styleId="FooterChar">
+    <w:name w:val="Footer Char"/>
+    <w:basedOn w:val="DefaultParagraphFont"/>
+    <w:link w:val="Footer"/>
     <w:rsid w:val="00A20F65"/>
   </w:style>
-  <w:style w:type="character" w:styleId="Zstupntext">
+  <w:style w:type="character" w:styleId="PlaceholderText">
     <w:name w:val="Placeholder Text"/>
-    <w:basedOn w:val="Standardnpsmoodstavce"/>
+    <w:basedOn w:val="DefaultParagraphFont"/>
     <w:semiHidden/>
     <w:rsid w:val="00646003"/>
     <w:rPr>
@@ -6569,7 +6397,7 @@
 </file>
 
 <file path=word/glossary/document.xml><?xml version="1.0" encoding="utf-8"?>
-<w:glossaryDocument xmlns:wpc="http://schemas.microsoft.com/office/word/2010/wordprocessingCanvas" xmlns:cx="http://schemas.microsoft.com/office/drawing/2014/chartex" xmlns:cx1="http://schemas.microsoft.com/office/drawing/2015/9/8/chartex" xmlns:cx2="http://schemas.microsoft.com/office/drawing/2015/10/21/chartex" xmlns:cx3="http://schemas.microsoft.com/office/drawing/2016/5/9/chartex" xmlns:cx4="http://schemas.microsoft.com/office/drawing/2016/5/10/chartex" xmlns:cx5="http://schemas.microsoft.com/office/drawing/2016/5/11/chartex" xmlns:cx6="http://schemas.microsoft.com/office/drawing/2016/5/12/chartex" xmlns:cx7="http://schemas.microsoft.com/office/drawing/2016/5/13/chartex" xmlns:cx8="http://schemas.microsoft.com/office/drawing/2016/5/14/chartex" xmlns:mc="http://schemas.openxmlformats.org/markup-compatibility/2006" xmlns:aink="http://schemas.microsoft.com/office/drawing/2016/ink" xmlns:am3d="http://schemas.microsoft.com/office/drawing/2017/model3d" xmlns:o="urn:schemas-microsoft-com:office:office" xmlns:r="http://schemas.openxmlformats.org/officeDocument/2006/relationships" xmlns:m="http://schemas.openxmlformats.org/officeDocument/2006/math" xmlns:v="urn:schemas-microsoft-com:vml" xmlns:wp14="http://schemas.microsoft.com/office/word/2010/wordprocessingDrawing" xmlns:wp="http://schemas.openxmlformats.org/drawingml/2006/wordprocessingDrawing" xmlns:w10="urn:schemas-microsoft-com:office:word" xmlns:w="http://schemas.openxmlformats.org/wordprocessingml/2006/main" xmlns:w14="http://schemas.microsoft.com/office/word/2010/wordml" xmlns:w15="http://schemas.microsoft.com/office/word/2012/wordml" xmlns:w16cex="http://schemas.microsoft.com/office/word/2018/wordml/cex" xmlns:w16cid="http://schemas.microsoft.com/office/word/2016/wordml/cid" xmlns:w16="http://schemas.microsoft.com/office/word/2018/wordml" xmlns:w16se="http://schemas.microsoft.com/office/word/2015/wordml/symex" xmlns:wpg="http://schemas.microsoft.com/office/word/2010/wordprocessingGroup" xmlns:wpi="http://schemas.microsoft.com/office/word/2010/wordprocessingInk" xmlns:wne="http://schemas.microsoft.com/office/word/2006/wordml" xmlns:wps="http://schemas.microsoft.com/office/word/2010/wordprocessingShape" mc:Ignorable="w14 w15 w16se w16cid w16 w16cex wp14">
+<w:glossaryDocument xmlns:wpc="http://schemas.microsoft.com/office/word/2010/wordprocessingCanvas" xmlns:cx="http://schemas.microsoft.com/office/drawing/2014/chartex" xmlns:cx1="http://schemas.microsoft.com/office/drawing/2015/9/8/chartex" xmlns:cx2="http://schemas.microsoft.com/office/drawing/2015/10/21/chartex" xmlns:cx3="http://schemas.microsoft.com/office/drawing/2016/5/9/chartex" xmlns:cx4="http://schemas.microsoft.com/office/drawing/2016/5/10/chartex" xmlns:cx5="http://schemas.microsoft.com/office/drawing/2016/5/11/chartex" xmlns:cx6="http://schemas.microsoft.com/office/drawing/2016/5/12/chartex" xmlns:cx7="http://schemas.microsoft.com/office/drawing/2016/5/13/chartex" xmlns:cx8="http://schemas.microsoft.com/office/drawing/2016/5/14/chartex" xmlns:mc="http://schemas.openxmlformats.org/markup-compatibility/2006" xmlns:aink="http://schemas.microsoft.com/office/drawing/2016/ink" xmlns:am3d="http://schemas.microsoft.com/office/drawing/2017/model3d" xmlns:o="urn:schemas-microsoft-com:office:office" xmlns:oel="http://schemas.microsoft.com/office/2019/extlst" xmlns:r="http://schemas.openxmlformats.org/officeDocument/2006/relationships" xmlns:m="http://schemas.openxmlformats.org/officeDocument/2006/math" xmlns:v="urn:schemas-microsoft-com:vml" xmlns:wp14="http://schemas.microsoft.com/office/word/2010/wordprocessingDrawing" xmlns:wp="http://schemas.openxmlformats.org/drawingml/2006/wordprocessingDrawing" xmlns:w10="urn:schemas-microsoft-com:office:word" xmlns:w="http://schemas.openxmlformats.org/wordprocessingml/2006/main" xmlns:w14="http://schemas.microsoft.com/office/word/2010/wordml" xmlns:w15="http://schemas.microsoft.com/office/word/2012/wordml" xmlns:w16cex="http://schemas.microsoft.com/office/word/2018/wordml/cex" xmlns:w16cid="http://schemas.microsoft.com/office/word/2016/wordml/cid" xmlns:w16="http://schemas.microsoft.com/office/word/2018/wordml" xmlns:w16du="http://schemas.microsoft.com/office/word/2023/wordml/word16du" xmlns:w16sdtdh="http://schemas.microsoft.com/office/word/2020/wordml/sdtdatahash" xmlns:w16sdtfl="http://schemas.microsoft.com/office/word/2024/wordml/sdtformatlock" xmlns:w16se="http://schemas.microsoft.com/office/word/2015/wordml/symex" xmlns:wpg="http://schemas.microsoft.com/office/word/2010/wordprocessingGroup" xmlns:wpi="http://schemas.microsoft.com/office/word/2010/wordprocessingInk" xmlns:wne="http://schemas.microsoft.com/office/word/2006/wordml" xmlns:wps="http://schemas.microsoft.com/office/word/2010/wordprocessingShape" mc:Ignorable="w14 w15 w16se w16cid w16 w16cex w16sdtdh w16sdtfl w16du wp14">
   <w:docParts>
     <w:docPart>
       <w:docPartPr>
@@ -6590,7 +6418,7 @@
         <w:p>
           <w:r>
             <w:rPr>
-              <w:rStyle w:val="Zstupntext"/>
+              <w:rStyle w:val="PlaceholderText"/>
             </w:rPr>
             <w:t>[Název]</w:t>
           </w:r>
@@ -6602,7 +6430,7 @@
 </file>
 
 <file path=word/glossary/fontTable.xml><?xml version="1.0" encoding="utf-8"?>
-<w:fonts xmlns:mc="http://schemas.openxmlformats.org/markup-compatibility/2006" xmlns:r="http://schemas.openxmlformats.org/officeDocument/2006/relationships" xmlns:w="http://schemas.openxmlformats.org/wordprocessingml/2006/main" xmlns:w14="http://schemas.microsoft.com/office/word/2010/wordml" xmlns:w15="http://schemas.microsoft.com/office/word/2012/wordml" xmlns:w16cex="http://schemas.microsoft.com/office/word/2018/wordml/cex" xmlns:w16cid="http://schemas.microsoft.com/office/word/2016/wordml/cid" xmlns:w16="http://schemas.microsoft.com/office/word/2018/wordml" xmlns:w16se="http://schemas.microsoft.com/office/word/2015/wordml/symex" mc:Ignorable="w14 w15 w16se w16cid w16 w16cex">
+<w:fonts xmlns:mc="http://schemas.openxmlformats.org/markup-compatibility/2006" xmlns:r="http://schemas.openxmlformats.org/officeDocument/2006/relationships" xmlns:w="http://schemas.openxmlformats.org/wordprocessingml/2006/main" xmlns:w14="http://schemas.microsoft.com/office/word/2010/wordml" xmlns:w15="http://schemas.microsoft.com/office/word/2012/wordml" xmlns:w16cex="http://schemas.microsoft.com/office/word/2018/wordml/cex" xmlns:w16cid="http://schemas.microsoft.com/office/word/2016/wordml/cid" xmlns:w16="http://schemas.microsoft.com/office/word/2018/wordml" xmlns:w16du="http://schemas.microsoft.com/office/word/2023/wordml/word16du" xmlns:w16sdtdh="http://schemas.microsoft.com/office/word/2020/wordml/sdtdatahash" xmlns:w16sdtfl="http://schemas.microsoft.com/office/word/2024/wordml/sdtformatlock" xmlns:w16se="http://schemas.microsoft.com/office/word/2015/wordml/symex" mc:Ignorable="w14 w15 w16se w16cid w16 w16cex w16sdtdh w16sdtfl w16du">
   <w:font w:name="Cambria">
     <w:panose1 w:val="02040503050406030204"/>
     <w:charset w:val="EE"/>
@@ -6622,14 +6450,14 @@
     <w:charset w:val="EE"/>
     <w:family w:val="swiss"/>
     <w:pitch w:val="variable"/>
-    <w:sig w:usb0="E4002EFF" w:usb1="C000247B" w:usb2="00000009" w:usb3="00000000" w:csb0="000001FF" w:csb1="00000000"/>
+    <w:sig w:usb0="E4002EFF" w:usb1="C200247B" w:usb2="00000009" w:usb3="00000000" w:csb0="000001FF" w:csb1="00000000"/>
   </w:font>
   <w:font w:name="Consolas">
     <w:panose1 w:val="020B0609020204030204"/>
     <w:charset w:val="EE"/>
     <w:family w:val="modern"/>
     <w:pitch w:val="fixed"/>
-    <w:sig w:usb0="E00006FF" w:usb1="0000FCFF" w:usb2="00000001" w:usb3="00000000" w:csb0="0000019F" w:csb1="00000000"/>
+    <w:sig w:usb0="E10006FF" w:usb1="4000FCFF" w:usb2="00000009" w:usb3="00000000" w:csb0="0000019F" w:csb1="00000000"/>
   </w:font>
   <w:font w:name="Segoe UI Emoji">
     <w:panose1 w:val="020B0502040204020203"/>
@@ -6638,18 +6466,25 @@
     <w:pitch w:val="variable"/>
     <w:sig w:usb0="00000003" w:usb1="02000000" w:usb2="00000000" w:usb3="00000000" w:csb0="00000001" w:csb1="00000000"/>
   </w:font>
-  <w:font w:name="Calibri Light">
-    <w:panose1 w:val="020F0302020204030204"/>
-    <w:charset w:val="EE"/>
+  <w:font w:name="Aptos">
+    <w:panose1 w:val="020B0004020202020204"/>
+    <w:charset w:val="00"/>
     <w:family w:val="swiss"/>
     <w:pitch w:val="variable"/>
-    <w:sig w:usb0="E4002EFF" w:usb1="C000247B" w:usb2="00000009" w:usb3="00000000" w:csb0="000001FF" w:csb1="00000000"/>
+    <w:sig w:usb0="20000287" w:usb1="00000003" w:usb2="00000000" w:usb3="00000000" w:csb0="0000019F" w:csb1="00000000"/>
+  </w:font>
+  <w:font w:name="Aptos Display">
+    <w:panose1 w:val="020B0004020202020204"/>
+    <w:charset w:val="00"/>
+    <w:family w:val="swiss"/>
+    <w:pitch w:val="variable"/>
+    <w:sig w:usb0="20000287" w:usb1="00000003" w:usb2="00000000" w:usb3="00000000" w:csb0="0000019F" w:csb1="00000000"/>
   </w:font>
 </w:fonts>
 </file>
 
 <file path=word/glossary/settings.xml><?xml version="1.0" encoding="utf-8"?>
-<w:settings xmlns:mc="http://schemas.openxmlformats.org/markup-compatibility/2006" xmlns:o="urn:schemas-microsoft-com:office:office" xmlns:r="http://schemas.openxmlformats.org/officeDocument/2006/relationships" xmlns:m="http://schemas.openxmlformats.org/officeDocument/2006/math" xmlns:v="urn:schemas-microsoft-com:vml" xmlns:w10="urn:schemas-microsoft-com:office:word" xmlns:w="http://schemas.openxmlformats.org/wordprocessingml/2006/main" xmlns:w14="http://schemas.microsoft.com/office/word/2010/wordml" xmlns:w15="http://schemas.microsoft.com/office/word/2012/wordml" xmlns:w16cex="http://schemas.microsoft.com/office/word/2018/wordml/cex" xmlns:w16cid="http://schemas.microsoft.com/office/word/2016/wordml/cid" xmlns:w16="http://schemas.microsoft.com/office/word/2018/wordml" xmlns:w16se="http://schemas.microsoft.com/office/word/2015/wordml/symex" xmlns:sl="http://schemas.openxmlformats.org/schemaLibrary/2006/main" mc:Ignorable="w14 w15 w16se w16cid w16 w16cex">
+<w:settings xmlns:mc="http://schemas.openxmlformats.org/markup-compatibility/2006" xmlns:o="urn:schemas-microsoft-com:office:office" xmlns:r="http://schemas.openxmlformats.org/officeDocument/2006/relationships" xmlns:m="http://schemas.openxmlformats.org/officeDocument/2006/math" xmlns:v="urn:schemas-microsoft-com:vml" xmlns:w10="urn:schemas-microsoft-com:office:word" xmlns:w="http://schemas.openxmlformats.org/wordprocessingml/2006/main" xmlns:w14="http://schemas.microsoft.com/office/word/2010/wordml" xmlns:w15="http://schemas.microsoft.com/office/word/2012/wordml" xmlns:w16cex="http://schemas.microsoft.com/office/word/2018/wordml/cex" xmlns:w16cid="http://schemas.microsoft.com/office/word/2016/wordml/cid" xmlns:w16="http://schemas.microsoft.com/office/word/2018/wordml" xmlns:w16du="http://schemas.microsoft.com/office/word/2023/wordml/word16du" xmlns:w16sdtdh="http://schemas.microsoft.com/office/word/2020/wordml/sdtdatahash" xmlns:w16sdtfl="http://schemas.microsoft.com/office/word/2024/wordml/sdtformatlock" xmlns:w16se="http://schemas.microsoft.com/office/word/2015/wordml/symex" xmlns:sl="http://schemas.openxmlformats.org/schemaLibrary/2006/main" mc:Ignorable="w14 w15 w16se w16cid w16 w16cex w16sdtdh w16sdtfl w16du">
   <w:view w:val="normal"/>
   <w:defaultTabStop w:val="708"/>
   <w:hyphenationZone w:val="425"/>
@@ -6669,6 +6504,8 @@
     <w:rsid w:val="008C1490"/>
     <w:rsid w:val="009418F8"/>
     <w:rsid w:val="00B55332"/>
+    <w:rsid w:val="00C272F2"/>
+    <w:rsid w:val="00EC6347"/>
   </w:rsids>
   <m:mathPr>
     <m:mathFont m:val="Cambria Math"/>
@@ -6685,14 +6522,14 @@
   </m:mathPr>
   <w:themeFontLang w:val="cs-CZ"/>
   <w:clrSchemeMapping w:bg1="light1" w:t1="dark1" w:bg2="light2" w:t2="dark2" w:accent1="accent1" w:accent2="accent2" w:accent3="accent3" w:accent4="accent4" w:accent5="accent5" w:accent6="accent6" w:hyperlink="hyperlink" w:followedHyperlink="followedHyperlink"/>
-  <w:decimalSymbol w:val=","/>
-  <w:listSeparator w:val=";"/>
+  <w:decimalSymbol w:val="."/>
+  <w:listSeparator w:val=","/>
   <w15:chartTrackingRefBased/>
 </w:settings>
 </file>
 
 <file path=word/glossary/styles.xml><?xml version="1.0" encoding="utf-8"?>
-<w:styles xmlns:mc="http://schemas.openxmlformats.org/markup-compatibility/2006" xmlns:r="http://schemas.openxmlformats.org/officeDocument/2006/relationships" xmlns:w="http://schemas.openxmlformats.org/wordprocessingml/2006/main" xmlns:w14="http://schemas.microsoft.com/office/word/2010/wordml" xmlns:w15="http://schemas.microsoft.com/office/word/2012/wordml" xmlns:w16cex="http://schemas.microsoft.com/office/word/2018/wordml/cex" xmlns:w16cid="http://schemas.microsoft.com/office/word/2016/wordml/cid" xmlns:w16="http://schemas.microsoft.com/office/word/2018/wordml" xmlns:w16se="http://schemas.microsoft.com/office/word/2015/wordml/symex" mc:Ignorable="w14 w15 w16se w16cid w16 w16cex">
+<w:styles xmlns:mc="http://schemas.openxmlformats.org/markup-compatibility/2006" xmlns:r="http://schemas.openxmlformats.org/officeDocument/2006/relationships" xmlns:w="http://schemas.openxmlformats.org/wordprocessingml/2006/main" xmlns:w14="http://schemas.microsoft.com/office/word/2010/wordml" xmlns:w15="http://schemas.microsoft.com/office/word/2012/wordml" xmlns:w16cex="http://schemas.microsoft.com/office/word/2018/wordml/cex" xmlns:w16cid="http://schemas.microsoft.com/office/word/2016/wordml/cid" xmlns:w16="http://schemas.microsoft.com/office/word/2018/wordml" xmlns:w16du="http://schemas.microsoft.com/office/word/2023/wordml/word16du" xmlns:w16sdtdh="http://schemas.microsoft.com/office/word/2020/wordml/sdtdatahash" xmlns:w16sdtfl="http://schemas.microsoft.com/office/word/2024/wordml/sdtformatlock" xmlns:w16se="http://schemas.microsoft.com/office/word/2015/wordml/symex" mc:Ignorable="w14 w15 w16se w16cid w16 w16cex w16sdtdh w16sdtfl w16du">
   <w:docDefaults>
     <w:rPrDefault>
       <w:rPr>
@@ -7086,7 +6923,7 @@
     <w:lsdException w:name="Unresolved Mention" w:semiHidden="1" w:unhideWhenUsed="1"/>
     <w:lsdException w:name="Smart Link" w:semiHidden="1" w:unhideWhenUsed="1"/>
   </w:latentStyles>
-  <w:style w:type="paragraph" w:default="1" w:styleId="Normln">
+  <w:style w:type="paragraph" w:default="1" w:styleId="Normal">
     <w:name w:val="Normal"/>
     <w:qFormat/>
     <w:rsid w:val="00B55332"/>
@@ -7096,13 +6933,13 @@
       <w:szCs w:val="3276"/>
     </w:rPr>
   </w:style>
-  <w:style w:type="character" w:default="1" w:styleId="Standardnpsmoodstavce">
+  <w:style w:type="character" w:default="1" w:styleId="DefaultParagraphFont">
     <w:name w:val="Default Paragraph Font"/>
     <w:uiPriority w:val="1"/>
     <w:semiHidden/>
     <w:unhideWhenUsed/>
   </w:style>
-  <w:style w:type="table" w:default="1" w:styleId="Normlntabulka">
+  <w:style w:type="table" w:default="1" w:styleId="TableNormal">
     <w:name w:val="Normal Table"/>
     <w:uiPriority w:val="99"/>
     <w:semiHidden/>
@@ -7117,15 +6954,15 @@
       </w:tblCellMar>
     </w:tblPr>
   </w:style>
-  <w:style w:type="numbering" w:default="1" w:styleId="Bezseznamu">
+  <w:style w:type="numbering" w:default="1" w:styleId="NoList">
     <w:name w:val="No List"/>
     <w:uiPriority w:val="99"/>
     <w:semiHidden/>
     <w:unhideWhenUsed/>
   </w:style>
-  <w:style w:type="character" w:styleId="Zstupntext">
+  <w:style w:type="character" w:styleId="PlaceholderText">
     <w:name w:val="Placeholder Text"/>
-    <w:basedOn w:val="Standardnpsmoodstavce"/>
+    <w:basedOn w:val="DefaultParagraphFont"/>
     <w:semiHidden/>
     <w:rsid w:val="00B55332"/>
     <w:rPr>
@@ -7136,7 +6973,7 @@
 </file>
 
 <file path=word/glossary/webSettings.xml><?xml version="1.0" encoding="utf-8"?>
-<w:webSettings xmlns:mc="http://schemas.openxmlformats.org/markup-compatibility/2006" xmlns:r="http://schemas.openxmlformats.org/officeDocument/2006/relationships" xmlns:w="http://schemas.openxmlformats.org/wordprocessingml/2006/main" xmlns:w14="http://schemas.microsoft.com/office/word/2010/wordml" xmlns:w15="http://schemas.microsoft.com/office/word/2012/wordml" xmlns:w16cex="http://schemas.microsoft.com/office/word/2018/wordml/cex" xmlns:w16cid="http://schemas.microsoft.com/office/word/2016/wordml/cid" xmlns:w16="http://schemas.microsoft.com/office/word/2018/wordml" xmlns:w16se="http://schemas.microsoft.com/office/word/2015/wordml/symex" mc:Ignorable="w14 w15 w16se w16cid w16 w16cex">
+<w:webSettings xmlns:mc="http://schemas.openxmlformats.org/markup-compatibility/2006" xmlns:r="http://schemas.openxmlformats.org/officeDocument/2006/relationships" xmlns:w="http://schemas.openxmlformats.org/wordprocessingml/2006/main" xmlns:w14="http://schemas.microsoft.com/office/word/2010/wordml" xmlns:w15="http://schemas.microsoft.com/office/word/2012/wordml" xmlns:w16cex="http://schemas.microsoft.com/office/word/2018/wordml/cex" xmlns:w16cid="http://schemas.microsoft.com/office/word/2016/wordml/cid" xmlns:w16="http://schemas.microsoft.com/office/word/2018/wordml" xmlns:w16du="http://schemas.microsoft.com/office/word/2023/wordml/word16du" xmlns:w16sdtdh="http://schemas.microsoft.com/office/word/2020/wordml/sdtdatahash" xmlns:w16sdtfl="http://schemas.microsoft.com/office/word/2024/wordml/sdtformatlock" xmlns:w16se="http://schemas.microsoft.com/office/word/2015/wordml/symex" mc:Ignorable="w14 w15 w16se w16cid w16 w16cex w16sdtdh w16sdtfl w16du">
   <w:optimizeForBrowser/>
   <w:allowPNG/>
 </w:webSettings>
@@ -7458,4 +7295,16 @@
   </a:objectDefaults>
   <a:extraClrSchemeLst/>
 </a:theme>
+</file>
+
+<file path=customXml/item1.xml><?xml version="1.0" encoding="utf-8"?>
+<b:Sources xmlns:b="http://schemas.openxmlformats.org/officeDocument/2006/bibliography" xmlns="http://schemas.openxmlformats.org/officeDocument/2006/bibliography" SelectedStyle="/APASixthEditionOfficeOnline.xsl" StyleName="APA" Version="6"/>
+</file>
+
+<file path=customXml/itemProps1.xml><?xml version="1.0" encoding="utf-8"?>
+<ds:datastoreItem xmlns:ds="http://schemas.openxmlformats.org/officeDocument/2006/customXml" ds:itemID="{39BF47B7-1754-3D41-A798-1D59D6AE2FCF}">
+  <ds:schemaRefs>
+    <ds:schemaRef ds:uri="http://schemas.openxmlformats.org/officeDocument/2006/bibliography"/>
+  </ds:schemaRefs>
+</ds:datastoreItem>
 </file>
</xml_diff>